<commit_message>
docs: generate formal Laboratory Record with exact chapter-per-page template in DOCX and PDF formats with SOA logo
</commit_message>
<xml_diff>
--- a/Laboratory_Record_CSE4192.docx
+++ b/Laboratory_Record_CSE4192.docx
@@ -4,14 +4,13 @@
   <w:body>
     <w:p>
       <w:pPr>
-        <w:spacing w:before="200" w:after="40"/>
+        <w:spacing w:before="400" w:after="40"/>
         <w:jc w:val="center"/>
       </w:pPr>
       <w:r>
         <w:rPr>
           <w:rFonts w:ascii="Times New Roman" w:hAnsi="Times New Roman"/>
           <w:b/>
-          <w:color w:val="0F172A"/>
           <w:sz w:val="32"/>
         </w:rPr>
         <w:t>SIKSHA ‘O’ ANUSANDHAN</w:t>
@@ -21,7 +20,6 @@
         <w:rPr>
           <w:rFonts w:ascii="Times New Roman" w:hAnsi="Times New Roman"/>
           <w:b/>
-          <w:color w:val="0F172A"/>
           <w:sz w:val="26"/>
         </w:rPr>
         <w:t>(DEEMED TO BE UNIVERSITY)</w:t>
@@ -31,7 +29,7 @@
     <w:p/>
     <w:p>
       <w:pPr>
-        <w:spacing w:before="160" w:after="280"/>
+        <w:spacing w:before="200" w:after="300"/>
       </w:pPr>
       <w:r>
         <w:rPr>
@@ -70,14 +68,13 @@
     </w:p>
     <w:p>
       <w:pPr>
-        <w:spacing w:after="400"/>
+        <w:spacing w:after="300"/>
         <w:jc w:val="center"/>
       </w:pPr>
       <w:r>
         <w:rPr>
           <w:rFonts w:ascii="Times New Roman" w:hAnsi="Times New Roman"/>
           <w:b/>
-          <w:color w:val="0284C7"/>
           <w:sz w:val="32"/>
         </w:rPr>
         <w:t>Machine Learning Projects with Python</w:t>
@@ -87,7 +84,7 @@
     </w:p>
     <w:p>
       <w:pPr>
-        <w:spacing w:before="200" w:after="80"/>
+        <w:spacing w:before="160" w:after="80"/>
       </w:pPr>
       <w:r>
         <w:rPr>
@@ -140,10 +137,9 @@
         <w:br/>
       </w:r>
     </w:p>
-    <w:p/>
     <w:p>
       <w:pPr>
-        <w:spacing w:before="160" w:after="320"/>
+        <w:spacing w:before="160" w:after="300"/>
         <w:jc w:val="center"/>
       </w:pPr>
       <w:r>
@@ -183,7 +179,7 @@
     </w:p>
     <w:p>
       <w:pPr>
-        <w:spacing w:before="280" w:after="40"/>
+        <w:spacing w:before="240" w:after="40"/>
         <w:jc w:val="center"/>
       </w:pPr>
       <w:r>
@@ -221,13 +217,12 @@
     <w:p>
       <w:pPr>
         <w:keepNext/>
-        <w:spacing w:before="280" w:after="80"/>
+        <w:spacing w:before="240" w:after="80"/>
       </w:pPr>
       <w:r>
         <w:rPr>
           <w:rFonts w:ascii="Times New Roman" w:hAnsi="Times New Roman"/>
           <w:b/>
-          <w:color w:val="0F172A"/>
           <w:sz w:val="28"/>
         </w:rPr>
         <w:t>1 Introduction</w:t>
@@ -236,13 +231,12 @@
     <w:p>
       <w:pPr>
         <w:keepNext/>
-        <w:spacing w:before="200" w:after="60"/>
+        <w:spacing w:before="160" w:after="60"/>
       </w:pPr>
       <w:r>
         <w:rPr>
           <w:rFonts w:ascii="Times New Roman" w:hAnsi="Times New Roman"/>
           <w:b/>
-          <w:color w:val="0284C7"/>
           <w:sz w:val="24"/>
         </w:rPr>
         <w:t>1.1 Problem Statement</w:t>
@@ -255,21 +249,20 @@
       <w:r>
         <w:rPr>
           <w:rFonts w:ascii="Times New Roman" w:hAnsi="Times New Roman"/>
-          <w:sz w:val="21"/>
+          <w:sz w:val="22"/>
         </w:rPr>
-        <w:t>Diabetes mellitus is a progressive metabolic disorder characterized by chronic hyperglycemia resulting from defects in insulin secretion, insulin action, or both. Early identification of high-risk individuals is crucial to avert long-term retinopathy, nephropathy, and cardiovascular complications. However, conventional clinical diagnosis relies on static univariate thresholds (e.g., fasting plasma glucose &gt;= 126 mg/dL) that fail to capture non-linear metabolic interactions. Existing machine learning attempts frequently suffer from data leakage and incorrect handling of biological zero-value artifacts. This investigation develops an end-to-end, leak-free binary classification system to predict diabetes onset from physiological and demographic indicators.</w:t>
+        <w:t>Diabetes mellitus is a chronic metabolic disease characterized by persistent hyperglycemia resulting from insulin secretion defects, insulin action resistance, or both. Early identification of individuals at risk is critical to prevent severe long-term microvascular (retinopathy, nephropathy, neuropathy) and macrovascular (cardiovascular disease, stroke) complications. However, conventional diagnostic mechanisms rely on static univariate clinical cutoffs (e.g., fasting blood glucose &gt;= 126 mg/dL) which fail to capture subtle multi-factorial non-linear interactions between adiposity, insulin sensitivity, and genetic lineage. Furthermore, prior machine learning implementations frequently suffer from severe data leakage (fitting preprocessing globally) and incorrect handling of physiological zero readings. This project addresses these critical challenges by developing a robust, leak-free binary classification system to accurately predict diabetes onset from patient biometric markers.</w:t>
       </w:r>
     </w:p>
     <w:p>
       <w:pPr>
         <w:keepNext/>
-        <w:spacing w:before="200" w:after="60"/>
+        <w:spacing w:before="160" w:after="60"/>
       </w:pPr>
       <w:r>
         <w:rPr>
           <w:rFonts w:ascii="Times New Roman" w:hAnsi="Times New Roman"/>
           <w:b/>
-          <w:color w:val="0284C7"/>
           <w:sz w:val="24"/>
         </w:rPr>
         <w:t>1.2 Aim</w:t>
@@ -282,21 +275,20 @@
       <w:r>
         <w:rPr>
           <w:rFonts w:ascii="Times New Roman" w:hAnsi="Times New Roman"/>
-          <w:sz w:val="21"/>
+          <w:sz w:val="22"/>
         </w:rPr>
-        <w:t>The primary aim of this laboratory project is to design, implement, optimize, benchmark, and deploy an authoritative Multilayer Perceptron (MLP) neural network capable of predicting 5-year diabetes onset probability from patient biometric markers using the Pima Indians Diabetes Database, comparing its predictive performance against standard machine learning baselines.</w:t>
+        <w:t>State the primary aim of your project: The overarching aim of this laboratory project is to design, implement, optimize, benchmark, and deploy a data-leakage-free Multilayer Perceptron (MLP) neural network capable of accurately predicting 5-year diabetes onset probability from patient biometric markers using the Pima Indians Diabetes Database, comparing its predictive performance against standard machine learning classification baselines.</w:t>
       </w:r>
     </w:p>
     <w:p>
       <w:pPr>
         <w:keepNext/>
-        <w:spacing w:before="200" w:after="60"/>
+        <w:spacing w:before="160" w:after="60"/>
       </w:pPr>
       <w:r>
         <w:rPr>
           <w:rFonts w:ascii="Times New Roman" w:hAnsi="Times New Roman"/>
           <w:b/>
-          <w:color w:val="0284C7"/>
           <w:sz w:val="24"/>
         </w:rPr>
         <w:t>1.3 Objectives</w:t>
@@ -309,9 +301,9 @@
       <w:r>
         <w:rPr>
           <w:rFonts w:ascii="Times New Roman" w:hAnsi="Times New Roman"/>
-          <w:sz w:val="21"/>
+          <w:sz w:val="22"/>
         </w:rPr>
-        <w:t>The specific SMART research objectives of this project are:</w:t>
+        <w:t>List the specific objectives:</w:t>
       </w:r>
     </w:p>
     <w:p>
@@ -320,6 +312,10 @@
         <w:ind w:left="360"/>
       </w:pPr>
       <w:r>
+        <w:rPr>
+          <w:rFonts w:ascii="Times New Roman" w:hAnsi="Times New Roman"/>
+          <w:sz w:val="22"/>
+        </w:rPr>
         <w:t>1. Conduct exhaustive Exploratory Data Analysis (EDA) quantifying target class imbalance (65.1% negative vs. 34.9% positive), skewness, and pairwise correlation structures.</w:t>
       </w:r>
     </w:p>
@@ -329,7 +325,11 @@
         <w:ind w:left="360"/>
       </w:pPr>
       <w:r>
-        <w:t>2. Implement a leak-free preprocessing pipeline that detects biologically implausible zeros in physiological continuous variables and imputes them using training-fitted medians.</w:t>
+        <w:rPr>
+          <w:rFonts w:ascii="Times New Roman" w:hAnsi="Times New Roman"/>
+          <w:sz w:val="22"/>
+        </w:rPr>
+        <w:t>2. Implement a leak-free preprocessing pipeline that identifies biologically implausible zero values in continuous variables (Glucose, Blood Pressure, Skin Thickness, Insulin, BMI) and imputes them using training-fitted medians.</w:t>
       </w:r>
     </w:p>
     <w:p>
@@ -338,7 +338,11 @@
         <w:ind w:left="360"/>
       </w:pPr>
       <w:r>
-        <w:t>3. Design 16 domain-engineered features (expanding 8 raw features to 24 processed dimensions) incorporating WHO BMI bins, ADA glycemic categories, metabolic ratios, and non-linear log transforms.</w:t>
+        <w:rPr>
+          <w:rFonts w:ascii="Times New Roman" w:hAnsi="Times New Roman"/>
+          <w:sz w:val="22"/>
+        </w:rPr>
+        <w:t>3. Formulate 16 domain-engineered features (expanding 8 raw features to 24 processed dimensions) incorporating WHO BMI categories, ADA glycemic stages, metabolic interaction ratios, and log transforms.</w:t>
       </w:r>
     </w:p>
     <w:p>
@@ -347,6 +351,10 @@
         <w:ind w:left="360"/>
       </w:pPr>
       <w:r>
+        <w:rPr>
+          <w:rFonts w:ascii="Times New Roman" w:hAnsi="Times New Roman"/>
+          <w:sz w:val="22"/>
+        </w:rPr>
         <w:t>4. Develop and evaluate 7 baseline machine learning classifiers (Logistic Regression, KNN, SVM, Decision Tree, Random Forest, Gradient Boosting, Baseline MLP).</w:t>
       </w:r>
     </w:p>
@@ -356,7 +364,11 @@
         <w:ind w:left="360"/>
       </w:pPr>
       <w:r>
-        <w:t>5. Systematically optimize the Multilayer Perceptron via Grid Search across hidden layer topologies, L2 penalties, learning rates, and batch sizes.</w:t>
+        <w:rPr>
+          <w:rFonts w:ascii="Times New Roman" w:hAnsi="Times New Roman"/>
+          <w:sz w:val="22"/>
+        </w:rPr>
+        <w:t>5. Systematically optimize the Multilayer Perceptron architecture using Grid Search across hidden layer topologies, L2 penalties (alpha), initial learning rates, and batch sizes.</w:t>
       </w:r>
     </w:p>
     <w:p>
@@ -365,6 +377,10 @@
         <w:ind w:left="360"/>
       </w:pPr>
       <w:r>
+        <w:rPr>
+          <w:rFonts w:ascii="Times New Roman" w:hAnsi="Times New Roman"/>
+          <w:sz w:val="22"/>
+        </w:rPr>
         <w:t>6. Evaluate all candidate models on an untouched test partition (N = 116) across Accuracy, Sensitivity (Recall), Specificity, Precision, F1-Score, and ROC-AUC.</w:t>
       </w:r>
     </w:p>
@@ -374,19 +390,27 @@
         <w:ind w:left="360"/>
       </w:pPr>
       <w:r>
+        <w:rPr>
+          <w:rFonts w:ascii="Times New Roman" w:hAnsi="Times New Roman"/>
+          <w:sz w:val="22"/>
+        </w:rPr>
         <w:t>7. Deploy the production pipeline to an interactive Streamlit Cloud dashboard supporting single-patient triage, counterfactual sensitivity simulation, and batch cohort screening.</w:t>
       </w:r>
     </w:p>
     <w:p>
+      <w:r>
+        <w:br w:type="page"/>
+      </w:r>
+    </w:p>
+    <w:p>
       <w:pPr>
         <w:keepNext/>
-        <w:spacing w:before="280" w:after="80"/>
+        <w:spacing w:before="240" w:after="80"/>
       </w:pPr>
       <w:r>
         <w:rPr>
           <w:rFonts w:ascii="Times New Roman" w:hAnsi="Times New Roman"/>
           <w:b/>
-          <w:color w:val="0F172A"/>
           <w:sz w:val="28"/>
         </w:rPr>
         <w:t>2 Dataset Description</w:t>
@@ -395,13 +419,12 @@
     <w:p>
       <w:pPr>
         <w:keepNext/>
-        <w:spacing w:before="200" w:after="60"/>
+        <w:spacing w:before="160" w:after="60"/>
       </w:pPr>
       <w:r>
         <w:rPr>
           <w:rFonts w:ascii="Times New Roman" w:hAnsi="Times New Roman"/>
           <w:b/>
-          <w:color w:val="0284C7"/>
           <w:sz w:val="24"/>
         </w:rPr>
         <w:t>2.1 Dataset Source</w:t>
@@ -414,21 +437,20 @@
       <w:r>
         <w:rPr>
           <w:rFonts w:ascii="Times New Roman" w:hAnsi="Times New Roman"/>
-          <w:sz w:val="21"/>
+          <w:sz w:val="22"/>
         </w:rPr>
-        <w:t>The investigation utilizes the standard Pima Indians Diabetes Database collected by the National Institute of Diabetes and Digestive and Kidney Diseases (NIDDK). The dataset comprises records of female patients of Pima Indian heritage aged 21 years and older.</w:t>
+        <w:t>The project utilizes the standard Pima Indians Diabetes Database collected by the National Institute of Diabetes and Digestive and Kidney Diseases (NIDDK). The dataset comprises female patient records of Pima Indian descent aged 21 years and older residing near Phoenix, Arizona.</w:t>
       </w:r>
     </w:p>
     <w:p>
       <w:pPr>
         <w:keepNext/>
-        <w:spacing w:before="200" w:after="60"/>
+        <w:spacing w:before="160" w:after="60"/>
       </w:pPr>
       <w:r>
         <w:rPr>
           <w:rFonts w:ascii="Times New Roman" w:hAnsi="Times New Roman"/>
           <w:b/>
-          <w:color w:val="0284C7"/>
           <w:sz w:val="24"/>
         </w:rPr>
         <w:t>2.2 Dataset Features</w:t>
@@ -441,9 +463,9 @@
       <w:r>
         <w:rPr>
           <w:rFonts w:ascii="Times New Roman" w:hAnsi="Times New Roman"/>
-          <w:sz w:val="21"/>
+          <w:sz w:val="22"/>
         </w:rPr>
-        <w:t>The dataset contains 8 raw clinical and physiological input attributes:</w:t>
+        <w:t>The dataset contains 8 raw clinical, physiological, and demographic input attributes:</w:t>
       </w:r>
     </w:p>
     <w:p>
@@ -452,7 +474,11 @@
         <w:ind w:left="360"/>
       </w:pPr>
       <w:r>
-        <w:t>• Pregnancies: Total count of completed pregnancies.</w:t>
+        <w:rPr>
+          <w:rFonts w:ascii="Times New Roman" w:hAnsi="Times New Roman"/>
+          <w:sz w:val="22"/>
+        </w:rPr>
+        <w:t>• Pregnancies: Total number of completed pregnancies.</w:t>
       </w:r>
     </w:p>
     <w:p>
@@ -461,6 +487,10 @@
         <w:ind w:left="360"/>
       </w:pPr>
       <w:r>
+        <w:rPr>
+          <w:rFonts w:ascii="Times New Roman" w:hAnsi="Times New Roman"/>
+          <w:sz w:val="22"/>
+        </w:rPr>
         <w:t>• Glucose: Plasma glucose concentration 2 hours after a 75g oral glucose tolerance test (OGTT) in mg/dL.</w:t>
       </w:r>
     </w:p>
@@ -470,6 +500,10 @@
         <w:ind w:left="360"/>
       </w:pPr>
       <w:r>
+        <w:rPr>
+          <w:rFonts w:ascii="Times New Roman" w:hAnsi="Times New Roman"/>
+          <w:sz w:val="22"/>
+        </w:rPr>
         <w:t>• BloodPressure: Diastolic blood pressure reading in mm Hg.</w:t>
       </w:r>
     </w:p>
@@ -479,6 +513,10 @@
         <w:ind w:left="360"/>
       </w:pPr>
       <w:r>
+        <w:rPr>
+          <w:rFonts w:ascii="Times New Roman" w:hAnsi="Times New Roman"/>
+          <w:sz w:val="22"/>
+        </w:rPr>
         <w:t>• SkinThickness: Triceps skinfold caliper thickness in mm (proxy for subcutaneous adiposity).</w:t>
       </w:r>
     </w:p>
@@ -488,6 +526,10 @@
         <w:ind w:left="360"/>
       </w:pPr>
       <w:r>
+        <w:rPr>
+          <w:rFonts w:ascii="Times New Roman" w:hAnsi="Times New Roman"/>
+          <w:sz w:val="22"/>
+        </w:rPr>
         <w:t>• Insulin: 2-Hour post-load serum insulin concentration in μU/mL.</w:t>
       </w:r>
     </w:p>
@@ -497,6 +539,10 @@
         <w:ind w:left="360"/>
       </w:pPr>
       <w:r>
+        <w:rPr>
+          <w:rFonts w:ascii="Times New Roman" w:hAnsi="Times New Roman"/>
+          <w:sz w:val="22"/>
+        </w:rPr>
         <w:t>• BMI: Body Mass Index computed as weight in kg / (height in m)^2.</w:t>
       </w:r>
     </w:p>
@@ -506,7 +552,11 @@
         <w:ind w:left="360"/>
       </w:pPr>
       <w:r>
-        <w:t>• DiabetesPedigreeFunction (DPF): Genetic risk score synthesized from family diabetes history.</w:t>
+        <w:rPr>
+          <w:rFonts w:ascii="Times New Roman" w:hAnsi="Times New Roman"/>
+          <w:sz w:val="22"/>
+        </w:rPr>
+        <w:t>• DiabetesPedigreeFunction (DPF): Genetic risk score synthesized from ancestral diabetic pedigree.</w:t>
       </w:r>
     </w:p>
     <w:p>
@@ -515,19 +565,22 @@
         <w:ind w:left="360"/>
       </w:pPr>
       <w:r>
+        <w:rPr>
+          <w:rFonts w:ascii="Times New Roman" w:hAnsi="Times New Roman"/>
+          <w:sz w:val="22"/>
+        </w:rPr>
         <w:t>• Age: Chronological patient age in years.</w:t>
       </w:r>
     </w:p>
     <w:p>
       <w:pPr>
         <w:keepNext/>
-        <w:spacing w:before="200" w:after="60"/>
+        <w:spacing w:before="160" w:after="60"/>
       </w:pPr>
       <w:r>
         <w:rPr>
           <w:rFonts w:ascii="Times New Roman" w:hAnsi="Times New Roman"/>
           <w:b/>
-          <w:color w:val="0284C7"/>
           <w:sz w:val="24"/>
         </w:rPr>
         <w:t>2.3 Target Variable</w:t>
@@ -540,21 +593,20 @@
       <w:r>
         <w:rPr>
           <w:rFonts w:ascii="Times New Roman" w:hAnsi="Times New Roman"/>
-          <w:sz w:val="21"/>
+          <w:sz w:val="22"/>
         </w:rPr>
-        <w:t>The target variable is Outcome, a binary classification label indicating whether the patient developed diabetes within five years of initial examination (Outcome = 1 for diabetic, Outcome = 0 for non-diabetic).</w:t>
+        <w:t>The target variable is Outcome, a binary classification indicator where 1 denotes confirmed diabetes onset within five years of clinical examination, and 0 denotes non-diabetic status.</w:t>
       </w:r>
     </w:p>
     <w:p>
       <w:pPr>
         <w:keepNext/>
-        <w:spacing w:before="200" w:after="60"/>
+        <w:spacing w:before="160" w:after="60"/>
       </w:pPr>
       <w:r>
         <w:rPr>
           <w:rFonts w:ascii="Times New Roman" w:hAnsi="Times New Roman"/>
           <w:b/>
-          <w:color w:val="0284C7"/>
           <w:sz w:val="24"/>
         </w:rPr>
         <w:t>2.4 Dataset Statistics</w:t>
@@ -567,7 +619,7 @@
       <w:r>
         <w:rPr>
           <w:rFonts w:ascii="Times New Roman" w:hAnsi="Times New Roman"/>
-          <w:sz w:val="21"/>
+          <w:sz w:val="22"/>
         </w:rPr>
         <w:t>The dataset contains N = 768 patient instances. Summary descriptive statistics are presented in Table 1.</w:t>
       </w:r>
@@ -1772,21 +1824,25 @@
       <w:r>
         <w:rPr>
           <w:rFonts w:ascii="Times New Roman" w:hAnsi="Times New Roman"/>
-          <w:sz w:val="21"/>
+          <w:sz w:val="22"/>
         </w:rPr>
         <w:t>*Note: Zero values in Pregnancies represent nulliparous women (biologically valid). Zeros in Glucose, BloodPressure, SkinThickness, Insulin, and BMI represent unrecorded measurements.</w:t>
       </w:r>
     </w:p>
     <w:p>
+      <w:r>
+        <w:br w:type="page"/>
+      </w:r>
+    </w:p>
+    <w:p>
       <w:pPr>
         <w:keepNext/>
-        <w:spacing w:before="280" w:after="80"/>
+        <w:spacing w:before="240" w:after="80"/>
       </w:pPr>
       <w:r>
         <w:rPr>
           <w:rFonts w:ascii="Times New Roman" w:hAnsi="Times New Roman"/>
           <w:b/>
-          <w:color w:val="0F172A"/>
           <w:sz w:val="28"/>
         </w:rPr>
         <w:t>3 Exploratory Data Analysis</w:t>
@@ -1795,13 +1851,12 @@
     <w:p>
       <w:pPr>
         <w:keepNext/>
-        <w:spacing w:before="200" w:after="60"/>
+        <w:spacing w:before="160" w:after="60"/>
       </w:pPr>
       <w:r>
         <w:rPr>
           <w:rFonts w:ascii="Times New Roman" w:hAnsi="Times New Roman"/>
           <w:b/>
-          <w:color w:val="0284C7"/>
           <w:sz w:val="24"/>
         </w:rPr>
         <w:t>3.1 Dataset Structure</w:t>
@@ -1814,7 +1869,7 @@
       <w:r>
         <w:rPr>
           <w:rFonts w:ascii="Times New Roman" w:hAnsi="Times New Roman"/>
-          <w:sz w:val="21"/>
+          <w:sz w:val="22"/>
         </w:rPr>
         <w:t>The dataset contains 768 rows and 9 columns with zero explicit SQL NULL values, but extensive hidden biological zero values.</w:t>
       </w:r>
@@ -1822,13 +1877,12 @@
     <w:p>
       <w:pPr>
         <w:keepNext/>
-        <w:spacing w:before="200" w:after="60"/>
+        <w:spacing w:before="160" w:after="60"/>
       </w:pPr>
       <w:r>
         <w:rPr>
           <w:rFonts w:ascii="Times New Roman" w:hAnsi="Times New Roman"/>
           <w:b/>
-          <w:color w:val="0284C7"/>
           <w:sz w:val="24"/>
         </w:rPr>
         <w:t>3.2 Descriptive Statistics</w:t>
@@ -1841,7 +1895,7 @@
       <w:r>
         <w:rPr>
           <w:rFonts w:ascii="Times New Roman" w:hAnsi="Times New Roman"/>
-          <w:sz w:val="21"/>
+          <w:sz w:val="22"/>
         </w:rPr>
         <w:t>Continuous physiological attributes exhibit pronounced variance. Insulin ranges from 0 to 846 μU/mL with a high standard deviation (115.24 μU/mL). Mean BMI is 31.99 kg/m^2, indicating that the patient cohort predominantly falls into the WHO Obese Class I category.</w:t>
       </w:r>
@@ -1849,13 +1903,12 @@
     <w:p>
       <w:pPr>
         <w:keepNext/>
-        <w:spacing w:before="200" w:after="60"/>
+        <w:spacing w:before="160" w:after="60"/>
       </w:pPr>
       <w:r>
         <w:rPr>
           <w:rFonts w:ascii="Times New Roman" w:hAnsi="Times New Roman"/>
           <w:b/>
-          <w:color w:val="0284C7"/>
           <w:sz w:val="24"/>
         </w:rPr>
         <w:t>3.3 Missing Value Analysis</w:t>
@@ -1868,7 +1921,7 @@
       <w:r>
         <w:rPr>
           <w:rFonts w:ascii="Times New Roman" w:hAnsi="Times New Roman"/>
-          <w:sz w:val="21"/>
+          <w:sz w:val="22"/>
         </w:rPr>
         <w:t>A biological sanity audit revealed that 374 records (48.70%) have Insulin = 0, 227 records (29.56%) have SkinThickness = 0, 35 records (4.56%) have BloodPressure = 0, 11 records (1.43%) have BMI = 0, and 5 records (0.65%) have Glucose = 0. A living human cannot have zero blood glucose or zero blood pressure; these are missing data artifacts requiring imputation.</w:t>
       </w:r>
@@ -1876,13 +1929,12 @@
     <w:p>
       <w:pPr>
         <w:keepNext/>
-        <w:spacing w:before="200" w:after="60"/>
+        <w:spacing w:before="160" w:after="60"/>
       </w:pPr>
       <w:r>
         <w:rPr>
           <w:rFonts w:ascii="Times New Roman" w:hAnsi="Times New Roman"/>
           <w:b/>
-          <w:color w:val="0284C7"/>
           <w:sz w:val="24"/>
         </w:rPr>
         <w:t>3.4 Class Distribution</w:t>
@@ -1895,7 +1947,7 @@
       <w:r>
         <w:rPr>
           <w:rFonts w:ascii="Times New Roman" w:hAnsi="Times New Roman"/>
-          <w:sz w:val="21"/>
+          <w:sz w:val="22"/>
         </w:rPr>
         <w:t>The target variable consists of 500 negative instances (Class 0, 65.10%) and 268 positive instances (Class 1, 34.90%). The moderate class imbalance ratio (~1.87 : 1) necessitates evaluation via Precision, Recall, and ROC-AUC in addition to raw Accuracy.</w:t>
       </w:r>
@@ -1903,13 +1955,12 @@
     <w:p>
       <w:pPr>
         <w:keepNext/>
-        <w:spacing w:before="200" w:after="60"/>
+        <w:spacing w:before="160" w:after="60"/>
       </w:pPr>
       <w:r>
         <w:rPr>
           <w:rFonts w:ascii="Times New Roman" w:hAnsi="Times New Roman"/>
           <w:b/>
-          <w:color w:val="0284C7"/>
           <w:sz w:val="24"/>
         </w:rPr>
         <w:t>3.5 Univariate Analysis</w:t>
@@ -1922,7 +1973,7 @@
       <w:r>
         <w:rPr>
           <w:rFonts w:ascii="Times New Roman" w:hAnsi="Times New Roman"/>
-          <w:sz w:val="21"/>
+          <w:sz w:val="22"/>
         </w:rPr>
         <w:t>Insulin (skewness = 2.27) and DiabetesPedigreeFunction (skewness = 1.92) show severe positive right-skewness. Glucose and Blood Pressure approximate normal distributions once zero artifacts are removed.</w:t>
       </w:r>
@@ -1930,13 +1981,12 @@
     <w:p>
       <w:pPr>
         <w:keepNext/>
-        <w:spacing w:before="200" w:after="60"/>
+        <w:spacing w:before="160" w:after="60"/>
       </w:pPr>
       <w:r>
         <w:rPr>
           <w:rFonts w:ascii="Times New Roman" w:hAnsi="Times New Roman"/>
           <w:b/>
-          <w:color w:val="0284C7"/>
           <w:sz w:val="24"/>
         </w:rPr>
         <w:t>3.6 Bivariate Analysis</w:t>
@@ -1949,7 +1999,7 @@
       <w:r>
         <w:rPr>
           <w:rFonts w:ascii="Times New Roman" w:hAnsi="Times New Roman"/>
-          <w:sz w:val="21"/>
+          <w:sz w:val="22"/>
         </w:rPr>
         <w:t>Bivariate boxplot analysis demonstrates that diabetic patients exhibit statistically significant higher median glucose (140 vs 107 mg/dL), higher BMI (34.3 vs 30.1 kg/m^2), and older median age (36 vs 27 years).</w:t>
       </w:r>
@@ -1957,13 +2007,12 @@
     <w:p>
       <w:pPr>
         <w:keepNext/>
-        <w:spacing w:before="200" w:after="60"/>
+        <w:spacing w:before="160" w:after="60"/>
       </w:pPr>
       <w:r>
         <w:rPr>
           <w:rFonts w:ascii="Times New Roman" w:hAnsi="Times New Roman"/>
           <w:b/>
-          <w:color w:val="0284C7"/>
           <w:sz w:val="24"/>
         </w:rPr>
         <w:t>3.7 Correlation Analysis</w:t>
@@ -1976,7 +2025,7 @@
       <w:r>
         <w:rPr>
           <w:rFonts w:ascii="Times New Roman" w:hAnsi="Times New Roman"/>
-          <w:sz w:val="21"/>
+          <w:sz w:val="22"/>
         </w:rPr>
         <w:t>Glucose exhibits the strongest linear correlation with diabetes outcome (r = 0.49), followed by BMI (r = 0.31), Age (r = 0.24), and Insulin (r = 0.21). Notable pairwise collinearity exists between Age and Pregnancies (r = 0.54) and SkinThickness and BMI (r = 0.65).</w:t>
       </w:r>
@@ -1984,13 +2033,12 @@
     <w:p>
       <w:pPr>
         <w:keepNext/>
-        <w:spacing w:before="200" w:after="60"/>
+        <w:spacing w:before="160" w:after="60"/>
       </w:pPr>
       <w:r>
         <w:rPr>
           <w:rFonts w:ascii="Times New Roman" w:hAnsi="Times New Roman"/>
           <w:b/>
-          <w:color w:val="0284C7"/>
           <w:sz w:val="24"/>
         </w:rPr>
         <w:t>3.8 Outlier Analysis</w:t>
@@ -2003,21 +2051,76 @@
       <w:r>
         <w:rPr>
           <w:rFonts w:ascii="Times New Roman" w:hAnsi="Times New Roman"/>
-          <w:sz w:val="21"/>
+          <w:sz w:val="22"/>
         </w:rPr>
         <w:t>Interquartile Range (IQR) analysis identified physiological extremes (e.g., Insulin &gt; 400 μU/mL, BMI &gt; 50 kg/m^2). These were retained because extreme values represent genuine severe metabolic dysregulation rather than measurement errors.</w:t>
       </w:r>
     </w:p>
     <w:p>
       <w:pPr>
+        <w:jc w:val="center"/>
+      </w:pPr>
+      <w:r>
+        <w:drawing>
+          <wp:inline xmlns:a="http://schemas.openxmlformats.org/drawingml/2006/main" xmlns:pic="http://schemas.openxmlformats.org/drawingml/2006/picture">
+            <wp:extent cx="3474720" cy="2914043"/>
+            <wp:docPr id="2" name="Picture 2"/>
+            <wp:cNvGraphicFramePr>
+              <a:graphicFrameLocks noChangeAspect="1"/>
+            </wp:cNvGraphicFramePr>
+            <a:graphic>
+              <a:graphicData uri="http://schemas.openxmlformats.org/drawingml/2006/picture">
+                <pic:pic>
+                  <pic:nvPicPr>
+                    <pic:cNvPr id="0" name="correlation_heatmap.png"/>
+                    <pic:cNvPicPr/>
+                  </pic:nvPicPr>
+                  <pic:blipFill>
+                    <a:blip r:embed="rId10"/>
+                    <a:stretch>
+                      <a:fillRect/>
+                    </a:stretch>
+                  </pic:blipFill>
+                  <pic:spPr>
+                    <a:xfrm>
+                      <a:off x="0" y="0"/>
+                      <a:ext cx="3474720" cy="2914043"/>
+                    </a:xfrm>
+                    <a:prstGeom prst="rect"/>
+                  </pic:spPr>
+                </pic:pic>
+              </a:graphicData>
+            </a:graphic>
+          </wp:inline>
+        </w:drawing>
+      </w:r>
+    </w:p>
+    <w:p>
+      <w:pPr>
+        <w:jc w:val="center"/>
+      </w:pPr>
+      <w:r>
+        <w:rPr>
+          <w:i/>
+          <w:sz w:val="18"/>
+        </w:rPr>
+        <w:t>Figure 1: Pairwise Pearson Correlation Heatmap across Biometric Features</w:t>
+      </w:r>
+    </w:p>
+    <w:p>
+      <w:r>
+        <w:br w:type="page"/>
+      </w:r>
+    </w:p>
+    <w:p>
+      <w:pPr>
         <w:keepNext/>
-        <w:spacing w:before="280" w:after="80"/>
+        <w:spacing w:before="240" w:after="80"/>
       </w:pPr>
       <w:r>
         <w:rPr>
           <w:rFonts w:ascii="Times New Roman" w:hAnsi="Times New Roman"/>
           <w:b/>
-          <w:color w:val="0F172A"/>
           <w:sz w:val="28"/>
         </w:rPr>
         <w:t>4 Data Preprocessing</w:t>
@@ -2026,13 +2129,12 @@
     <w:p>
       <w:pPr>
         <w:keepNext/>
-        <w:spacing w:before="200" w:after="60"/>
+        <w:spacing w:before="160" w:after="60"/>
       </w:pPr>
       <w:r>
         <w:rPr>
           <w:rFonts w:ascii="Times New Roman" w:hAnsi="Times New Roman"/>
           <w:b/>
-          <w:color w:val="0284C7"/>
           <w:sz w:val="24"/>
         </w:rPr>
         <w:t>4.1 Data Cleaning</w:t>
@@ -2045,7 +2147,7 @@
       <w:r>
         <w:rPr>
           <w:rFonts w:ascii="Times New Roman" w:hAnsi="Times New Roman"/>
-          <w:sz w:val="21"/>
+          <w:sz w:val="22"/>
         </w:rPr>
         <w:t>Non-numeric entries and formatting anomalies were verified; column schemas were standardized to float64/int64.</w:t>
       </w:r>
@@ -2053,13 +2155,12 @@
     <w:p>
       <w:pPr>
         <w:keepNext/>
-        <w:spacing w:before="200" w:after="60"/>
+        <w:spacing w:before="160" w:after="60"/>
       </w:pPr>
       <w:r>
         <w:rPr>
           <w:rFonts w:ascii="Times New Roman" w:hAnsi="Times New Roman"/>
           <w:b/>
-          <w:color w:val="0284C7"/>
           <w:sz w:val="24"/>
         </w:rPr>
         <w:t>4.2 Missing Value Handling</w:t>
@@ -2072,7 +2173,7 @@
       <w:r>
         <w:rPr>
           <w:rFonts w:ascii="Times New Roman" w:hAnsi="Times New Roman"/>
-          <w:sz w:val="21"/>
+          <w:sz w:val="22"/>
         </w:rPr>
         <w:t>Zeros in continuous variables (Glucose, BloodPressure, SkinThickness, Insulin, BMI) were replaced with NaN. To strictly eliminate data leakage, median imputation statistics were fitted solely on the training partition (N = 537): Glucose = 117.0 mg/dL, BloodPressure = 72.0 mm Hg, SkinThickness = 29.0 mm, Insulin = 125.0 μU/mL, BMI = 32.0 kg/m^2.</w:t>
       </w:r>
@@ -2080,13 +2181,12 @@
     <w:p>
       <w:pPr>
         <w:keepNext/>
-        <w:spacing w:before="200" w:after="60"/>
+        <w:spacing w:before="160" w:after="60"/>
       </w:pPr>
       <w:r>
         <w:rPr>
           <w:rFonts w:ascii="Times New Roman" w:hAnsi="Times New Roman"/>
           <w:b/>
-          <w:color w:val="0284C7"/>
           <w:sz w:val="24"/>
         </w:rPr>
         <w:t>4.3 Outlier Handling</w:t>
@@ -2099,7 +2199,7 @@
       <w:r>
         <w:rPr>
           <w:rFonts w:ascii="Times New Roman" w:hAnsi="Times New Roman"/>
-          <w:sz w:val="21"/>
+          <w:sz w:val="22"/>
         </w:rPr>
         <w:t>Non-linear log1p transformations were applied to skewed variables (Insulin, DPF) to stabilize numerical gradients without truncating data.</w:t>
       </w:r>
@@ -2107,13 +2207,12 @@
     <w:p>
       <w:pPr>
         <w:keepNext/>
-        <w:spacing w:before="200" w:after="60"/>
+        <w:spacing w:before="160" w:after="60"/>
       </w:pPr>
       <w:r>
         <w:rPr>
           <w:rFonts w:ascii="Times New Roman" w:hAnsi="Times New Roman"/>
           <w:b/>
-          <w:color w:val="0284C7"/>
           <w:sz w:val="24"/>
         </w:rPr>
         <w:t>4.4 Feature Engineering</w:t>
@@ -2126,7 +2225,7 @@
       <w:r>
         <w:rPr>
           <w:rFonts w:ascii="Times New Roman" w:hAnsi="Times New Roman"/>
-          <w:sz w:val="21"/>
+          <w:sz w:val="22"/>
         </w:rPr>
         <w:t>16 domain features were engineered from imputed measurements, expanding the feature space from 8 to 24 dimensions:</w:t>
       </w:r>
@@ -2137,6 +2236,10 @@
         <w:ind w:left="360"/>
       </w:pPr>
       <w:r>
+        <w:rPr>
+          <w:rFonts w:ascii="Times New Roman" w:hAnsi="Times New Roman"/>
+          <w:sz w:val="22"/>
+        </w:rPr>
         <w:t>1. WHO Adiposity Bins (4 binary indicators): BMI_Underweight, BMI_Normal, BMI_Overweight, BMI_Obese.</w:t>
       </w:r>
     </w:p>
@@ -2146,6 +2249,10 @@
         <w:ind w:left="360"/>
       </w:pPr>
       <w:r>
+        <w:rPr>
+          <w:rFonts w:ascii="Times New Roman" w:hAnsi="Times New Roman"/>
+          <w:sz w:val="22"/>
+        </w:rPr>
         <w:t>2. ADA Glycemic Stages (3 binary indicators): Glucose_Normal (&lt;100), Glucose_Prediabetes (100-125), Glucose_Diabetes (&gt;=126 mg/dL).</w:t>
       </w:r>
     </w:p>
@@ -2155,6 +2262,10 @@
         <w:ind w:left="360"/>
       </w:pPr>
       <w:r>
+        <w:rPr>
+          <w:rFonts w:ascii="Times New Roman" w:hAnsi="Times New Roman"/>
+          <w:sz w:val="22"/>
+        </w:rPr>
         <w:t>3. Age Cohorts (3 binary indicators): Age_Young (&lt;30), Age_Middle (30-50), Age_Senior (&gt;50 years).</w:t>
       </w:r>
     </w:p>
@@ -2164,6 +2275,10 @@
         <w:ind w:left="360"/>
       </w:pPr>
       <w:r>
+        <w:rPr>
+          <w:rFonts w:ascii="Times New Roman" w:hAnsi="Times New Roman"/>
+          <w:sz w:val="22"/>
+        </w:rPr>
         <w:t>4. Insulin_Glucose_Ratio: Insulin / (Glucose + 1e-5) — proxy for beta-cell compensation.</w:t>
       </w:r>
     </w:p>
@@ -2173,6 +2288,10 @@
         <w:ind w:left="360"/>
       </w:pPr>
       <w:r>
+        <w:rPr>
+          <w:rFonts w:ascii="Times New Roman" w:hAnsi="Times New Roman"/>
+          <w:sz w:val="22"/>
+        </w:rPr>
         <w:t>5. Insulin_Resistance_Proxy: (Glucose * Insulin) / 405.0 — surrogate for systemic insulin resistance.</w:t>
       </w:r>
     </w:p>
@@ -2182,6 +2301,10 @@
         <w:ind w:left="360"/>
       </w:pPr>
       <w:r>
+        <w:rPr>
+          <w:rFonts w:ascii="Times New Roman" w:hAnsi="Times New Roman"/>
+          <w:sz w:val="22"/>
+        </w:rPr>
         <w:t>6. Pregnancy_Age_Risk: Pregnancies / (Age + 1e-5) — normalizes parity against chronological age.</w:t>
       </w:r>
     </w:p>
@@ -2191,6 +2314,10 @@
         <w:ind w:left="360"/>
       </w:pPr>
       <w:r>
+        <w:rPr>
+          <w:rFonts w:ascii="Times New Roman" w:hAnsi="Times New Roman"/>
+          <w:sz w:val="22"/>
+        </w:rPr>
         <w:t>7. BMI_Age_Interaction: BMI * Age — captures synergistic metabolic risk amplification.</w:t>
       </w:r>
     </w:p>
@@ -2200,19 +2327,22 @@
         <w:ind w:left="360"/>
       </w:pPr>
       <w:r>
+        <w:rPr>
+          <w:rFonts w:ascii="Times New Roman" w:hAnsi="Times New Roman"/>
+          <w:sz w:val="22"/>
+        </w:rPr>
         <w:t>8. Log Transforms: Log_Insulin = ln(1 + Insulin) and Log_DPF = ln(1 + DPF) to compress tail distributions.</w:t>
       </w:r>
     </w:p>
     <w:p>
       <w:pPr>
         <w:keepNext/>
-        <w:spacing w:before="200" w:after="60"/>
+        <w:spacing w:before="160" w:after="60"/>
       </w:pPr>
       <w:r>
         <w:rPr>
           <w:rFonts w:ascii="Times New Roman" w:hAnsi="Times New Roman"/>
           <w:b/>
-          <w:color w:val="0284C7"/>
           <w:sz w:val="24"/>
         </w:rPr>
         <w:t>4.5 Feature Selection</w:t>
@@ -2225,7 +2355,7 @@
       <w:r>
         <w:rPr>
           <w:rFonts w:ascii="Times New Roman" w:hAnsi="Times New Roman"/>
-          <w:sz w:val="21"/>
+          <w:sz w:val="22"/>
         </w:rPr>
         <w:t>All 24 features were retained to allow the Multilayer Perceptron to autonomously learn non-linear weight representations across linear, categorical, and interaction features.</w:t>
       </w:r>
@@ -2233,13 +2363,12 @@
     <w:p>
       <w:pPr>
         <w:keepNext/>
-        <w:spacing w:before="200" w:after="60"/>
+        <w:spacing w:before="160" w:after="60"/>
       </w:pPr>
       <w:r>
         <w:rPr>
           <w:rFonts w:ascii="Times New Roman" w:hAnsi="Times New Roman"/>
           <w:b/>
-          <w:color w:val="0284C7"/>
           <w:sz w:val="24"/>
         </w:rPr>
         <w:t>4.6 Train-Test Split</w:t>
@@ -2252,7 +2381,7 @@
       <w:r>
         <w:rPr>
           <w:rFonts w:ascii="Times New Roman" w:hAnsi="Times New Roman"/>
-          <w:sz w:val="21"/>
+          <w:sz w:val="22"/>
         </w:rPr>
         <w:t>The dataset was partitioned using stratified sampling: 70% Training (N = 537), 15% Validation (N = 115), and 15% Untouched Test (N = 116), ensuring identical 34.9% positive class prevalence across partitions.</w:t>
       </w:r>
@@ -2260,13 +2389,12 @@
     <w:p>
       <w:pPr>
         <w:keepNext/>
-        <w:spacing w:before="200" w:after="60"/>
+        <w:spacing w:before="160" w:after="60"/>
       </w:pPr>
       <w:r>
         <w:rPr>
           <w:rFonts w:ascii="Times New Roman" w:hAnsi="Times New Roman"/>
           <w:b/>
-          <w:color w:val="0284C7"/>
           <w:sz w:val="24"/>
         </w:rPr>
         <w:t>4.7 Feature Scaling</w:t>
@@ -2279,21 +2407,25 @@
       <w:r>
         <w:rPr>
           <w:rFonts w:ascii="Times New Roman" w:hAnsi="Times New Roman"/>
-          <w:sz w:val="21"/>
+          <w:sz w:val="22"/>
         </w:rPr>
         <w:t>StandardScaler was fitted on training data and applied to scale all 24 features to zero mean and unit variance (z = (x - μ_train) / σ_train).</w:t>
       </w:r>
     </w:p>
     <w:p>
+      <w:r>
+        <w:br w:type="page"/>
+      </w:r>
+    </w:p>
+    <w:p>
       <w:pPr>
         <w:keepNext/>
-        <w:spacing w:before="280" w:after="80"/>
+        <w:spacing w:before="240" w:after="80"/>
       </w:pPr>
       <w:r>
         <w:rPr>
           <w:rFonts w:ascii="Times New Roman" w:hAnsi="Times New Roman"/>
           <w:b/>
-          <w:color w:val="0F172A"/>
           <w:sz w:val="28"/>
         </w:rPr>
         <w:t>5 Methodology</w:t>
@@ -2302,13 +2434,12 @@
     <w:p>
       <w:pPr>
         <w:keepNext/>
-        <w:spacing w:before="200" w:after="60"/>
+        <w:spacing w:before="160" w:after="60"/>
       </w:pPr>
       <w:r>
         <w:rPr>
           <w:rFonts w:ascii="Times New Roman" w:hAnsi="Times New Roman"/>
           <w:b/>
-          <w:color w:val="0284C7"/>
           <w:sz w:val="24"/>
         </w:rPr>
         <w:t>5.1 Overall Project Workflow</w:t>
@@ -2321,21 +2452,20 @@
       <w:r>
         <w:rPr>
           <w:rFonts w:ascii="Times New Roman" w:hAnsi="Times New Roman"/>
-          <w:sz w:val="21"/>
+          <w:sz w:val="22"/>
         </w:rPr>
-        <w:t>The project follows a rigorous machine learning lifecycle: Data Acquisition -&gt; Zero Detection -&gt; Training-Fitted Imputation -&gt; Feature Engineering -&gt; Stratified Partitioning -&gt; Baseline Benchmarking -&gt; MLP Hyperparameter Grid Search -&gt; Final Retraining -&gt; Untouched Test Evaluation -&gt; Web Deployment.</w:t>
+        <w:t>The project follows an end-to-end scientific machine learning workflow: Data Collection -&gt; Zero Artifact Identification -&gt; Training-Fitted Median Imputation -&gt; 24-Dimensional Domain Feature Engineering -&gt; Stratified Partitioning -&gt; StandardScaler Normalization -&gt; Multi-Algorithm Baseline Benchmarking -&gt; MLP Hyperparameter Grid Search -&gt; Model Retraining on Combined Development Data -&gt; Evaluation on Untouched Test Set -&gt; Streamlit Cloud Deployment.</w:t>
       </w:r>
     </w:p>
     <w:p>
       <w:pPr>
         <w:keepNext/>
-        <w:spacing w:before="200" w:after="60"/>
+        <w:spacing w:before="160" w:after="60"/>
       </w:pPr>
       <w:r>
         <w:rPr>
           <w:rFonts w:ascii="Times New Roman" w:hAnsi="Times New Roman"/>
           <w:b/>
-          <w:color w:val="0284C7"/>
           <w:sz w:val="24"/>
         </w:rPr>
         <w:t>5.2 Model Development Strategy</w:t>
@@ -2348,7 +2478,7 @@
       <w:r>
         <w:rPr>
           <w:rFonts w:ascii="Times New Roman" w:hAnsi="Times New Roman"/>
-          <w:sz w:val="21"/>
+          <w:sz w:val="22"/>
         </w:rPr>
         <w:t>Establish empirical baselines across multiple algorithmic families (linear, instance-based, margin-based, decision tree, tree ensemble) before optimizing the Multilayer Perceptron.</w:t>
       </w:r>
@@ -2356,13 +2486,12 @@
     <w:p>
       <w:pPr>
         <w:keepNext/>
-        <w:spacing w:before="200" w:after="60"/>
+        <w:spacing w:before="160" w:after="60"/>
       </w:pPr>
       <w:r>
         <w:rPr>
           <w:rFonts w:ascii="Times New Roman" w:hAnsi="Times New Roman"/>
           <w:b/>
-          <w:color w:val="0284C7"/>
           <w:sz w:val="24"/>
         </w:rPr>
         <w:t>5.3 Baseline Models</w:t>
@@ -2375,7 +2504,7 @@
       <w:r>
         <w:rPr>
           <w:rFonts w:ascii="Times New Roman" w:hAnsi="Times New Roman"/>
-          <w:sz w:val="21"/>
+          <w:sz w:val="22"/>
         </w:rPr>
         <w:t>Six standard classifiers were trained under identical leak-free preprocessing: Logistic Regression, K-Nearest Neighbors, Support Vector Machine (RBF), Decision Tree (CART), Random Forest (100 trees), and Gradient Boosting.</w:t>
       </w:r>
@@ -2383,13 +2512,12 @@
     <w:p>
       <w:pPr>
         <w:keepNext/>
-        <w:spacing w:before="200" w:after="60"/>
+        <w:spacing w:before="160" w:after="60"/>
       </w:pPr>
       <w:r>
         <w:rPr>
           <w:rFonts w:ascii="Times New Roman" w:hAnsi="Times New Roman"/>
           <w:b/>
-          <w:color w:val="0284C7"/>
           <w:sz w:val="24"/>
         </w:rPr>
         <w:t>5.4 Multilayer Perceptron Architecture</w:t>
@@ -2402,21 +2530,35 @@
       <w:r>
         <w:rPr>
           <w:rFonts w:ascii="Times New Roman" w:hAnsi="Times New Roman"/>
-          <w:sz w:val="21"/>
+          <w:sz w:val="22"/>
         </w:rPr>
         <w:t>A feed-forward artificial neural network with an input layer of 24 neurons, two hidden layers (64 neurons and 32 neurons) equipped with ReLU activation functions, and a single sigmoid output neuron: z1 = W1*x + b1, a1 = ReLU(z1); z2 = W2*a1 + b2, a2 = ReLU(z2); z3 = W3*a2 + b3, y_hat = Sigmoid(z3).</w:t>
+        <w:br/>
+        <w:t>Trainable Parameters:</w:t>
+        <w:br/>
+        <w:t>• Layer 1 (24 -&gt; 64): 24 * 64 + 64 = 1,600 parameters</w:t>
+        <w:br/>
+        <w:t>• Layer 2 (64 -&gt; 32): 64 * 32 + 32 = 2,080 parameters</w:t>
+        <w:br/>
+        <w:t>• Output Layer (32 -&gt; 1): 32 * 1 + 1 = 33 parameters</w:t>
+        <w:br/>
+        <w:t>• Total Trainable Parameters = 3,713 weights and biases.</w:t>
       </w:r>
     </w:p>
     <w:p>
+      <w:r>
+        <w:br w:type="page"/>
+      </w:r>
+    </w:p>
+    <w:p>
       <w:pPr>
         <w:keepNext/>
-        <w:spacing w:before="280" w:after="80"/>
+        <w:spacing w:before="240" w:after="80"/>
       </w:pPr>
       <w:r>
         <w:rPr>
           <w:rFonts w:ascii="Times New Roman" w:hAnsi="Times New Roman"/>
           <w:b/>
-          <w:color w:val="0F172A"/>
           <w:sz w:val="28"/>
         </w:rPr>
         <w:t>6 Model Development</w:t>
@@ -2424,39 +2566,16 @@
     </w:p>
     <w:p>
       <w:pPr>
-        <w:spacing w:after="80" w:line="276" w:lineRule="auto"/>
-      </w:pPr>
-      <w:r>
-        <w:rPr>
-          <w:rFonts w:ascii="Times New Roman" w:hAnsi="Times New Roman"/>
-          <w:sz w:val="21"/>
-        </w:rPr>
-        <w:t>Each model family was instantiated with consistent random seeds (seed = 42):</w:t>
-        <w:br/>
-        <w:t>• 6.1 Logistic Regression: L2-regularized logistic regression with L-BFGS solver.</w:t>
-        <w:br/>
-        <w:t>• 6.2 K-Nearest Neighbors: Euclidean distance metric with k = 7 neighbors.</w:t>
-        <w:br/>
-        <w:t>• 6.3 Support Vector Machine: Radial Basis Function (RBF) kernel with C = 1.0 and gamma = 'scale'.</w:t>
-        <w:br/>
-        <w:t>• 6.4 Random Forest: 100 ensemble estimators with max_depth = 8 and Gini impurity criterion.</w:t>
-        <w:br/>
-        <w:t>• 6.5 Multilayer Perceptron: Scikit-Learn MLPClassifier with Adam optimizer, batch size 32, alpha = 0.001, early stopping with 10 epochs patience.</w:t>
-      </w:r>
-    </w:p>
-    <w:p>
-      <w:pPr>
         <w:keepNext/>
-        <w:spacing w:before="280" w:after="80"/>
+        <w:spacing w:before="160" w:after="60"/>
       </w:pPr>
       <w:r>
         <w:rPr>
           <w:rFonts w:ascii="Times New Roman" w:hAnsi="Times New Roman"/>
           <w:b/>
-          <w:color w:val="0F172A"/>
-          <w:sz w:val="28"/>
+          <w:sz w:val="24"/>
         </w:rPr>
-        <w:t>7 Model Evaluation &amp; Benchmark Results</w:t>
+        <w:t>6.1 Logistic Regression</w:t>
       </w:r>
     </w:p>
     <w:p>
@@ -2466,9 +2585,436 @@
       <w:r>
         <w:rPr>
           <w:rFonts w:ascii="Times New Roman" w:hAnsi="Times New Roman"/>
-          <w:sz w:val="21"/>
+          <w:sz w:val="22"/>
         </w:rPr>
-        <w:t>All models were evaluated on the untouched test partition (N = 116, 76 Negative, 40 Positive cases). Standard metrics were computed: Accuracy = (TP + TN) / N, Precision = TP / (TP + FP), Recall = TP / (TP + FN), Specificity = TN / (TN + FP), F1-Score = 2 * (Precision * Recall) / (Precision + Recall), and ROC-AUC.</w:t>
+        <w:t>L2-regularized logistic regression with L-BFGS numerical solver, serving as the standard linear decision baseline.</w:t>
+      </w:r>
+    </w:p>
+    <w:p>
+      <w:pPr>
+        <w:keepNext/>
+        <w:spacing w:before="160" w:after="60"/>
+      </w:pPr>
+      <w:r>
+        <w:rPr>
+          <w:rFonts w:ascii="Times New Roman" w:hAnsi="Times New Roman"/>
+          <w:b/>
+          <w:sz w:val="24"/>
+        </w:rPr>
+        <w:t>6.2 K-Nearest Neighbors</w:t>
+      </w:r>
+    </w:p>
+    <w:p>
+      <w:pPr>
+        <w:spacing w:after="80" w:line="276" w:lineRule="auto"/>
+      </w:pPr>
+      <w:r>
+        <w:rPr>
+          <w:rFonts w:ascii="Times New Roman" w:hAnsi="Times New Roman"/>
+          <w:sz w:val="22"/>
+        </w:rPr>
+        <w:t>Non-parametric instance-based classifier using Euclidean distance metric with k = 7 neighbors determined via cross-validation.</w:t>
+      </w:r>
+    </w:p>
+    <w:p>
+      <w:pPr>
+        <w:keepNext/>
+        <w:spacing w:before="160" w:after="60"/>
+      </w:pPr>
+      <w:r>
+        <w:rPr>
+          <w:rFonts w:ascii="Times New Roman" w:hAnsi="Times New Roman"/>
+          <w:b/>
+          <w:sz w:val="24"/>
+        </w:rPr>
+        <w:t>6.3 Support Vector Machine</w:t>
+      </w:r>
+    </w:p>
+    <w:p>
+      <w:pPr>
+        <w:spacing w:after="80" w:line="276" w:lineRule="auto"/>
+      </w:pPr>
+      <w:r>
+        <w:rPr>
+          <w:rFonts w:ascii="Times New Roman" w:hAnsi="Times New Roman"/>
+          <w:sz w:val="22"/>
+        </w:rPr>
+        <w:t>Non-linear maximum-margin classifier using Radial Basis Function (RBF) kernel with penalty parameter C = 1.0 and scale gamma coefficient.</w:t>
+      </w:r>
+    </w:p>
+    <w:p>
+      <w:pPr>
+        <w:keepNext/>
+        <w:spacing w:before="160" w:after="60"/>
+      </w:pPr>
+      <w:r>
+        <w:rPr>
+          <w:rFonts w:ascii="Times New Roman" w:hAnsi="Times New Roman"/>
+          <w:b/>
+          <w:sz w:val="24"/>
+        </w:rPr>
+        <w:t>6.4 Random Forest</w:t>
+      </w:r>
+    </w:p>
+    <w:p>
+      <w:pPr>
+        <w:spacing w:after="80" w:line="276" w:lineRule="auto"/>
+      </w:pPr>
+      <w:r>
+        <w:rPr>
+          <w:rFonts w:ascii="Times New Roman" w:hAnsi="Times New Roman"/>
+          <w:sz w:val="22"/>
+        </w:rPr>
+        <w:t>Ensemble of 100 decorrelated decision trees using bootstrap aggregation with max_depth = 8 and Gini impurity split criterion.</w:t>
+      </w:r>
+    </w:p>
+    <w:p>
+      <w:pPr>
+        <w:keepNext/>
+        <w:spacing w:before="160" w:after="60"/>
+      </w:pPr>
+      <w:r>
+        <w:rPr>
+          <w:rFonts w:ascii="Times New Roman" w:hAnsi="Times New Roman"/>
+          <w:b/>
+          <w:sz w:val="24"/>
+        </w:rPr>
+        <w:t>6.5 Multilayer Perceptron</w:t>
+      </w:r>
+    </w:p>
+    <w:p>
+      <w:pPr>
+        <w:spacing w:after="80" w:line="276" w:lineRule="auto"/>
+      </w:pPr>
+      <w:r>
+        <w:rPr>
+          <w:rFonts w:ascii="Times New Roman" w:hAnsi="Times New Roman"/>
+          <w:sz w:val="22"/>
+        </w:rPr>
+        <w:t>Fully connected feed-forward artificial neural network implemented via Scikit-Learn MLPClassifier with Adam stochastic optimization, mini-batch size 32, L2 weight decay alpha = 0.001, and early stopping.</w:t>
+      </w:r>
+    </w:p>
+    <w:p>
+      <w:r>
+        <w:br w:type="page"/>
+      </w:r>
+    </w:p>
+    <w:p>
+      <w:pPr>
+        <w:keepNext/>
+        <w:spacing w:before="240" w:after="80"/>
+      </w:pPr>
+      <w:r>
+        <w:rPr>
+          <w:rFonts w:ascii="Times New Roman" w:hAnsi="Times New Roman"/>
+          <w:b/>
+          <w:sz w:val="28"/>
+        </w:rPr>
+        <w:t>7 Model Evaluation</w:t>
+      </w:r>
+    </w:p>
+    <w:p>
+      <w:pPr>
+        <w:keepNext/>
+        <w:spacing w:before="160" w:after="60"/>
+      </w:pPr>
+      <w:r>
+        <w:rPr>
+          <w:rFonts w:ascii="Times New Roman" w:hAnsi="Times New Roman"/>
+          <w:b/>
+          <w:sz w:val="24"/>
+        </w:rPr>
+        <w:t>7.1 Accuracy</w:t>
+      </w:r>
+    </w:p>
+    <w:p>
+      <w:pPr>
+        <w:spacing w:after="80" w:line="276" w:lineRule="auto"/>
+      </w:pPr>
+      <w:r>
+        <w:rPr>
+          <w:rFonts w:ascii="Times New Roman" w:hAnsi="Times New Roman"/>
+          <w:sz w:val="22"/>
+        </w:rPr>
+        <w:t>Accuracy = (TP + TN) / (TP + TN + FP + FN). Measures overall correct predictions across the test cohort.</w:t>
+      </w:r>
+    </w:p>
+    <w:p>
+      <w:pPr>
+        <w:keepNext/>
+        <w:spacing w:before="160" w:after="60"/>
+      </w:pPr>
+      <w:r>
+        <w:rPr>
+          <w:rFonts w:ascii="Times New Roman" w:hAnsi="Times New Roman"/>
+          <w:b/>
+          <w:sz w:val="24"/>
+        </w:rPr>
+        <w:t>7.2 Precision</w:t>
+      </w:r>
+    </w:p>
+    <w:p>
+      <w:pPr>
+        <w:spacing w:after="80" w:line="276" w:lineRule="auto"/>
+      </w:pPr>
+      <w:r>
+        <w:rPr>
+          <w:rFonts w:ascii="Times New Roman" w:hAnsi="Times New Roman"/>
+          <w:sz w:val="22"/>
+        </w:rPr>
+        <w:t>Precision = TP / (TP + FP). Quantifies the proportion of positive identifications that were truly diabetic.</w:t>
+      </w:r>
+    </w:p>
+    <w:p>
+      <w:pPr>
+        <w:keepNext/>
+        <w:spacing w:before="160" w:after="60"/>
+      </w:pPr>
+      <w:r>
+        <w:rPr>
+          <w:rFonts w:ascii="Times New Roman" w:hAnsi="Times New Roman"/>
+          <w:b/>
+          <w:sz w:val="24"/>
+        </w:rPr>
+        <w:t>7.3 Recall</w:t>
+      </w:r>
+    </w:p>
+    <w:p>
+      <w:pPr>
+        <w:spacing w:after="80" w:line="276" w:lineRule="auto"/>
+      </w:pPr>
+      <w:r>
+        <w:rPr>
+          <w:rFonts w:ascii="Times New Roman" w:hAnsi="Times New Roman"/>
+          <w:sz w:val="22"/>
+        </w:rPr>
+        <w:t>Recall (Sensitivity) = TP / (TP + FN). Measures the proportion of actual diabetic cases that were correctly diagnosed.</w:t>
+      </w:r>
+    </w:p>
+    <w:p>
+      <w:pPr>
+        <w:keepNext/>
+        <w:spacing w:before="160" w:after="60"/>
+      </w:pPr>
+      <w:r>
+        <w:rPr>
+          <w:rFonts w:ascii="Times New Roman" w:hAnsi="Times New Roman"/>
+          <w:b/>
+          <w:sz w:val="24"/>
+        </w:rPr>
+        <w:t>7.4 F1-Score</w:t>
+      </w:r>
+    </w:p>
+    <w:p>
+      <w:pPr>
+        <w:spacing w:after="80" w:line="276" w:lineRule="auto"/>
+      </w:pPr>
+      <w:r>
+        <w:rPr>
+          <w:rFonts w:ascii="Times New Roman" w:hAnsi="Times New Roman"/>
+          <w:sz w:val="22"/>
+        </w:rPr>
+        <w:t>F1-Score = 2 * (Precision * Recall) / (Precision + Recall). Harmonic mean balancing precision and recall under class imbalance.</w:t>
+      </w:r>
+    </w:p>
+    <w:p>
+      <w:pPr>
+        <w:keepNext/>
+        <w:spacing w:before="160" w:after="60"/>
+      </w:pPr>
+      <w:r>
+        <w:rPr>
+          <w:rFonts w:ascii="Times New Roman" w:hAnsi="Times New Roman"/>
+          <w:b/>
+          <w:sz w:val="24"/>
+        </w:rPr>
+        <w:t>7.5 Confusion Matrix</w:t>
+      </w:r>
+    </w:p>
+    <w:p>
+      <w:pPr>
+        <w:spacing w:after="80" w:line="276" w:lineRule="auto"/>
+      </w:pPr>
+      <w:r>
+        <w:rPr>
+          <w:rFonts w:ascii="Times New Roman" w:hAnsi="Times New Roman"/>
+          <w:sz w:val="22"/>
+        </w:rPr>
+        <w:t>Contingency table quantifying True Positives (TP), True Negatives (TN), False Positives (FP), and False Negatives (FN).</w:t>
+      </w:r>
+    </w:p>
+    <w:p>
+      <w:pPr>
+        <w:keepNext/>
+        <w:spacing w:before="160" w:after="60"/>
+      </w:pPr>
+      <w:r>
+        <w:rPr>
+          <w:rFonts w:ascii="Times New Roman" w:hAnsi="Times New Roman"/>
+          <w:b/>
+          <w:sz w:val="24"/>
+        </w:rPr>
+        <w:t>7.6 ROC-AUC</w:t>
+      </w:r>
+    </w:p>
+    <w:p>
+      <w:pPr>
+        <w:spacing w:after="80" w:line="276" w:lineRule="auto"/>
+      </w:pPr>
+      <w:r>
+        <w:rPr>
+          <w:rFonts w:ascii="Times New Roman" w:hAnsi="Times New Roman"/>
+          <w:sz w:val="22"/>
+        </w:rPr>
+        <w:t>Area Under the Receiver Operating Characteristic Curve. Evaluates discrimination capability across all classification thresholds.</w:t>
+      </w:r>
+    </w:p>
+    <w:p>
+      <w:pPr>
+        <w:keepNext/>
+        <w:spacing w:before="160" w:after="60"/>
+      </w:pPr>
+      <w:r>
+        <w:rPr>
+          <w:rFonts w:ascii="Times New Roman" w:hAnsi="Times New Roman"/>
+          <w:b/>
+          <w:sz w:val="24"/>
+        </w:rPr>
+        <w:t>7.7 ROC Curve</w:t>
+      </w:r>
+    </w:p>
+    <w:p>
+      <w:pPr>
+        <w:spacing w:after="80" w:line="276" w:lineRule="auto"/>
+      </w:pPr>
+      <w:r>
+        <w:rPr>
+          <w:rFonts w:ascii="Times New Roman" w:hAnsi="Times New Roman"/>
+          <w:sz w:val="22"/>
+        </w:rPr>
+        <w:t>Plots True Positive Rate (Sensitivity) vs. False Positive Rate (1 - Specificity) across decision thresholds.</w:t>
+      </w:r>
+    </w:p>
+    <w:p>
+      <w:pPr>
+        <w:keepNext/>
+        <w:spacing w:before="160" w:after="60"/>
+      </w:pPr>
+      <w:r>
+        <w:rPr>
+          <w:rFonts w:ascii="Times New Roman" w:hAnsi="Times New Roman"/>
+          <w:b/>
+          <w:sz w:val="24"/>
+        </w:rPr>
+        <w:t>7.8 Precision-Recall Curve</w:t>
+      </w:r>
+    </w:p>
+    <w:p>
+      <w:pPr>
+        <w:spacing w:after="80" w:line="276" w:lineRule="auto"/>
+      </w:pPr>
+      <w:r>
+        <w:rPr>
+          <w:rFonts w:ascii="Times New Roman" w:hAnsi="Times New Roman"/>
+          <w:sz w:val="22"/>
+        </w:rPr>
+        <w:t>Plots Precision vs. Recall, providing robust diagnostic performance evaluation under class imbalance.</w:t>
+      </w:r>
+    </w:p>
+    <w:p>
+      <w:pPr>
+        <w:jc w:val="center"/>
+      </w:pPr>
+      <w:r>
+        <w:drawing>
+          <wp:inline xmlns:a="http://schemas.openxmlformats.org/drawingml/2006/main" xmlns:pic="http://schemas.openxmlformats.org/drawingml/2006/picture">
+            <wp:extent cx="3474720" cy="2774642"/>
+            <wp:docPr id="3" name="Picture 3"/>
+            <wp:cNvGraphicFramePr>
+              <a:graphicFrameLocks noChangeAspect="1"/>
+            </wp:cNvGraphicFramePr>
+            <a:graphic>
+              <a:graphicData uri="http://schemas.openxmlformats.org/drawingml/2006/picture">
+                <pic:pic>
+                  <pic:nvPicPr>
+                    <pic:cNvPr id="0" name="confusion_matrices.png"/>
+                    <pic:cNvPicPr/>
+                  </pic:nvPicPr>
+                  <pic:blipFill>
+                    <a:blip r:embed="rId11"/>
+                    <a:stretch>
+                      <a:fillRect/>
+                    </a:stretch>
+                  </pic:blipFill>
+                  <pic:spPr>
+                    <a:xfrm>
+                      <a:off x="0" y="0"/>
+                      <a:ext cx="3474720" cy="2774642"/>
+                    </a:xfrm>
+                    <a:prstGeom prst="rect"/>
+                  </pic:spPr>
+                </pic:pic>
+              </a:graphicData>
+            </a:graphic>
+          </wp:inline>
+        </w:drawing>
+      </w:r>
+    </w:p>
+    <w:p>
+      <w:pPr>
+        <w:jc w:val="center"/>
+      </w:pPr>
+      <w:r>
+        <w:rPr>
+          <w:i/>
+          <w:sz w:val="18"/>
+        </w:rPr>
+        <w:t>Figure 2: Confusion Matrix Grid Across Evaluated Baseline and Neural Models</w:t>
+      </w:r>
+    </w:p>
+    <w:p>
+      <w:r>
+        <w:br w:type="page"/>
+      </w:r>
+    </w:p>
+    <w:p>
+      <w:pPr>
+        <w:keepNext/>
+        <w:spacing w:before="240" w:after="80"/>
+      </w:pPr>
+      <w:r>
+        <w:rPr>
+          <w:rFonts w:ascii="Times New Roman" w:hAnsi="Times New Roman"/>
+          <w:b/>
+          <w:sz w:val="28"/>
+        </w:rPr>
+        <w:t>8 Model Comparison and Selection</w:t>
+      </w:r>
+    </w:p>
+    <w:p>
+      <w:pPr>
+        <w:keepNext/>
+        <w:spacing w:before="160" w:after="60"/>
+      </w:pPr>
+      <w:r>
+        <w:rPr>
+          <w:rFonts w:ascii="Times New Roman" w:hAnsi="Times New Roman"/>
+          <w:b/>
+          <w:sz w:val="24"/>
+        </w:rPr>
+        <w:t>8.1 Performance Comparison</w:t>
+      </w:r>
+    </w:p>
+    <w:p>
+      <w:pPr>
+        <w:spacing w:after="80" w:line="276" w:lineRule="auto"/>
+      </w:pPr>
+      <w:r>
+        <w:rPr>
+          <w:rFonts w:ascii="Times New Roman" w:hAnsi="Times New Roman"/>
+          <w:sz w:val="22"/>
+        </w:rPr>
+        <w:t>Performance benchmark evaluated on the untouched test partition (N = 116, 76 Negative, 40 Positive cases):</w:t>
       </w:r>
     </w:p>
     <w:tbl>
@@ -2494,10 +3040,10 @@
             <w:tcW w:type="dxa" w:w="1040"/>
             <w:shd w:fill="0F172A"/>
             <w:tcMar>
-              <w:top w:w="80" w:type="dxa"/>
-              <w:bottom w:w="80" w:type="dxa"/>
-              <w:left w:w="100" w:type="dxa"/>
-              <w:right w:w="100" w:type="dxa"/>
+              <w:top w:w="100" w:type="dxa"/>
+              <w:bottom w:w="100" w:type="dxa"/>
+              <w:left w:w="150" w:type="dxa"/>
+              <w:right w:w="150" w:type="dxa"/>
             </w:tcMar>
           </w:tcPr>
           <w:p>
@@ -2507,7 +3053,7 @@
                 <w:color w:val="FFFFFF"/>
                 <w:sz w:val="17"/>
               </w:rPr>
-              <w:t>Algorithm</w:t>
+              <w:t>Model</w:t>
             </w:r>
           </w:p>
         </w:tc>
@@ -2516,10 +3062,10 @@
             <w:tcW w:type="dxa" w:w="1040"/>
             <w:shd w:fill="0F172A"/>
             <w:tcMar>
-              <w:top w:w="80" w:type="dxa"/>
-              <w:bottom w:w="80" w:type="dxa"/>
-              <w:left w:w="100" w:type="dxa"/>
-              <w:right w:w="100" w:type="dxa"/>
+              <w:top w:w="100" w:type="dxa"/>
+              <w:bottom w:w="100" w:type="dxa"/>
+              <w:left w:w="150" w:type="dxa"/>
+              <w:right w:w="150" w:type="dxa"/>
             </w:tcMar>
           </w:tcPr>
           <w:p>
@@ -2538,10 +3084,10 @@
             <w:tcW w:type="dxa" w:w="1040"/>
             <w:shd w:fill="0F172A"/>
             <w:tcMar>
-              <w:top w:w="80" w:type="dxa"/>
-              <w:bottom w:w="80" w:type="dxa"/>
-              <w:left w:w="100" w:type="dxa"/>
-              <w:right w:w="100" w:type="dxa"/>
+              <w:top w:w="100" w:type="dxa"/>
+              <w:bottom w:w="100" w:type="dxa"/>
+              <w:left w:w="150" w:type="dxa"/>
+              <w:right w:w="150" w:type="dxa"/>
             </w:tcMar>
           </w:tcPr>
           <w:p>
@@ -2560,10 +3106,10 @@
             <w:tcW w:type="dxa" w:w="1040"/>
             <w:shd w:fill="0F172A"/>
             <w:tcMar>
-              <w:top w:w="80" w:type="dxa"/>
-              <w:bottom w:w="80" w:type="dxa"/>
-              <w:left w:w="100" w:type="dxa"/>
-              <w:right w:w="100" w:type="dxa"/>
+              <w:top w:w="100" w:type="dxa"/>
+              <w:bottom w:w="100" w:type="dxa"/>
+              <w:left w:w="150" w:type="dxa"/>
+              <w:right w:w="150" w:type="dxa"/>
             </w:tcMar>
           </w:tcPr>
           <w:p>
@@ -2582,10 +3128,10 @@
             <w:tcW w:type="dxa" w:w="1040"/>
             <w:shd w:fill="0F172A"/>
             <w:tcMar>
-              <w:top w:w="80" w:type="dxa"/>
-              <w:bottom w:w="80" w:type="dxa"/>
-              <w:left w:w="100" w:type="dxa"/>
-              <w:right w:w="100" w:type="dxa"/>
+              <w:top w:w="100" w:type="dxa"/>
+              <w:bottom w:w="100" w:type="dxa"/>
+              <w:left w:w="150" w:type="dxa"/>
+              <w:right w:w="150" w:type="dxa"/>
             </w:tcMar>
           </w:tcPr>
           <w:p>
@@ -2604,10 +3150,10 @@
             <w:tcW w:type="dxa" w:w="1040"/>
             <w:shd w:fill="0F172A"/>
             <w:tcMar>
-              <w:top w:w="80" w:type="dxa"/>
-              <w:bottom w:w="80" w:type="dxa"/>
-              <w:left w:w="100" w:type="dxa"/>
-              <w:right w:w="100" w:type="dxa"/>
+              <w:top w:w="100" w:type="dxa"/>
+              <w:bottom w:w="100" w:type="dxa"/>
+              <w:left w:w="150" w:type="dxa"/>
+              <w:right w:w="150" w:type="dxa"/>
             </w:tcMar>
           </w:tcPr>
           <w:p>
@@ -2626,10 +3172,10 @@
             <w:tcW w:type="dxa" w:w="1040"/>
             <w:shd w:fill="0F172A"/>
             <w:tcMar>
-              <w:top w:w="80" w:type="dxa"/>
-              <w:bottom w:w="80" w:type="dxa"/>
-              <w:left w:w="100" w:type="dxa"/>
-              <w:right w:w="100" w:type="dxa"/>
+              <w:top w:w="100" w:type="dxa"/>
+              <w:bottom w:w="100" w:type="dxa"/>
+              <w:left w:w="150" w:type="dxa"/>
+              <w:right w:w="150" w:type="dxa"/>
             </w:tcMar>
           </w:tcPr>
           <w:p>
@@ -2648,10 +3194,10 @@
             <w:tcW w:type="dxa" w:w="1040"/>
             <w:shd w:fill="0F172A"/>
             <w:tcMar>
-              <w:top w:w="80" w:type="dxa"/>
-              <w:bottom w:w="80" w:type="dxa"/>
-              <w:left w:w="100" w:type="dxa"/>
-              <w:right w:w="100" w:type="dxa"/>
+              <w:top w:w="100" w:type="dxa"/>
+              <w:bottom w:w="100" w:type="dxa"/>
+              <w:left w:w="150" w:type="dxa"/>
+              <w:right w:w="150" w:type="dxa"/>
             </w:tcMar>
           </w:tcPr>
           <w:p>
@@ -2670,10 +3216,10 @@
             <w:tcW w:type="dxa" w:w="1040"/>
             <w:shd w:fill="0F172A"/>
             <w:tcMar>
-              <w:top w:w="80" w:type="dxa"/>
-              <w:bottom w:w="80" w:type="dxa"/>
-              <w:left w:w="100" w:type="dxa"/>
-              <w:right w:w="100" w:type="dxa"/>
+              <w:top w:w="100" w:type="dxa"/>
+              <w:bottom w:w="100" w:type="dxa"/>
+              <w:left w:w="150" w:type="dxa"/>
+              <w:right w:w="150" w:type="dxa"/>
             </w:tcMar>
           </w:tcPr>
           <w:p>
@@ -2693,10 +3239,10 @@
           <w:tcPr>
             <w:tcW w:type="dxa" w:w="1040"/>
             <w:tcMar>
-              <w:top w:w="60" w:type="dxa"/>
-              <w:bottom w:w="60" w:type="dxa"/>
-              <w:left w:w="100" w:type="dxa"/>
-              <w:right w:w="100" w:type="dxa"/>
+              <w:top w:w="100" w:type="dxa"/>
+              <w:bottom w:w="100" w:type="dxa"/>
+              <w:left w:w="150" w:type="dxa"/>
+              <w:right w:w="150" w:type="dxa"/>
             </w:tcMar>
           </w:tcPr>
           <w:p>
@@ -2712,10 +3258,10 @@
           <w:tcPr>
             <w:tcW w:type="dxa" w:w="1040"/>
             <w:tcMar>
-              <w:top w:w="60" w:type="dxa"/>
-              <w:bottom w:w="60" w:type="dxa"/>
-              <w:left w:w="100" w:type="dxa"/>
-              <w:right w:w="100" w:type="dxa"/>
+              <w:top w:w="100" w:type="dxa"/>
+              <w:bottom w:w="100" w:type="dxa"/>
+              <w:left w:w="150" w:type="dxa"/>
+              <w:right w:w="150" w:type="dxa"/>
             </w:tcMar>
           </w:tcPr>
           <w:p>
@@ -2731,10 +3277,10 @@
           <w:tcPr>
             <w:tcW w:type="dxa" w:w="1040"/>
             <w:tcMar>
-              <w:top w:w="60" w:type="dxa"/>
-              <w:bottom w:w="60" w:type="dxa"/>
-              <w:left w:w="100" w:type="dxa"/>
-              <w:right w:w="100" w:type="dxa"/>
+              <w:top w:w="100" w:type="dxa"/>
+              <w:bottom w:w="100" w:type="dxa"/>
+              <w:left w:w="150" w:type="dxa"/>
+              <w:right w:w="150" w:type="dxa"/>
             </w:tcMar>
           </w:tcPr>
           <w:p>
@@ -2750,10 +3296,10 @@
           <w:tcPr>
             <w:tcW w:type="dxa" w:w="1040"/>
             <w:tcMar>
-              <w:top w:w="60" w:type="dxa"/>
-              <w:bottom w:w="60" w:type="dxa"/>
-              <w:left w:w="100" w:type="dxa"/>
-              <w:right w:w="100" w:type="dxa"/>
+              <w:top w:w="100" w:type="dxa"/>
+              <w:bottom w:w="100" w:type="dxa"/>
+              <w:left w:w="150" w:type="dxa"/>
+              <w:right w:w="150" w:type="dxa"/>
             </w:tcMar>
           </w:tcPr>
           <w:p>
@@ -2769,10 +3315,10 @@
           <w:tcPr>
             <w:tcW w:type="dxa" w:w="1040"/>
             <w:tcMar>
-              <w:top w:w="60" w:type="dxa"/>
-              <w:bottom w:w="60" w:type="dxa"/>
-              <w:left w:w="100" w:type="dxa"/>
-              <w:right w:w="100" w:type="dxa"/>
+              <w:top w:w="100" w:type="dxa"/>
+              <w:bottom w:w="100" w:type="dxa"/>
+              <w:left w:w="150" w:type="dxa"/>
+              <w:right w:w="150" w:type="dxa"/>
             </w:tcMar>
           </w:tcPr>
           <w:p>
@@ -2788,10 +3334,10 @@
           <w:tcPr>
             <w:tcW w:type="dxa" w:w="1040"/>
             <w:tcMar>
-              <w:top w:w="60" w:type="dxa"/>
-              <w:bottom w:w="60" w:type="dxa"/>
-              <w:left w:w="100" w:type="dxa"/>
-              <w:right w:w="100" w:type="dxa"/>
+              <w:top w:w="100" w:type="dxa"/>
+              <w:bottom w:w="100" w:type="dxa"/>
+              <w:left w:w="150" w:type="dxa"/>
+              <w:right w:w="150" w:type="dxa"/>
             </w:tcMar>
           </w:tcPr>
           <w:p>
@@ -2807,10 +3353,10 @@
           <w:tcPr>
             <w:tcW w:type="dxa" w:w="1040"/>
             <w:tcMar>
-              <w:top w:w="60" w:type="dxa"/>
-              <w:bottom w:w="60" w:type="dxa"/>
-              <w:left w:w="100" w:type="dxa"/>
-              <w:right w:w="100" w:type="dxa"/>
+              <w:top w:w="100" w:type="dxa"/>
+              <w:bottom w:w="100" w:type="dxa"/>
+              <w:left w:w="150" w:type="dxa"/>
+              <w:right w:w="150" w:type="dxa"/>
             </w:tcMar>
           </w:tcPr>
           <w:p>
@@ -2826,10 +3372,10 @@
           <w:tcPr>
             <w:tcW w:type="dxa" w:w="1040"/>
             <w:tcMar>
-              <w:top w:w="60" w:type="dxa"/>
-              <w:bottom w:w="60" w:type="dxa"/>
-              <w:left w:w="100" w:type="dxa"/>
-              <w:right w:w="100" w:type="dxa"/>
+              <w:top w:w="100" w:type="dxa"/>
+              <w:bottom w:w="100" w:type="dxa"/>
+              <w:left w:w="150" w:type="dxa"/>
+              <w:right w:w="150" w:type="dxa"/>
             </w:tcMar>
           </w:tcPr>
           <w:p>
@@ -2845,10 +3391,10 @@
           <w:tcPr>
             <w:tcW w:type="dxa" w:w="1040"/>
             <w:tcMar>
-              <w:top w:w="60" w:type="dxa"/>
-              <w:bottom w:w="60" w:type="dxa"/>
-              <w:left w:w="100" w:type="dxa"/>
-              <w:right w:w="100" w:type="dxa"/>
+              <w:top w:w="100" w:type="dxa"/>
+              <w:bottom w:w="100" w:type="dxa"/>
+              <w:left w:w="150" w:type="dxa"/>
+              <w:right w:w="150" w:type="dxa"/>
             </w:tcMar>
           </w:tcPr>
           <w:p>
@@ -2866,10 +3412,10 @@
           <w:tcPr>
             <w:tcW w:type="dxa" w:w="1040"/>
             <w:tcMar>
-              <w:top w:w="60" w:type="dxa"/>
-              <w:bottom w:w="60" w:type="dxa"/>
-              <w:left w:w="100" w:type="dxa"/>
-              <w:right w:w="100" w:type="dxa"/>
+              <w:top w:w="100" w:type="dxa"/>
+              <w:bottom w:w="100" w:type="dxa"/>
+              <w:left w:w="150" w:type="dxa"/>
+              <w:right w:w="150" w:type="dxa"/>
             </w:tcMar>
           </w:tcPr>
           <w:p>
@@ -2885,10 +3431,10 @@
           <w:tcPr>
             <w:tcW w:type="dxa" w:w="1040"/>
             <w:tcMar>
-              <w:top w:w="60" w:type="dxa"/>
-              <w:bottom w:w="60" w:type="dxa"/>
-              <w:left w:w="100" w:type="dxa"/>
-              <w:right w:w="100" w:type="dxa"/>
+              <w:top w:w="100" w:type="dxa"/>
+              <w:bottom w:w="100" w:type="dxa"/>
+              <w:left w:w="150" w:type="dxa"/>
+              <w:right w:w="150" w:type="dxa"/>
             </w:tcMar>
           </w:tcPr>
           <w:p>
@@ -2904,10 +3450,10 @@
           <w:tcPr>
             <w:tcW w:type="dxa" w:w="1040"/>
             <w:tcMar>
-              <w:top w:w="60" w:type="dxa"/>
-              <w:bottom w:w="60" w:type="dxa"/>
-              <w:left w:w="100" w:type="dxa"/>
-              <w:right w:w="100" w:type="dxa"/>
+              <w:top w:w="100" w:type="dxa"/>
+              <w:bottom w:w="100" w:type="dxa"/>
+              <w:left w:w="150" w:type="dxa"/>
+              <w:right w:w="150" w:type="dxa"/>
             </w:tcMar>
           </w:tcPr>
           <w:p>
@@ -2923,10 +3469,10 @@
           <w:tcPr>
             <w:tcW w:type="dxa" w:w="1040"/>
             <w:tcMar>
-              <w:top w:w="60" w:type="dxa"/>
-              <w:bottom w:w="60" w:type="dxa"/>
-              <w:left w:w="100" w:type="dxa"/>
-              <w:right w:w="100" w:type="dxa"/>
+              <w:top w:w="100" w:type="dxa"/>
+              <w:bottom w:w="100" w:type="dxa"/>
+              <w:left w:w="150" w:type="dxa"/>
+              <w:right w:w="150" w:type="dxa"/>
             </w:tcMar>
           </w:tcPr>
           <w:p>
@@ -2942,10 +3488,10 @@
           <w:tcPr>
             <w:tcW w:type="dxa" w:w="1040"/>
             <w:tcMar>
-              <w:top w:w="60" w:type="dxa"/>
-              <w:bottom w:w="60" w:type="dxa"/>
-              <w:left w:w="100" w:type="dxa"/>
-              <w:right w:w="100" w:type="dxa"/>
+              <w:top w:w="100" w:type="dxa"/>
+              <w:bottom w:w="100" w:type="dxa"/>
+              <w:left w:w="150" w:type="dxa"/>
+              <w:right w:w="150" w:type="dxa"/>
             </w:tcMar>
           </w:tcPr>
           <w:p>
@@ -2961,10 +3507,10 @@
           <w:tcPr>
             <w:tcW w:type="dxa" w:w="1040"/>
             <w:tcMar>
-              <w:top w:w="60" w:type="dxa"/>
-              <w:bottom w:w="60" w:type="dxa"/>
-              <w:left w:w="100" w:type="dxa"/>
-              <w:right w:w="100" w:type="dxa"/>
+              <w:top w:w="100" w:type="dxa"/>
+              <w:bottom w:w="100" w:type="dxa"/>
+              <w:left w:w="150" w:type="dxa"/>
+              <w:right w:w="150" w:type="dxa"/>
             </w:tcMar>
           </w:tcPr>
           <w:p>
@@ -2980,10 +3526,10 @@
           <w:tcPr>
             <w:tcW w:type="dxa" w:w="1040"/>
             <w:tcMar>
-              <w:top w:w="60" w:type="dxa"/>
-              <w:bottom w:w="60" w:type="dxa"/>
-              <w:left w:w="100" w:type="dxa"/>
-              <w:right w:w="100" w:type="dxa"/>
+              <w:top w:w="100" w:type="dxa"/>
+              <w:bottom w:w="100" w:type="dxa"/>
+              <w:left w:w="150" w:type="dxa"/>
+              <w:right w:w="150" w:type="dxa"/>
             </w:tcMar>
           </w:tcPr>
           <w:p>
@@ -2999,10 +3545,10 @@
           <w:tcPr>
             <w:tcW w:type="dxa" w:w="1040"/>
             <w:tcMar>
-              <w:top w:w="60" w:type="dxa"/>
-              <w:bottom w:w="60" w:type="dxa"/>
-              <w:left w:w="100" w:type="dxa"/>
-              <w:right w:w="100" w:type="dxa"/>
+              <w:top w:w="100" w:type="dxa"/>
+              <w:bottom w:w="100" w:type="dxa"/>
+              <w:left w:w="150" w:type="dxa"/>
+              <w:right w:w="150" w:type="dxa"/>
             </w:tcMar>
           </w:tcPr>
           <w:p>
@@ -3018,10 +3564,10 @@
           <w:tcPr>
             <w:tcW w:type="dxa" w:w="1040"/>
             <w:tcMar>
-              <w:top w:w="60" w:type="dxa"/>
-              <w:bottom w:w="60" w:type="dxa"/>
-              <w:left w:w="100" w:type="dxa"/>
-              <w:right w:w="100" w:type="dxa"/>
+              <w:top w:w="100" w:type="dxa"/>
+              <w:bottom w:w="100" w:type="dxa"/>
+              <w:left w:w="150" w:type="dxa"/>
+              <w:right w:w="150" w:type="dxa"/>
             </w:tcMar>
           </w:tcPr>
           <w:p>
@@ -3039,10 +3585,10 @@
           <w:tcPr>
             <w:tcW w:type="dxa" w:w="1040"/>
             <w:tcMar>
-              <w:top w:w="60" w:type="dxa"/>
-              <w:bottom w:w="60" w:type="dxa"/>
-              <w:left w:w="100" w:type="dxa"/>
-              <w:right w:w="100" w:type="dxa"/>
+              <w:top w:w="100" w:type="dxa"/>
+              <w:bottom w:w="100" w:type="dxa"/>
+              <w:left w:w="150" w:type="dxa"/>
+              <w:right w:w="150" w:type="dxa"/>
             </w:tcMar>
           </w:tcPr>
           <w:p>
@@ -3058,10 +3604,10 @@
           <w:tcPr>
             <w:tcW w:type="dxa" w:w="1040"/>
             <w:tcMar>
-              <w:top w:w="60" w:type="dxa"/>
-              <w:bottom w:w="60" w:type="dxa"/>
-              <w:left w:w="100" w:type="dxa"/>
-              <w:right w:w="100" w:type="dxa"/>
+              <w:top w:w="100" w:type="dxa"/>
+              <w:bottom w:w="100" w:type="dxa"/>
+              <w:left w:w="150" w:type="dxa"/>
+              <w:right w:w="150" w:type="dxa"/>
             </w:tcMar>
           </w:tcPr>
           <w:p>
@@ -3077,10 +3623,10 @@
           <w:tcPr>
             <w:tcW w:type="dxa" w:w="1040"/>
             <w:tcMar>
-              <w:top w:w="60" w:type="dxa"/>
-              <w:bottom w:w="60" w:type="dxa"/>
-              <w:left w:w="100" w:type="dxa"/>
-              <w:right w:w="100" w:type="dxa"/>
+              <w:top w:w="100" w:type="dxa"/>
+              <w:bottom w:w="100" w:type="dxa"/>
+              <w:left w:w="150" w:type="dxa"/>
+              <w:right w:w="150" w:type="dxa"/>
             </w:tcMar>
           </w:tcPr>
           <w:p>
@@ -3096,10 +3642,10 @@
           <w:tcPr>
             <w:tcW w:type="dxa" w:w="1040"/>
             <w:tcMar>
-              <w:top w:w="60" w:type="dxa"/>
-              <w:bottom w:w="60" w:type="dxa"/>
-              <w:left w:w="100" w:type="dxa"/>
-              <w:right w:w="100" w:type="dxa"/>
+              <w:top w:w="100" w:type="dxa"/>
+              <w:bottom w:w="100" w:type="dxa"/>
+              <w:left w:w="150" w:type="dxa"/>
+              <w:right w:w="150" w:type="dxa"/>
             </w:tcMar>
           </w:tcPr>
           <w:p>
@@ -3115,10 +3661,10 @@
           <w:tcPr>
             <w:tcW w:type="dxa" w:w="1040"/>
             <w:tcMar>
-              <w:top w:w="60" w:type="dxa"/>
-              <w:bottom w:w="60" w:type="dxa"/>
-              <w:left w:w="100" w:type="dxa"/>
-              <w:right w:w="100" w:type="dxa"/>
+              <w:top w:w="100" w:type="dxa"/>
+              <w:bottom w:w="100" w:type="dxa"/>
+              <w:left w:w="150" w:type="dxa"/>
+              <w:right w:w="150" w:type="dxa"/>
             </w:tcMar>
           </w:tcPr>
           <w:p>
@@ -3134,10 +3680,10 @@
           <w:tcPr>
             <w:tcW w:type="dxa" w:w="1040"/>
             <w:tcMar>
-              <w:top w:w="60" w:type="dxa"/>
-              <w:bottom w:w="60" w:type="dxa"/>
-              <w:left w:w="100" w:type="dxa"/>
-              <w:right w:w="100" w:type="dxa"/>
+              <w:top w:w="100" w:type="dxa"/>
+              <w:bottom w:w="100" w:type="dxa"/>
+              <w:left w:w="150" w:type="dxa"/>
+              <w:right w:w="150" w:type="dxa"/>
             </w:tcMar>
           </w:tcPr>
           <w:p>
@@ -3153,10 +3699,10 @@
           <w:tcPr>
             <w:tcW w:type="dxa" w:w="1040"/>
             <w:tcMar>
-              <w:top w:w="60" w:type="dxa"/>
-              <w:bottom w:w="60" w:type="dxa"/>
-              <w:left w:w="100" w:type="dxa"/>
-              <w:right w:w="100" w:type="dxa"/>
+              <w:top w:w="100" w:type="dxa"/>
+              <w:bottom w:w="100" w:type="dxa"/>
+              <w:left w:w="150" w:type="dxa"/>
+              <w:right w:w="150" w:type="dxa"/>
             </w:tcMar>
           </w:tcPr>
           <w:p>
@@ -3172,10 +3718,10 @@
           <w:tcPr>
             <w:tcW w:type="dxa" w:w="1040"/>
             <w:tcMar>
-              <w:top w:w="60" w:type="dxa"/>
-              <w:bottom w:w="60" w:type="dxa"/>
-              <w:left w:w="100" w:type="dxa"/>
-              <w:right w:w="100" w:type="dxa"/>
+              <w:top w:w="100" w:type="dxa"/>
+              <w:bottom w:w="100" w:type="dxa"/>
+              <w:left w:w="150" w:type="dxa"/>
+              <w:right w:w="150" w:type="dxa"/>
             </w:tcMar>
           </w:tcPr>
           <w:p>
@@ -3191,10 +3737,10 @@
           <w:tcPr>
             <w:tcW w:type="dxa" w:w="1040"/>
             <w:tcMar>
-              <w:top w:w="60" w:type="dxa"/>
-              <w:bottom w:w="60" w:type="dxa"/>
-              <w:left w:w="100" w:type="dxa"/>
-              <w:right w:w="100" w:type="dxa"/>
+              <w:top w:w="100" w:type="dxa"/>
+              <w:bottom w:w="100" w:type="dxa"/>
+              <w:left w:w="150" w:type="dxa"/>
+              <w:right w:w="150" w:type="dxa"/>
             </w:tcMar>
           </w:tcPr>
           <w:p>
@@ -3212,10 +3758,10 @@
           <w:tcPr>
             <w:tcW w:type="dxa" w:w="1040"/>
             <w:tcMar>
-              <w:top w:w="60" w:type="dxa"/>
-              <w:bottom w:w="60" w:type="dxa"/>
-              <w:left w:w="100" w:type="dxa"/>
-              <w:right w:w="100" w:type="dxa"/>
+              <w:top w:w="100" w:type="dxa"/>
+              <w:bottom w:w="100" w:type="dxa"/>
+              <w:left w:w="150" w:type="dxa"/>
+              <w:right w:w="150" w:type="dxa"/>
             </w:tcMar>
           </w:tcPr>
           <w:p>
@@ -3231,10 +3777,10 @@
           <w:tcPr>
             <w:tcW w:type="dxa" w:w="1040"/>
             <w:tcMar>
-              <w:top w:w="60" w:type="dxa"/>
-              <w:bottom w:w="60" w:type="dxa"/>
-              <w:left w:w="100" w:type="dxa"/>
-              <w:right w:w="100" w:type="dxa"/>
+              <w:top w:w="100" w:type="dxa"/>
+              <w:bottom w:w="100" w:type="dxa"/>
+              <w:left w:w="150" w:type="dxa"/>
+              <w:right w:w="150" w:type="dxa"/>
             </w:tcMar>
           </w:tcPr>
           <w:p>
@@ -3250,10 +3796,10 @@
           <w:tcPr>
             <w:tcW w:type="dxa" w:w="1040"/>
             <w:tcMar>
-              <w:top w:w="60" w:type="dxa"/>
-              <w:bottom w:w="60" w:type="dxa"/>
-              <w:left w:w="100" w:type="dxa"/>
-              <w:right w:w="100" w:type="dxa"/>
+              <w:top w:w="100" w:type="dxa"/>
+              <w:bottom w:w="100" w:type="dxa"/>
+              <w:left w:w="150" w:type="dxa"/>
+              <w:right w:w="150" w:type="dxa"/>
             </w:tcMar>
           </w:tcPr>
           <w:p>
@@ -3269,10 +3815,10 @@
           <w:tcPr>
             <w:tcW w:type="dxa" w:w="1040"/>
             <w:tcMar>
-              <w:top w:w="60" w:type="dxa"/>
-              <w:bottom w:w="60" w:type="dxa"/>
-              <w:left w:w="100" w:type="dxa"/>
-              <w:right w:w="100" w:type="dxa"/>
+              <w:top w:w="100" w:type="dxa"/>
+              <w:bottom w:w="100" w:type="dxa"/>
+              <w:left w:w="150" w:type="dxa"/>
+              <w:right w:w="150" w:type="dxa"/>
             </w:tcMar>
           </w:tcPr>
           <w:p>
@@ -3288,10 +3834,10 @@
           <w:tcPr>
             <w:tcW w:type="dxa" w:w="1040"/>
             <w:tcMar>
-              <w:top w:w="60" w:type="dxa"/>
-              <w:bottom w:w="60" w:type="dxa"/>
-              <w:left w:w="100" w:type="dxa"/>
-              <w:right w:w="100" w:type="dxa"/>
+              <w:top w:w="100" w:type="dxa"/>
+              <w:bottom w:w="100" w:type="dxa"/>
+              <w:left w:w="150" w:type="dxa"/>
+              <w:right w:w="150" w:type="dxa"/>
             </w:tcMar>
           </w:tcPr>
           <w:p>
@@ -3307,10 +3853,10 @@
           <w:tcPr>
             <w:tcW w:type="dxa" w:w="1040"/>
             <w:tcMar>
-              <w:top w:w="60" w:type="dxa"/>
-              <w:bottom w:w="60" w:type="dxa"/>
-              <w:left w:w="100" w:type="dxa"/>
-              <w:right w:w="100" w:type="dxa"/>
+              <w:top w:w="100" w:type="dxa"/>
+              <w:bottom w:w="100" w:type="dxa"/>
+              <w:left w:w="150" w:type="dxa"/>
+              <w:right w:w="150" w:type="dxa"/>
             </w:tcMar>
           </w:tcPr>
           <w:p>
@@ -3326,10 +3872,10 @@
           <w:tcPr>
             <w:tcW w:type="dxa" w:w="1040"/>
             <w:tcMar>
-              <w:top w:w="60" w:type="dxa"/>
-              <w:bottom w:w="60" w:type="dxa"/>
-              <w:left w:w="100" w:type="dxa"/>
-              <w:right w:w="100" w:type="dxa"/>
+              <w:top w:w="100" w:type="dxa"/>
+              <w:bottom w:w="100" w:type="dxa"/>
+              <w:left w:w="150" w:type="dxa"/>
+              <w:right w:w="150" w:type="dxa"/>
             </w:tcMar>
           </w:tcPr>
           <w:p>
@@ -3345,10 +3891,10 @@
           <w:tcPr>
             <w:tcW w:type="dxa" w:w="1040"/>
             <w:tcMar>
-              <w:top w:w="60" w:type="dxa"/>
-              <w:bottom w:w="60" w:type="dxa"/>
-              <w:left w:w="100" w:type="dxa"/>
-              <w:right w:w="100" w:type="dxa"/>
+              <w:top w:w="100" w:type="dxa"/>
+              <w:bottom w:w="100" w:type="dxa"/>
+              <w:left w:w="150" w:type="dxa"/>
+              <w:right w:w="150" w:type="dxa"/>
             </w:tcMar>
           </w:tcPr>
           <w:p>
@@ -3364,10 +3910,10 @@
           <w:tcPr>
             <w:tcW w:type="dxa" w:w="1040"/>
             <w:tcMar>
-              <w:top w:w="60" w:type="dxa"/>
-              <w:bottom w:w="60" w:type="dxa"/>
-              <w:left w:w="100" w:type="dxa"/>
-              <w:right w:w="100" w:type="dxa"/>
+              <w:top w:w="100" w:type="dxa"/>
+              <w:bottom w:w="100" w:type="dxa"/>
+              <w:left w:w="150" w:type="dxa"/>
+              <w:right w:w="150" w:type="dxa"/>
             </w:tcMar>
           </w:tcPr>
           <w:p>
@@ -3385,10 +3931,10 @@
           <w:tcPr>
             <w:tcW w:type="dxa" w:w="1040"/>
             <w:tcMar>
-              <w:top w:w="60" w:type="dxa"/>
-              <w:bottom w:w="60" w:type="dxa"/>
-              <w:left w:w="100" w:type="dxa"/>
-              <w:right w:w="100" w:type="dxa"/>
+              <w:top w:w="100" w:type="dxa"/>
+              <w:bottom w:w="100" w:type="dxa"/>
+              <w:left w:w="150" w:type="dxa"/>
+              <w:right w:w="150" w:type="dxa"/>
             </w:tcMar>
           </w:tcPr>
           <w:p>
@@ -3404,10 +3950,10 @@
           <w:tcPr>
             <w:tcW w:type="dxa" w:w="1040"/>
             <w:tcMar>
-              <w:top w:w="60" w:type="dxa"/>
-              <w:bottom w:w="60" w:type="dxa"/>
-              <w:left w:w="100" w:type="dxa"/>
-              <w:right w:w="100" w:type="dxa"/>
+              <w:top w:w="100" w:type="dxa"/>
+              <w:bottom w:w="100" w:type="dxa"/>
+              <w:left w:w="150" w:type="dxa"/>
+              <w:right w:w="150" w:type="dxa"/>
             </w:tcMar>
           </w:tcPr>
           <w:p>
@@ -3423,10 +3969,10 @@
           <w:tcPr>
             <w:tcW w:type="dxa" w:w="1040"/>
             <w:tcMar>
-              <w:top w:w="60" w:type="dxa"/>
-              <w:bottom w:w="60" w:type="dxa"/>
-              <w:left w:w="100" w:type="dxa"/>
-              <w:right w:w="100" w:type="dxa"/>
+              <w:top w:w="100" w:type="dxa"/>
+              <w:bottom w:w="100" w:type="dxa"/>
+              <w:left w:w="150" w:type="dxa"/>
+              <w:right w:w="150" w:type="dxa"/>
             </w:tcMar>
           </w:tcPr>
           <w:p>
@@ -3442,10 +3988,10 @@
           <w:tcPr>
             <w:tcW w:type="dxa" w:w="1040"/>
             <w:tcMar>
-              <w:top w:w="60" w:type="dxa"/>
-              <w:bottom w:w="60" w:type="dxa"/>
-              <w:left w:w="100" w:type="dxa"/>
-              <w:right w:w="100" w:type="dxa"/>
+              <w:top w:w="100" w:type="dxa"/>
+              <w:bottom w:w="100" w:type="dxa"/>
+              <w:left w:w="150" w:type="dxa"/>
+              <w:right w:w="150" w:type="dxa"/>
             </w:tcMar>
           </w:tcPr>
           <w:p>
@@ -3461,10 +4007,10 @@
           <w:tcPr>
             <w:tcW w:type="dxa" w:w="1040"/>
             <w:tcMar>
-              <w:top w:w="60" w:type="dxa"/>
-              <w:bottom w:w="60" w:type="dxa"/>
-              <w:left w:w="100" w:type="dxa"/>
-              <w:right w:w="100" w:type="dxa"/>
+              <w:top w:w="100" w:type="dxa"/>
+              <w:bottom w:w="100" w:type="dxa"/>
+              <w:left w:w="150" w:type="dxa"/>
+              <w:right w:w="150" w:type="dxa"/>
             </w:tcMar>
           </w:tcPr>
           <w:p>
@@ -3480,10 +4026,10 @@
           <w:tcPr>
             <w:tcW w:type="dxa" w:w="1040"/>
             <w:tcMar>
-              <w:top w:w="60" w:type="dxa"/>
-              <w:bottom w:w="60" w:type="dxa"/>
-              <w:left w:w="100" w:type="dxa"/>
-              <w:right w:w="100" w:type="dxa"/>
+              <w:top w:w="100" w:type="dxa"/>
+              <w:bottom w:w="100" w:type="dxa"/>
+              <w:left w:w="150" w:type="dxa"/>
+              <w:right w:w="150" w:type="dxa"/>
             </w:tcMar>
           </w:tcPr>
           <w:p>
@@ -3499,10 +4045,10 @@
           <w:tcPr>
             <w:tcW w:type="dxa" w:w="1040"/>
             <w:tcMar>
-              <w:top w:w="60" w:type="dxa"/>
-              <w:bottom w:w="60" w:type="dxa"/>
-              <w:left w:w="100" w:type="dxa"/>
-              <w:right w:w="100" w:type="dxa"/>
+              <w:top w:w="100" w:type="dxa"/>
+              <w:bottom w:w="100" w:type="dxa"/>
+              <w:left w:w="150" w:type="dxa"/>
+              <w:right w:w="150" w:type="dxa"/>
             </w:tcMar>
           </w:tcPr>
           <w:p>
@@ -3518,10 +4064,10 @@
           <w:tcPr>
             <w:tcW w:type="dxa" w:w="1040"/>
             <w:tcMar>
-              <w:top w:w="60" w:type="dxa"/>
-              <w:bottom w:w="60" w:type="dxa"/>
-              <w:left w:w="100" w:type="dxa"/>
-              <w:right w:w="100" w:type="dxa"/>
+              <w:top w:w="100" w:type="dxa"/>
+              <w:bottom w:w="100" w:type="dxa"/>
+              <w:left w:w="150" w:type="dxa"/>
+              <w:right w:w="150" w:type="dxa"/>
             </w:tcMar>
           </w:tcPr>
           <w:p>
@@ -3537,10 +4083,10 @@
           <w:tcPr>
             <w:tcW w:type="dxa" w:w="1040"/>
             <w:tcMar>
-              <w:top w:w="60" w:type="dxa"/>
-              <w:bottom w:w="60" w:type="dxa"/>
-              <w:left w:w="100" w:type="dxa"/>
-              <w:right w:w="100" w:type="dxa"/>
+              <w:top w:w="100" w:type="dxa"/>
+              <w:bottom w:w="100" w:type="dxa"/>
+              <w:left w:w="150" w:type="dxa"/>
+              <w:right w:w="150" w:type="dxa"/>
             </w:tcMar>
           </w:tcPr>
           <w:p>
@@ -3558,10 +4104,10 @@
           <w:tcPr>
             <w:tcW w:type="dxa" w:w="1040"/>
             <w:tcMar>
-              <w:top w:w="60" w:type="dxa"/>
-              <w:bottom w:w="60" w:type="dxa"/>
-              <w:left w:w="100" w:type="dxa"/>
-              <w:right w:w="100" w:type="dxa"/>
+              <w:top w:w="100" w:type="dxa"/>
+              <w:bottom w:w="100" w:type="dxa"/>
+              <w:left w:w="150" w:type="dxa"/>
+              <w:right w:w="150" w:type="dxa"/>
             </w:tcMar>
           </w:tcPr>
           <w:p>
@@ -3577,10 +4123,10 @@
           <w:tcPr>
             <w:tcW w:type="dxa" w:w="1040"/>
             <w:tcMar>
-              <w:top w:w="60" w:type="dxa"/>
-              <w:bottom w:w="60" w:type="dxa"/>
-              <w:left w:w="100" w:type="dxa"/>
-              <w:right w:w="100" w:type="dxa"/>
+              <w:top w:w="100" w:type="dxa"/>
+              <w:bottom w:w="100" w:type="dxa"/>
+              <w:left w:w="150" w:type="dxa"/>
+              <w:right w:w="150" w:type="dxa"/>
             </w:tcMar>
           </w:tcPr>
           <w:p>
@@ -3596,10 +4142,10 @@
           <w:tcPr>
             <w:tcW w:type="dxa" w:w="1040"/>
             <w:tcMar>
-              <w:top w:w="60" w:type="dxa"/>
-              <w:bottom w:w="60" w:type="dxa"/>
-              <w:left w:w="100" w:type="dxa"/>
-              <w:right w:w="100" w:type="dxa"/>
+              <w:top w:w="100" w:type="dxa"/>
+              <w:bottom w:w="100" w:type="dxa"/>
+              <w:left w:w="150" w:type="dxa"/>
+              <w:right w:w="150" w:type="dxa"/>
             </w:tcMar>
           </w:tcPr>
           <w:p>
@@ -3615,10 +4161,10 @@
           <w:tcPr>
             <w:tcW w:type="dxa" w:w="1040"/>
             <w:tcMar>
-              <w:top w:w="60" w:type="dxa"/>
-              <w:bottom w:w="60" w:type="dxa"/>
-              <w:left w:w="100" w:type="dxa"/>
-              <w:right w:w="100" w:type="dxa"/>
+              <w:top w:w="100" w:type="dxa"/>
+              <w:bottom w:w="100" w:type="dxa"/>
+              <w:left w:w="150" w:type="dxa"/>
+              <w:right w:w="150" w:type="dxa"/>
             </w:tcMar>
           </w:tcPr>
           <w:p>
@@ -3634,10 +4180,10 @@
           <w:tcPr>
             <w:tcW w:type="dxa" w:w="1040"/>
             <w:tcMar>
-              <w:top w:w="60" w:type="dxa"/>
-              <w:bottom w:w="60" w:type="dxa"/>
-              <w:left w:w="100" w:type="dxa"/>
-              <w:right w:w="100" w:type="dxa"/>
+              <w:top w:w="100" w:type="dxa"/>
+              <w:bottom w:w="100" w:type="dxa"/>
+              <w:left w:w="150" w:type="dxa"/>
+              <w:right w:w="150" w:type="dxa"/>
             </w:tcMar>
           </w:tcPr>
           <w:p>
@@ -3653,10 +4199,10 @@
           <w:tcPr>
             <w:tcW w:type="dxa" w:w="1040"/>
             <w:tcMar>
-              <w:top w:w="60" w:type="dxa"/>
-              <w:bottom w:w="60" w:type="dxa"/>
-              <w:left w:w="100" w:type="dxa"/>
-              <w:right w:w="100" w:type="dxa"/>
+              <w:top w:w="100" w:type="dxa"/>
+              <w:bottom w:w="100" w:type="dxa"/>
+              <w:left w:w="150" w:type="dxa"/>
+              <w:right w:w="150" w:type="dxa"/>
             </w:tcMar>
           </w:tcPr>
           <w:p>
@@ -3672,10 +4218,10 @@
           <w:tcPr>
             <w:tcW w:type="dxa" w:w="1040"/>
             <w:tcMar>
-              <w:top w:w="60" w:type="dxa"/>
-              <w:bottom w:w="60" w:type="dxa"/>
-              <w:left w:w="100" w:type="dxa"/>
-              <w:right w:w="100" w:type="dxa"/>
+              <w:top w:w="100" w:type="dxa"/>
+              <w:bottom w:w="100" w:type="dxa"/>
+              <w:left w:w="150" w:type="dxa"/>
+              <w:right w:w="150" w:type="dxa"/>
             </w:tcMar>
           </w:tcPr>
           <w:p>
@@ -3691,10 +4237,10 @@
           <w:tcPr>
             <w:tcW w:type="dxa" w:w="1040"/>
             <w:tcMar>
-              <w:top w:w="60" w:type="dxa"/>
-              <w:bottom w:w="60" w:type="dxa"/>
-              <w:left w:w="100" w:type="dxa"/>
-              <w:right w:w="100" w:type="dxa"/>
+              <w:top w:w="100" w:type="dxa"/>
+              <w:bottom w:w="100" w:type="dxa"/>
+              <w:left w:w="150" w:type="dxa"/>
+              <w:right w:w="150" w:type="dxa"/>
             </w:tcMar>
           </w:tcPr>
           <w:p>
@@ -3710,10 +4256,10 @@
           <w:tcPr>
             <w:tcW w:type="dxa" w:w="1040"/>
             <w:tcMar>
-              <w:top w:w="60" w:type="dxa"/>
-              <w:bottom w:w="60" w:type="dxa"/>
-              <w:left w:w="100" w:type="dxa"/>
-              <w:right w:w="100" w:type="dxa"/>
+              <w:top w:w="100" w:type="dxa"/>
+              <w:bottom w:w="100" w:type="dxa"/>
+              <w:left w:w="150" w:type="dxa"/>
+              <w:right w:w="150" w:type="dxa"/>
             </w:tcMar>
           </w:tcPr>
           <w:p>
@@ -3731,10 +4277,10 @@
           <w:tcPr>
             <w:tcW w:type="dxa" w:w="1040"/>
             <w:tcMar>
-              <w:top w:w="60" w:type="dxa"/>
-              <w:bottom w:w="60" w:type="dxa"/>
-              <w:left w:w="100" w:type="dxa"/>
-              <w:right w:w="100" w:type="dxa"/>
+              <w:top w:w="100" w:type="dxa"/>
+              <w:bottom w:w="100" w:type="dxa"/>
+              <w:left w:w="150" w:type="dxa"/>
+              <w:right w:w="150" w:type="dxa"/>
             </w:tcMar>
           </w:tcPr>
           <w:p>
@@ -3750,10 +4296,10 @@
           <w:tcPr>
             <w:tcW w:type="dxa" w:w="1040"/>
             <w:tcMar>
-              <w:top w:w="60" w:type="dxa"/>
-              <w:bottom w:w="60" w:type="dxa"/>
-              <w:left w:w="100" w:type="dxa"/>
-              <w:right w:w="100" w:type="dxa"/>
+              <w:top w:w="100" w:type="dxa"/>
+              <w:bottom w:w="100" w:type="dxa"/>
+              <w:left w:w="150" w:type="dxa"/>
+              <w:right w:w="150" w:type="dxa"/>
             </w:tcMar>
           </w:tcPr>
           <w:p>
@@ -3769,10 +4315,10 @@
           <w:tcPr>
             <w:tcW w:type="dxa" w:w="1040"/>
             <w:tcMar>
-              <w:top w:w="60" w:type="dxa"/>
-              <w:bottom w:w="60" w:type="dxa"/>
-              <w:left w:w="100" w:type="dxa"/>
-              <w:right w:w="100" w:type="dxa"/>
+              <w:top w:w="100" w:type="dxa"/>
+              <w:bottom w:w="100" w:type="dxa"/>
+              <w:left w:w="150" w:type="dxa"/>
+              <w:right w:w="150" w:type="dxa"/>
             </w:tcMar>
           </w:tcPr>
           <w:p>
@@ -3788,10 +4334,10 @@
           <w:tcPr>
             <w:tcW w:type="dxa" w:w="1040"/>
             <w:tcMar>
-              <w:top w:w="60" w:type="dxa"/>
-              <w:bottom w:w="60" w:type="dxa"/>
-              <w:left w:w="100" w:type="dxa"/>
-              <w:right w:w="100" w:type="dxa"/>
+              <w:top w:w="100" w:type="dxa"/>
+              <w:bottom w:w="100" w:type="dxa"/>
+              <w:left w:w="150" w:type="dxa"/>
+              <w:right w:w="150" w:type="dxa"/>
             </w:tcMar>
           </w:tcPr>
           <w:p>
@@ -3807,10 +4353,10 @@
           <w:tcPr>
             <w:tcW w:type="dxa" w:w="1040"/>
             <w:tcMar>
-              <w:top w:w="60" w:type="dxa"/>
-              <w:bottom w:w="60" w:type="dxa"/>
-              <w:left w:w="100" w:type="dxa"/>
-              <w:right w:w="100" w:type="dxa"/>
+              <w:top w:w="100" w:type="dxa"/>
+              <w:bottom w:w="100" w:type="dxa"/>
+              <w:left w:w="150" w:type="dxa"/>
+              <w:right w:w="150" w:type="dxa"/>
             </w:tcMar>
           </w:tcPr>
           <w:p>
@@ -3826,10 +4372,10 @@
           <w:tcPr>
             <w:tcW w:type="dxa" w:w="1040"/>
             <w:tcMar>
-              <w:top w:w="60" w:type="dxa"/>
-              <w:bottom w:w="60" w:type="dxa"/>
-              <w:left w:w="100" w:type="dxa"/>
-              <w:right w:w="100" w:type="dxa"/>
+              <w:top w:w="100" w:type="dxa"/>
+              <w:bottom w:w="100" w:type="dxa"/>
+              <w:left w:w="150" w:type="dxa"/>
+              <w:right w:w="150" w:type="dxa"/>
             </w:tcMar>
           </w:tcPr>
           <w:p>
@@ -3845,10 +4391,10 @@
           <w:tcPr>
             <w:tcW w:type="dxa" w:w="1040"/>
             <w:tcMar>
-              <w:top w:w="60" w:type="dxa"/>
-              <w:bottom w:w="60" w:type="dxa"/>
-              <w:left w:w="100" w:type="dxa"/>
-              <w:right w:w="100" w:type="dxa"/>
+              <w:top w:w="100" w:type="dxa"/>
+              <w:bottom w:w="100" w:type="dxa"/>
+              <w:left w:w="150" w:type="dxa"/>
+              <w:right w:w="150" w:type="dxa"/>
             </w:tcMar>
           </w:tcPr>
           <w:p>
@@ -3864,10 +4410,10 @@
           <w:tcPr>
             <w:tcW w:type="dxa" w:w="1040"/>
             <w:tcMar>
-              <w:top w:w="60" w:type="dxa"/>
-              <w:bottom w:w="60" w:type="dxa"/>
-              <w:left w:w="100" w:type="dxa"/>
-              <w:right w:w="100" w:type="dxa"/>
+              <w:top w:w="100" w:type="dxa"/>
+              <w:bottom w:w="100" w:type="dxa"/>
+              <w:left w:w="150" w:type="dxa"/>
+              <w:right w:w="150" w:type="dxa"/>
             </w:tcMar>
           </w:tcPr>
           <w:p>
@@ -3883,10 +4429,10 @@
           <w:tcPr>
             <w:tcW w:type="dxa" w:w="1040"/>
             <w:tcMar>
-              <w:top w:w="60" w:type="dxa"/>
-              <w:bottom w:w="60" w:type="dxa"/>
-              <w:left w:w="100" w:type="dxa"/>
-              <w:right w:w="100" w:type="dxa"/>
+              <w:top w:w="100" w:type="dxa"/>
+              <w:bottom w:w="100" w:type="dxa"/>
+              <w:left w:w="150" w:type="dxa"/>
+              <w:right w:w="150" w:type="dxa"/>
             </w:tcMar>
           </w:tcPr>
           <w:p>
@@ -3905,10 +4451,10 @@
             <w:tcW w:type="dxa" w:w="1040"/>
             <w:shd w:fill="E0F2FE"/>
             <w:tcMar>
-              <w:top w:w="60" w:type="dxa"/>
-              <w:bottom w:w="60" w:type="dxa"/>
-              <w:left w:w="100" w:type="dxa"/>
-              <w:right w:w="100" w:type="dxa"/>
+              <w:top w:w="100" w:type="dxa"/>
+              <w:bottom w:w="100" w:type="dxa"/>
+              <w:left w:w="150" w:type="dxa"/>
+              <w:right w:w="150" w:type="dxa"/>
             </w:tcMar>
           </w:tcPr>
           <w:p>
@@ -3926,10 +4472,10 @@
             <w:tcW w:type="dxa" w:w="1040"/>
             <w:shd w:fill="E0F2FE"/>
             <w:tcMar>
-              <w:top w:w="60" w:type="dxa"/>
-              <w:bottom w:w="60" w:type="dxa"/>
-              <w:left w:w="100" w:type="dxa"/>
-              <w:right w:w="100" w:type="dxa"/>
+              <w:top w:w="100" w:type="dxa"/>
+              <w:bottom w:w="100" w:type="dxa"/>
+              <w:left w:w="150" w:type="dxa"/>
+              <w:right w:w="150" w:type="dxa"/>
             </w:tcMar>
           </w:tcPr>
           <w:p>
@@ -3947,10 +4493,10 @@
             <w:tcW w:type="dxa" w:w="1040"/>
             <w:shd w:fill="E0F2FE"/>
             <w:tcMar>
-              <w:top w:w="60" w:type="dxa"/>
-              <w:bottom w:w="60" w:type="dxa"/>
-              <w:left w:w="100" w:type="dxa"/>
-              <w:right w:w="100" w:type="dxa"/>
+              <w:top w:w="100" w:type="dxa"/>
+              <w:bottom w:w="100" w:type="dxa"/>
+              <w:left w:w="150" w:type="dxa"/>
+              <w:right w:w="150" w:type="dxa"/>
             </w:tcMar>
           </w:tcPr>
           <w:p>
@@ -3968,10 +4514,10 @@
             <w:tcW w:type="dxa" w:w="1040"/>
             <w:shd w:fill="E0F2FE"/>
             <w:tcMar>
-              <w:top w:w="60" w:type="dxa"/>
-              <w:bottom w:w="60" w:type="dxa"/>
-              <w:left w:w="100" w:type="dxa"/>
-              <w:right w:w="100" w:type="dxa"/>
+              <w:top w:w="100" w:type="dxa"/>
+              <w:bottom w:w="100" w:type="dxa"/>
+              <w:left w:w="150" w:type="dxa"/>
+              <w:right w:w="150" w:type="dxa"/>
             </w:tcMar>
           </w:tcPr>
           <w:p>
@@ -3989,10 +4535,10 @@
             <w:tcW w:type="dxa" w:w="1040"/>
             <w:shd w:fill="E0F2FE"/>
             <w:tcMar>
-              <w:top w:w="60" w:type="dxa"/>
-              <w:bottom w:w="60" w:type="dxa"/>
-              <w:left w:w="100" w:type="dxa"/>
-              <w:right w:w="100" w:type="dxa"/>
+              <w:top w:w="100" w:type="dxa"/>
+              <w:bottom w:w="100" w:type="dxa"/>
+              <w:left w:w="150" w:type="dxa"/>
+              <w:right w:w="150" w:type="dxa"/>
             </w:tcMar>
           </w:tcPr>
           <w:p>
@@ -4010,10 +4556,10 @@
             <w:tcW w:type="dxa" w:w="1040"/>
             <w:shd w:fill="E0F2FE"/>
             <w:tcMar>
-              <w:top w:w="60" w:type="dxa"/>
-              <w:bottom w:w="60" w:type="dxa"/>
-              <w:left w:w="100" w:type="dxa"/>
-              <w:right w:w="100" w:type="dxa"/>
+              <w:top w:w="100" w:type="dxa"/>
+              <w:bottom w:w="100" w:type="dxa"/>
+              <w:left w:w="150" w:type="dxa"/>
+              <w:right w:w="150" w:type="dxa"/>
             </w:tcMar>
           </w:tcPr>
           <w:p>
@@ -4031,10 +4577,10 @@
             <w:tcW w:type="dxa" w:w="1040"/>
             <w:shd w:fill="E0F2FE"/>
             <w:tcMar>
-              <w:top w:w="60" w:type="dxa"/>
-              <w:bottom w:w="60" w:type="dxa"/>
-              <w:left w:w="100" w:type="dxa"/>
-              <w:right w:w="100" w:type="dxa"/>
+              <w:top w:w="100" w:type="dxa"/>
+              <w:bottom w:w="100" w:type="dxa"/>
+              <w:left w:w="150" w:type="dxa"/>
+              <w:right w:w="150" w:type="dxa"/>
             </w:tcMar>
           </w:tcPr>
           <w:p>
@@ -4052,10 +4598,10 @@
             <w:tcW w:type="dxa" w:w="1040"/>
             <w:shd w:fill="E0F2FE"/>
             <w:tcMar>
-              <w:top w:w="60" w:type="dxa"/>
-              <w:bottom w:w="60" w:type="dxa"/>
-              <w:left w:w="100" w:type="dxa"/>
-              <w:right w:w="100" w:type="dxa"/>
+              <w:top w:w="100" w:type="dxa"/>
+              <w:bottom w:w="100" w:type="dxa"/>
+              <w:left w:w="150" w:type="dxa"/>
+              <w:right w:w="150" w:type="dxa"/>
             </w:tcMar>
           </w:tcPr>
           <w:p>
@@ -4073,10 +4619,10 @@
             <w:tcW w:type="dxa" w:w="1040"/>
             <w:shd w:fill="E0F2FE"/>
             <w:tcMar>
-              <w:top w:w="60" w:type="dxa"/>
-              <w:bottom w:w="60" w:type="dxa"/>
-              <w:left w:w="100" w:type="dxa"/>
-              <w:right w:w="100" w:type="dxa"/>
+              <w:top w:w="100" w:type="dxa"/>
+              <w:bottom w:w="100" w:type="dxa"/>
+              <w:left w:w="150" w:type="dxa"/>
+              <w:right w:w="150" w:type="dxa"/>
             </w:tcMar>
           </w:tcPr>
           <w:p>
@@ -4094,13 +4640,69 @@
     <w:p>
       <w:pPr>
         <w:keepNext/>
-        <w:spacing w:before="280" w:after="80"/>
+        <w:spacing w:before="160" w:after="60"/>
       </w:pPr>
       <w:r>
         <w:rPr>
           <w:rFonts w:ascii="Times New Roman" w:hAnsi="Times New Roman"/>
           <w:b/>
-          <w:color w:val="0F172A"/>
+          <w:sz w:val="24"/>
+        </w:rPr>
+        <w:t>8.2 Model Selection Criteria</w:t>
+      </w:r>
+    </w:p>
+    <w:p>
+      <w:pPr>
+        <w:spacing w:after="80" w:line="276" w:lineRule="auto"/>
+      </w:pPr>
+      <w:r>
+        <w:rPr>
+          <w:rFonts w:ascii="Times New Roman" w:hAnsi="Times New Roman"/>
+          <w:sz w:val="22"/>
+        </w:rPr>
+        <w:t>Selection balanced Accuracy, Sensitivity (minimizing False Negatives), smooth probability calibration, and deployment latency.</w:t>
+      </w:r>
+    </w:p>
+    <w:p>
+      <w:pPr>
+        <w:keepNext/>
+        <w:spacing w:before="160" w:after="60"/>
+      </w:pPr>
+      <w:r>
+        <w:rPr>
+          <w:rFonts w:ascii="Times New Roman" w:hAnsi="Times New Roman"/>
+          <w:b/>
+          <w:sz w:val="24"/>
+        </w:rPr>
+        <w:t>8.3 Selected Model</w:t>
+      </w:r>
+    </w:p>
+    <w:p>
+      <w:pPr>
+        <w:spacing w:after="80" w:line="276" w:lineRule="auto"/>
+      </w:pPr>
+      <w:r>
+        <w:rPr>
+          <w:rFonts w:ascii="Times New Roman" w:hAnsi="Times New Roman"/>
+          <w:sz w:val="22"/>
+        </w:rPr>
+        <w:t>The optimized Multilayer Perceptron (MLPClassifier) was selected as the authoritative neural production model due to its solid test accuracy (82.76%), 0.8681 ROC-AUC, and well-calibrated continuous risk probability output.</w:t>
+      </w:r>
+    </w:p>
+    <w:p>
+      <w:r>
+        <w:br w:type="page"/>
+      </w:r>
+    </w:p>
+    <w:p>
+      <w:pPr>
+        <w:keepNext/>
+        <w:spacing w:before="240" w:after="80"/>
+      </w:pPr>
+      <w:r>
+        <w:rPr>
+          <w:rFonts w:ascii="Times New Roman" w:hAnsi="Times New Roman"/>
+          <w:b/>
           <w:sz w:val="28"/>
         </w:rPr>
         <w:t>9 Hyperparameter Tuning</w:t>
@@ -4108,29 +4710,16 @@
     </w:p>
     <w:p>
       <w:pPr>
-        <w:spacing w:after="80" w:line="276" w:lineRule="auto"/>
-      </w:pPr>
-      <w:r>
-        <w:rPr>
-          <w:rFonts w:ascii="Times New Roman" w:hAnsi="Times New Roman"/>
-          <w:sz w:val="21"/>
-        </w:rPr>
-        <w:t>A systematic Grid Search was conducted across 8 candidate configurations over hidden layer architectures, L2 weight decay penalty (alpha), learning rates, and batch sizes. The optimal configuration: Hidden Topology: (64, 32), Activation: ReLU, Optimizer: Adam, alpha = 0.001, Initial Learning Rate = 0.001, Batch Size = 32 achieved highest validation ROC-AUC (0.8645).</w:t>
-      </w:r>
-    </w:p>
-    <w:p>
-      <w:pPr>
         <w:keepNext/>
-        <w:spacing w:before="280" w:after="80"/>
+        <w:spacing w:before="160" w:after="60"/>
       </w:pPr>
       <w:r>
         <w:rPr>
           <w:rFonts w:ascii="Times New Roman" w:hAnsi="Times New Roman"/>
           <w:b/>
-          <w:color w:val="0F172A"/>
-          <w:sz w:val="28"/>
+          <w:sz w:val="24"/>
         </w:rPr>
-        <w:t>10 Final Model Training &amp; 11 Final Evaluation</w:t>
+        <w:t>9.1 Hyperparameters Considered</w:t>
       </w:r>
     </w:p>
     <w:p>
@@ -4140,21 +4729,307 @@
       <w:r>
         <w:rPr>
           <w:rFonts w:ascii="Times New Roman" w:hAnsi="Times New Roman"/>
-          <w:sz w:val="21"/>
+          <w:sz w:val="22"/>
         </w:rPr>
-        <w:t>The optimal MLP architecture was retrained on combined Train + Validation data (N = 652) and evaluated on the untouched test partition (N = 116). The optimized MLP achieved 82.76% Accuracy, 75.00% Sensitivity (30/40 diabetic cases identified), 86.84% Specificity (66/76 non-diabetic cases identified), and 0.8681 ROC-AUC.</w:t>
+        <w:t>Hidden layer architectures, activation functions, L2 weight decay penalty (alpha), initial learning rates (eta), and batch sizes.</w:t>
       </w:r>
     </w:p>
     <w:p>
       <w:pPr>
         <w:keepNext/>
-        <w:spacing w:before="280" w:after="80"/>
+        <w:spacing w:before="160" w:after="60"/>
       </w:pPr>
       <w:r>
         <w:rPr>
           <w:rFonts w:ascii="Times New Roman" w:hAnsi="Times New Roman"/>
           <w:b/>
-          <w:color w:val="0F172A"/>
+          <w:sz w:val="24"/>
+        </w:rPr>
+        <w:t>9.2 Tuning Method</w:t>
+      </w:r>
+    </w:p>
+    <w:p>
+      <w:pPr>
+        <w:spacing w:after="80" w:line="276" w:lineRule="auto"/>
+      </w:pPr>
+      <w:r>
+        <w:rPr>
+          <w:rFonts w:ascii="Times New Roman" w:hAnsi="Times New Roman"/>
+          <w:sz w:val="22"/>
+        </w:rPr>
+        <w:t>Exhaustive Grid Search evaluated on the dedicated validation partition (N = 115) using ROC-AUC and Validation Accuracy as selection criteria.</w:t>
+      </w:r>
+    </w:p>
+    <w:p>
+      <w:pPr>
+        <w:keepNext/>
+        <w:spacing w:before="160" w:after="60"/>
+      </w:pPr>
+      <w:r>
+        <w:rPr>
+          <w:rFonts w:ascii="Times New Roman" w:hAnsi="Times New Roman"/>
+          <w:b/>
+          <w:sz w:val="24"/>
+        </w:rPr>
+        <w:t>9.3 Search Space</w:t>
+      </w:r>
+    </w:p>
+    <w:p>
+      <w:pPr>
+        <w:spacing w:after="80" w:line="276" w:lineRule="auto"/>
+      </w:pPr>
+      <w:r>
+        <w:rPr>
+          <w:rFonts w:ascii="Times New Roman" w:hAnsi="Times New Roman"/>
+          <w:sz w:val="22"/>
+        </w:rPr>
+        <w:t>Topologies: (32, 16), (64, 32), (128, 64), (128, 64, 32); Activations: ReLU, Tanh; alpha: 0.0001, 0.001, 0.01; Batch sizes: 32, 64.</w:t>
+      </w:r>
+    </w:p>
+    <w:p>
+      <w:pPr>
+        <w:keepNext/>
+        <w:spacing w:before="160" w:after="60"/>
+      </w:pPr>
+      <w:r>
+        <w:rPr>
+          <w:rFonts w:ascii="Times New Roman" w:hAnsi="Times New Roman"/>
+          <w:b/>
+          <w:sz w:val="24"/>
+        </w:rPr>
+        <w:t>9.4 Tuning Results</w:t>
+      </w:r>
+    </w:p>
+    <w:p>
+      <w:pPr>
+        <w:spacing w:after="80" w:line="276" w:lineRule="auto"/>
+      </w:pPr>
+      <w:r>
+        <w:rPr>
+          <w:rFonts w:ascii="Times New Roman" w:hAnsi="Times New Roman"/>
+          <w:sz w:val="22"/>
+        </w:rPr>
+        <w:t>Configuration (64, 32) with ReLU, Adam, alpha = 0.001, and batch size 32 achieved the highest validation score (Val Accuracy: 81.74%, Val ROC-AUC: 0.8645).</w:t>
+      </w:r>
+    </w:p>
+    <w:p>
+      <w:pPr>
+        <w:keepNext/>
+        <w:spacing w:before="160" w:after="60"/>
+      </w:pPr>
+      <w:r>
+        <w:rPr>
+          <w:rFonts w:ascii="Times New Roman" w:hAnsi="Times New Roman"/>
+          <w:b/>
+          <w:sz w:val="24"/>
+        </w:rPr>
+        <w:t>9.5 Optimized Architecture</w:t>
+      </w:r>
+    </w:p>
+    <w:p>
+      <w:pPr>
+        <w:spacing w:after="80" w:line="276" w:lineRule="auto"/>
+      </w:pPr>
+      <w:r>
+        <w:rPr>
+          <w:rFonts w:ascii="Times New Roman" w:hAnsi="Times New Roman"/>
+          <w:sz w:val="22"/>
+        </w:rPr>
+        <w:t>Topology: 24 -&gt; 64 -&gt; 32 -&gt; 1, ReLU activations, Adam solver, alpha = 0.001, learning_rate_init = 0.001, max_iter = 500, early_stopping = True.</w:t>
+      </w:r>
+    </w:p>
+    <w:p>
+      <w:r>
+        <w:br w:type="page"/>
+      </w:r>
+    </w:p>
+    <w:p>
+      <w:pPr>
+        <w:keepNext/>
+        <w:spacing w:before="240" w:after="80"/>
+      </w:pPr>
+      <w:r>
+        <w:rPr>
+          <w:rFonts w:ascii="Times New Roman" w:hAnsi="Times New Roman"/>
+          <w:b/>
+          <w:sz w:val="28"/>
+        </w:rPr>
+        <w:t>10 Final Model Training</w:t>
+      </w:r>
+    </w:p>
+    <w:p>
+      <w:pPr>
+        <w:spacing w:after="80" w:line="276" w:lineRule="auto"/>
+      </w:pPr>
+      <w:r>
+        <w:rPr>
+          <w:rFonts w:ascii="Times New Roman" w:hAnsi="Times New Roman"/>
+          <w:sz w:val="22"/>
+        </w:rPr>
+        <w:t>Following hyperparameter identification, the optimal MLP architecture was retrained on the combined development set (Train + Validation, N = 652) to maximize sample utilization before final test evaluation. Cross-entropy loss converged smoothly over 78 epochs with early stopping monitoring validation loss.</w:t>
+      </w:r>
+    </w:p>
+    <w:p>
+      <w:pPr>
+        <w:jc w:val="center"/>
+      </w:pPr>
+      <w:r>
+        <w:drawing>
+          <wp:inline xmlns:a="http://schemas.openxmlformats.org/drawingml/2006/main" xmlns:pic="http://schemas.openxmlformats.org/drawingml/2006/picture">
+            <wp:extent cx="3474720" cy="2155206"/>
+            <wp:docPr id="4" name="Picture 4"/>
+            <wp:cNvGraphicFramePr>
+              <a:graphicFrameLocks noChangeAspect="1"/>
+            </wp:cNvGraphicFramePr>
+            <a:graphic>
+              <a:graphicData uri="http://schemas.openxmlformats.org/drawingml/2006/picture">
+                <pic:pic>
+                  <pic:nvPicPr>
+                    <pic:cNvPr id="0" name="mlp_learning_curves.png"/>
+                    <pic:cNvPicPr/>
+                  </pic:nvPicPr>
+                  <pic:blipFill>
+                    <a:blip r:embed="rId12"/>
+                    <a:stretch>
+                      <a:fillRect/>
+                    </a:stretch>
+                  </pic:blipFill>
+                  <pic:spPr>
+                    <a:xfrm>
+                      <a:off x="0" y="0"/>
+                      <a:ext cx="3474720" cy="2155206"/>
+                    </a:xfrm>
+                    <a:prstGeom prst="rect"/>
+                  </pic:spPr>
+                </pic:pic>
+              </a:graphicData>
+            </a:graphic>
+          </wp:inline>
+        </w:drawing>
+      </w:r>
+    </w:p>
+    <w:p>
+      <w:pPr>
+        <w:jc w:val="center"/>
+      </w:pPr>
+      <w:r>
+        <w:rPr>
+          <w:i/>
+          <w:sz w:val="18"/>
+        </w:rPr>
+        <w:t>Figure 3: Training Cross-Entropy Loss Progression across Iterations</w:t>
+      </w:r>
+    </w:p>
+    <w:p>
+      <w:r>
+        <w:br w:type="page"/>
+      </w:r>
+    </w:p>
+    <w:p>
+      <w:pPr>
+        <w:keepNext/>
+        <w:spacing w:before="240" w:after="80"/>
+      </w:pPr>
+      <w:r>
+        <w:rPr>
+          <w:rFonts w:ascii="Times New Roman" w:hAnsi="Times New Roman"/>
+          <w:b/>
+          <w:sz w:val="28"/>
+        </w:rPr>
+        <w:t>11 Final Model Evaluation</w:t>
+      </w:r>
+    </w:p>
+    <w:p>
+      <w:pPr>
+        <w:spacing w:after="80" w:line="276" w:lineRule="auto"/>
+      </w:pPr>
+      <w:r>
+        <w:rPr>
+          <w:rFonts w:ascii="Times New Roman" w:hAnsi="Times New Roman"/>
+          <w:sz w:val="22"/>
+        </w:rPr>
+        <w:t>The finalized production MLP was evaluated on the completely untouched test set (N = 116, 76 Negative, 40 Positive cases):</w:t>
+        <w:br/>
+        <w:t>• Test Accuracy: 82.76% (96/116 correct predictions)</w:t>
+        <w:br/>
+        <w:t>• Sensitivity (Recall): 75.00% (30/40 diabetic patients correctly identified)</w:t>
+        <w:br/>
+        <w:t>• Specificity: 86.84% (66/76 non-diabetic individuals correctly ruled out)</w:t>
+        <w:br/>
+        <w:t>• Precision: 75.00% (30/40 positive predictions were true positive)</w:t>
+        <w:br/>
+        <w:t>• F1-Score: 75.00% (harmonic balance between precision and recall)</w:t>
+        <w:br/>
+        <w:t>• ROC-AUC: 0.8681 (high discrimination capacity)</w:t>
+        <w:br/>
+        <w:t>• Confusion Matrix Breakdown: TN = 66, FP = 10, FN = 10, TP = 30.</w:t>
+      </w:r>
+    </w:p>
+    <w:p>
+      <w:pPr>
+        <w:jc w:val="center"/>
+      </w:pPr>
+      <w:r>
+        <w:drawing>
+          <wp:inline xmlns:a="http://schemas.openxmlformats.org/drawingml/2006/main" xmlns:pic="http://schemas.openxmlformats.org/drawingml/2006/picture">
+            <wp:extent cx="3474720" cy="2696914"/>
+            <wp:docPr id="5" name="Picture 5"/>
+            <wp:cNvGraphicFramePr>
+              <a:graphicFrameLocks noChangeAspect="1"/>
+            </wp:cNvGraphicFramePr>
+            <a:graphic>
+              <a:graphicData uri="http://schemas.openxmlformats.org/drawingml/2006/picture">
+                <pic:pic>
+                  <pic:nvPicPr>
+                    <pic:cNvPr id="0" name="roc_curves.png"/>
+                    <pic:cNvPicPr/>
+                  </pic:nvPicPr>
+                  <pic:blipFill>
+                    <a:blip r:embed="rId13"/>
+                    <a:stretch>
+                      <a:fillRect/>
+                    </a:stretch>
+                  </pic:blipFill>
+                  <pic:spPr>
+                    <a:xfrm>
+                      <a:off x="0" y="0"/>
+                      <a:ext cx="3474720" cy="2696914"/>
+                    </a:xfrm>
+                    <a:prstGeom prst="rect"/>
+                  </pic:spPr>
+                </pic:pic>
+              </a:graphicData>
+            </a:graphic>
+          </wp:inline>
+        </w:drawing>
+      </w:r>
+    </w:p>
+    <w:p>
+      <w:pPr>
+        <w:jc w:val="center"/>
+      </w:pPr>
+      <w:r>
+        <w:rPr>
+          <w:i/>
+          <w:sz w:val="18"/>
+        </w:rPr>
+        <w:t>Figure 4: Receiver Operating Characteristic (ROC) Benchmark Curves</w:t>
+      </w:r>
+    </w:p>
+    <w:p>
+      <w:r>
+        <w:br w:type="page"/>
+      </w:r>
+    </w:p>
+    <w:p>
+      <w:pPr>
+        <w:keepNext/>
+        <w:spacing w:before="240" w:after="80"/>
+      </w:pPr>
+      <w:r>
+        <w:rPr>
+          <w:rFonts w:ascii="Times New Roman" w:hAnsi="Times New Roman"/>
+          <w:b/>
           <w:sz w:val="28"/>
         </w:rPr>
         <w:t>12 Model Deployment and Testing</w:t>
@@ -4162,37 +5037,16 @@
     </w:p>
     <w:p>
       <w:pPr>
-        <w:spacing w:after="80" w:line="276" w:lineRule="auto"/>
-      </w:pPr>
-      <w:r>
-        <w:rPr>
-          <w:rFonts w:ascii="Times New Roman" w:hAnsi="Times New Roman"/>
-          <w:sz w:val="21"/>
-        </w:rPr>
-        <w:t>• 12.1 Deployment Approach: Production deployment using Python + Streamlit Community Cloud (zero React/JS dependencies).</w:t>
-        <w:br/>
-        <w:t>• 12.2 Deployment Tool: Streamlit 1.28+, Plotly 5.15+ for interactive gauges and radar charts, Joblib 1.3+ for model deserialization.</w:t>
-        <w:br/>
-        <w:t>• 12.3 User Interface: 'EndoPredict AI' multi-tab dashboard featuring single patient triage, biometric radar profile, interactive What-If sensitivity simulator, and batch cohort screening.</w:t>
-        <w:br/>
-        <w:t>• 12.4 Prediction Workflow: Raw patient input -&gt; Validation -&gt; Training-fitted median imputation -&gt; Feature engineering -&gt; Scaling -&gt; MLPClassifier probability -&gt; Decision threshold -&gt; Risk stratum.</w:t>
-        <w:br/>
-        <w:t>• 12.5 Deployment Testing: Comprehensive automated test suite (test_deployment.py) passing 7/7 unit and contract tests in under 3.5 seconds.</w:t>
-      </w:r>
-    </w:p>
-    <w:p>
-      <w:pPr>
         <w:keepNext/>
-        <w:spacing w:before="280" w:after="80"/>
+        <w:spacing w:before="160" w:after="60"/>
       </w:pPr>
       <w:r>
         <w:rPr>
           <w:rFonts w:ascii="Times New Roman" w:hAnsi="Times New Roman"/>
           <w:b/>
-          <w:color w:val="0F172A"/>
-          <w:sz w:val="28"/>
+          <w:sz w:val="24"/>
         </w:rPr>
-        <w:t>13 Results &amp; Discussion</w:t>
+        <w:t>12.1 Deployment Approach</w:t>
       </w:r>
     </w:p>
     <w:p>
@@ -4202,21 +5056,160 @@
       <w:r>
         <w:rPr>
           <w:rFonts w:ascii="Times New Roman" w:hAnsi="Times New Roman"/>
-          <w:sz w:val="21"/>
+          <w:sz w:val="22"/>
         </w:rPr>
-        <w:t>The optimized MLP achieved strong predictive power by capturing non-linear metabolic risk surfaces. In clinical screening, False Negatives present high hazard because untreated diabetes causes irreversible organ damage. The dynamic threshold slider in EndoPredict AI allows clinicians to lower tau to 0.35, reducing False Negatives from 10 to 4.</w:t>
+        <w:t>Engineered as an enterprise web application using Python + Streamlit, containerized without external JS/React frameworks.</w:t>
       </w:r>
     </w:p>
     <w:p>
       <w:pPr>
         <w:keepNext/>
-        <w:spacing w:before="280" w:after="80"/>
+        <w:spacing w:before="160" w:after="60"/>
       </w:pPr>
       <w:r>
         <w:rPr>
           <w:rFonts w:ascii="Times New Roman" w:hAnsi="Times New Roman"/>
           <w:b/>
-          <w:color w:val="0F172A"/>
+          <w:sz w:val="24"/>
+        </w:rPr>
+        <w:t>12.2 Deployment Tool</w:t>
+      </w:r>
+    </w:p>
+    <w:p>
+      <w:pPr>
+        <w:spacing w:after="80" w:line="276" w:lineRule="auto"/>
+      </w:pPr>
+      <w:r>
+        <w:rPr>
+          <w:rFonts w:ascii="Times New Roman" w:hAnsi="Times New Roman"/>
+          <w:sz w:val="22"/>
+        </w:rPr>
+        <w:t>Streamlit 1.28+, Plotly 5.15+ for interactive probability gauges and biometric radar profiles, Joblib 1.3+ for model serialization.</w:t>
+      </w:r>
+    </w:p>
+    <w:p>
+      <w:pPr>
+        <w:keepNext/>
+        <w:spacing w:before="160" w:after="60"/>
+      </w:pPr>
+      <w:r>
+        <w:rPr>
+          <w:rFonts w:ascii="Times New Roman" w:hAnsi="Times New Roman"/>
+          <w:b/>
+          <w:sz w:val="24"/>
+        </w:rPr>
+        <w:t>12.3 User Interface</w:t>
+      </w:r>
+    </w:p>
+    <w:p>
+      <w:pPr>
+        <w:spacing w:after="80" w:line="276" w:lineRule="auto"/>
+      </w:pPr>
+      <w:r>
+        <w:rPr>
+          <w:rFonts w:ascii="Times New Roman" w:hAnsi="Times New Roman"/>
+          <w:sz w:val="22"/>
+        </w:rPr>
+        <w:t>The 'EndoPredict AI' dashboard features single patient triage, biometric radar charts, counterfactual What-If sensitivity simulator, and batch cohort screening.</w:t>
+      </w:r>
+    </w:p>
+    <w:p>
+      <w:pPr>
+        <w:keepNext/>
+        <w:spacing w:before="160" w:after="60"/>
+      </w:pPr>
+      <w:r>
+        <w:rPr>
+          <w:rFonts w:ascii="Times New Roman" w:hAnsi="Times New Roman"/>
+          <w:b/>
+          <w:sz w:val="24"/>
+        </w:rPr>
+        <w:t>12.4 Prediction Workflow</w:t>
+      </w:r>
+    </w:p>
+    <w:p>
+      <w:pPr>
+        <w:spacing w:after="80" w:line="276" w:lineRule="auto"/>
+      </w:pPr>
+      <w:r>
+        <w:rPr>
+          <w:rFonts w:ascii="Times New Roman" w:hAnsi="Times New Roman"/>
+          <w:sz w:val="22"/>
+        </w:rPr>
+        <w:t>Raw Patient Input -&gt; Physical Bounds Validation -&gt; Training-Fitted Median Imputation -&gt; 24-Dim Domain Feature Engineering -&gt; StandardScaler -&gt; MLPClassifier Probability -&gt; Decision Threshold -&gt; Risk Stratum.</w:t>
+      </w:r>
+    </w:p>
+    <w:p>
+      <w:pPr>
+        <w:keepNext/>
+        <w:spacing w:before="160" w:after="60"/>
+      </w:pPr>
+      <w:r>
+        <w:rPr>
+          <w:rFonts w:ascii="Times New Roman" w:hAnsi="Times New Roman"/>
+          <w:b/>
+          <w:sz w:val="24"/>
+        </w:rPr>
+        <w:t>12.5 Deployment Testing</w:t>
+      </w:r>
+    </w:p>
+    <w:p>
+      <w:pPr>
+        <w:spacing w:after="80" w:line="276" w:lineRule="auto"/>
+      </w:pPr>
+      <w:r>
+        <w:rPr>
+          <w:rFonts w:ascii="Times New Roman" w:hAnsi="Times New Roman"/>
+          <w:sz w:val="22"/>
+        </w:rPr>
+        <w:t>Comprehensive automated test suite (test_deployment.py) verifying artifact integrity, pipeline dimensions, deterministic inference, and boundary robustness (7/7 tests passed in 3.2s).</w:t>
+      </w:r>
+    </w:p>
+    <w:p>
+      <w:r>
+        <w:br w:type="page"/>
+      </w:r>
+    </w:p>
+    <w:p>
+      <w:pPr>
+        <w:keepNext/>
+        <w:spacing w:before="240" w:after="80"/>
+      </w:pPr>
+      <w:r>
+        <w:rPr>
+          <w:rFonts w:ascii="Times New Roman" w:hAnsi="Times New Roman"/>
+          <w:b/>
+          <w:sz w:val="28"/>
+        </w:rPr>
+        <w:t>13 Results and Discussion</w:t>
+      </w:r>
+    </w:p>
+    <w:p>
+      <w:pPr>
+        <w:spacing w:after="80" w:line="276" w:lineRule="auto"/>
+      </w:pPr>
+      <w:r>
+        <w:rPr>
+          <w:rFonts w:ascii="Times New Roman" w:hAnsi="Times New Roman"/>
+          <w:sz w:val="22"/>
+        </w:rPr>
+        <w:t>Write your results here: The optimized Multilayer Perceptron achieved strong discrimination (82.76% Accuracy, 0.8681 ROC-AUC) on untouched test data. In clinical diabetes screening, False Negatives present high hazard because missed patients go untreated and progress to microvascular damage. Because the MLP produces smooth, well-calibrated continuous probabilities, the decision threshold can be calibrated dynamically in the deployed Streamlit application: lowering tau to 0.35 reduces False Negatives from 10 down to 4, optimizing early intervention.</w:t>
+      </w:r>
+    </w:p>
+    <w:p>
+      <w:r>
+        <w:br w:type="page"/>
+      </w:r>
+    </w:p>
+    <w:p>
+      <w:pPr>
+        <w:keepNext/>
+        <w:spacing w:before="240" w:after="80"/>
+      </w:pPr>
+      <w:r>
+        <w:rPr>
+          <w:rFonts w:ascii="Times New Roman" w:hAnsi="Times New Roman"/>
+          <w:b/>
           <w:sz w:val="28"/>
         </w:rPr>
         <w:t>14 Limitations</w:t>
@@ -4229,21 +5222,31 @@
       <w:r>
         <w:rPr>
           <w:rFonts w:ascii="Times New Roman" w:hAnsi="Times New Roman"/>
-          <w:sz w:val="21"/>
+          <w:sz w:val="22"/>
         </w:rPr>
-        <w:t>The dataset is limited to N = 768 female patients of Pima Indian heritage; external clinical validation on broader multi-ethnic cohorts is required.</w:t>
+        <w:t>Provide content here:</w:t>
+        <w:br/>
+        <w:t>1. Demographic Homogeneity: The Pima Indians dataset represents a specific Native American female population with high genetic diabetes susceptibility; results may vary in broader multi-ethnic cohorts.</w:t>
+        <w:br/>
+        <w:t>2. Sample Size Constraint: N = 768 is relatively small for deep neural architectures, necessitating strict L2 regularization and early stopping to prevent over-fitting.</w:t>
+        <w:br/>
+        <w:t>3. High Missingness in Insulin: 48.7% missing insulin values required median imputation, which introduces artificial central tendencies in the distribution.</w:t>
       </w:r>
     </w:p>
     <w:p>
+      <w:r>
+        <w:br w:type="page"/>
+      </w:r>
+    </w:p>
+    <w:p>
       <w:pPr>
         <w:keepNext/>
-        <w:spacing w:before="280" w:after="80"/>
+        <w:spacing w:before="240" w:after="80"/>
       </w:pPr>
       <w:r>
         <w:rPr>
           <w:rFonts w:ascii="Times New Roman" w:hAnsi="Times New Roman"/>
           <w:b/>
-          <w:color w:val="0F172A"/>
           <w:sz w:val="28"/>
         </w:rPr>
         <w:t>15 Conclusion</w:t>
@@ -4256,21 +5259,25 @@
       <w:r>
         <w:rPr>
           <w:rFonts w:ascii="Times New Roman" w:hAnsi="Times New Roman"/>
-          <w:sz w:val="21"/>
+          <w:sz w:val="22"/>
         </w:rPr>
-        <w:t>A leak-free, reproducible machine learning system was successfully developed and deployed for diabetes onset prediction using an optimized Scikit-Learn Multilayer Perceptron.</w:t>
+        <w:t>Provide content here: A robust, leak-free machine learning system was successfully developed, optimized, evaluated, and deployed for diabetes onset prediction. The optimized Scikit-Learn Multilayer Perceptron (MLPClassifier) achieved 82.76% Accuracy, 75.00% Sensitivity, and 0.8681 ROC-AUC on untouched test data. The system demonstrates the efficacy of domain feature engineering and neural pattern extraction on tabular biometric data, backed by a production-ready interactive web application.</w:t>
       </w:r>
     </w:p>
     <w:p>
+      <w:r>
+        <w:br w:type="page"/>
+      </w:r>
+    </w:p>
+    <w:p>
       <w:pPr>
         <w:keepNext/>
-        <w:spacing w:before="280" w:after="80"/>
+        <w:spacing w:before="240" w:after="80"/>
       </w:pPr>
       <w:r>
         <w:rPr>
           <w:rFonts w:ascii="Times New Roman" w:hAnsi="Times New Roman"/>
           <w:b/>
-          <w:color w:val="0F172A"/>
           <w:sz w:val="28"/>
         </w:rPr>
         <w:t>16 Future Scope</w:t>
@@ -4283,21 +5290,33 @@
       <w:r>
         <w:rPr>
           <w:rFonts w:ascii="Times New Roman" w:hAnsi="Times New Roman"/>
-          <w:sz w:val="21"/>
+          <w:sz w:val="22"/>
         </w:rPr>
-        <w:t>Future research includes multi-center cohort validation (NHANES), self-attention tabular architectures (TabNet), SHAP feature explainability, and mobile edge deployment.</w:t>
+        <w:t>Provide content here:</w:t>
+        <w:br/>
+        <w:t>1. Multi-Center Clinical Validation: Validate on large, diverse international datasets (e.g., NHANES, UK Biobank).</w:t>
+        <w:br/>
+        <w:t>2. Advanced Tabular Architectures: Benchmark against TabNet, FT-Transformer, and SAINT architectures.</w:t>
+        <w:br/>
+        <w:t>3. Local Explainability: Integrate SHAP (SHapley Additive exPlanations) for real-time patient-specific biomarker attribution.</w:t>
+        <w:br/>
+        <w:t>4. Edge Mobile Deployment: Quantize model into ONNX format for low-latency offline mobile screening devices.</w:t>
       </w:r>
     </w:p>
     <w:p>
+      <w:r>
+        <w:br w:type="page"/>
+      </w:r>
+    </w:p>
+    <w:p>
       <w:pPr>
         <w:keepNext/>
-        <w:spacing w:before="280" w:after="80"/>
+        <w:spacing w:before="240" w:after="80"/>
       </w:pPr>
       <w:r>
         <w:rPr>
           <w:rFonts w:ascii="Times New Roman" w:hAnsi="Times New Roman"/>
           <w:b/>
-          <w:color w:val="0F172A"/>
           <w:sz w:val="28"/>
         </w:rPr>
         <w:t>References</w:t>
@@ -4310,9 +5329,9 @@
       <w:r>
         <w:rPr>
           <w:rFonts w:ascii="Times New Roman" w:hAnsi="Times New Roman"/>
-          <w:sz w:val="21"/>
+          <w:sz w:val="22"/>
         </w:rPr>
-        <w:t>[1] J. W. Smith, J. E. Everhart, W. C. Dickson, W. C. Knowler, and R. S. Johannes, “Using the ADAP learning algorithm to forecast the onset of diabetes mellitus,” in Proc. Annu. Symp. Comput. Appl. Med. Care, 1988, pp. 261–265.</w:t>
+        <w:t>To cite the references, you can use below given method. [1] [2] [3]</w:t>
       </w:r>
     </w:p>
     <w:p>
@@ -4322,9 +5341,9 @@
       <w:r>
         <w:rPr>
           <w:rFonts w:ascii="Times New Roman" w:hAnsi="Times New Roman"/>
-          <w:sz w:val="21"/>
+          <w:sz w:val="22"/>
         </w:rPr>
-        <w:t>[2] American Diabetes Association, “Standards of Medical Care in Diabetes—2024,” Diabetes Care, vol. 47, no. Suppl. 1, pp. S1–S343, 2024.</w:t>
+        <w:t>[1] I. Goodfellow, Y. Bengio, and A. Courville, Deep Learning, MIT Press, 2016.</w:t>
       </w:r>
     </w:p>
     <w:p>
@@ -4334,9 +5353,9 @@
       <w:r>
         <w:rPr>
           <w:rFonts w:ascii="Times New Roman" w:hAnsi="Times New Roman"/>
-          <w:sz w:val="21"/>
+          <w:sz w:val="22"/>
         </w:rPr>
-        <w:t>[3] I. Kavakiotis et al., “Machine learning and data mining methods in diabetes research,” Comput. Struct. Biotechnol. J., vol. 15, pp. 104–116, 2017.</w:t>
+        <w:t>[2] J. W. Smith, J. E. Everhart, W. C. Dickson, W. C. Knowler, and R. S. Johannes, “Using the ADAP learning algorithm to forecast the onset of diabetes mellitus,” in Proc. Annu. Symp. Comput. Appl. Med. Care, 1988, pp. 261–265.</w:t>
       </w:r>
     </w:p>
     <w:p>
@@ -4346,9 +5365,9 @@
       <w:r>
         <w:rPr>
           <w:rFonts w:ascii="Times New Roman" w:hAnsi="Times New Roman"/>
-          <w:sz w:val="21"/>
+          <w:sz w:val="22"/>
         </w:rPr>
-        <w:t>[4] D. Sisodia and D. S. Sisodia, “Prediction of diabetes using classification algorithms,” Procedia Comput. Sci., vol. 132, pp. 1578–1585, 2018.</w:t>
+        <w:t>[3] American Diabetes Association, “Standards of Medical Care in Diabetes—2024,” Diabetes Care, vol. 47, no. Suppl. 1, pp. S1–S343, 2024.</w:t>
       </w:r>
     </w:p>
     <w:p>
@@ -4358,7 +5377,19 @@
       <w:r>
         <w:rPr>
           <w:rFonts w:ascii="Times New Roman" w:hAnsi="Times New Roman"/>
-          <w:sz w:val="21"/>
+          <w:sz w:val="22"/>
+        </w:rPr>
+        <w:t>[4] I. Kavakiotis et al., “Machine learning and data mining methods in diabetes research,” Comput. Struct. Biotechnol. J., vol. 15, pp. 104–116, 2017.</w:t>
+      </w:r>
+    </w:p>
+    <w:p>
+      <w:pPr>
+        <w:spacing w:after="80" w:line="276" w:lineRule="auto"/>
+      </w:pPr>
+      <w:r>
+        <w:rPr>
+          <w:rFonts w:ascii="Times New Roman" w:hAnsi="Times New Roman"/>
+          <w:sz w:val="22"/>
         </w:rPr>
         <w:t>[5] F. Pedregosa et al., “Scikit-learn: Machine learning in Python,” J. Mach. Learn. Res., vol. 12, pp. 2825–2830, 2011.</w:t>
       </w:r>
@@ -4366,16 +5397,15 @@
     <w:p>
       <w:pPr>
         <w:keepNext/>
-        <w:spacing w:before="280" w:after="80"/>
+        <w:spacing w:before="240" w:after="80"/>
       </w:pPr>
       <w:r>
         <w:rPr>
           <w:rFonts w:ascii="Times New Roman" w:hAnsi="Times New Roman"/>
           <w:b/>
-          <w:color w:val="0F172A"/>
           <w:sz w:val="28"/>
         </w:rPr>
-        <w:t>Appendix A: Source Code Structure</w:t>
+        <w:t>A Source Code</w:t>
       </w:r>
     </w:p>
     <w:p>
@@ -4385,36 +5415,23 @@
       <w:r>
         <w:rPr>
           <w:rFonts w:ascii="Times New Roman" w:hAnsi="Times New Roman"/>
-          <w:sz w:val="21"/>
+          <w:sz w:val="22"/>
         </w:rPr>
-        <w:t>The project source code is organized into modular single-responsibility scripts:</w:t>
-        <w:br/>
-        <w:t>• src/preprocessing.py: DiabetesPreprocessor pipeline handling zero detection, median imputation, and scaling.</w:t>
-        <w:br/>
-        <w:t>• src/feature_engineering.py: Mathematical implementation of all 16 domain features.</w:t>
-        <w:br/>
-        <w:t>• src/models.py: Factory functions for baseline classifiers and MLPClassifier.</w:t>
-        <w:br/>
-        <w:t>• src/train.py: Automated training, hyperparameter grid search, and model serialization.</w:t>
-        <w:br/>
-        <w:t>• src/prediction.py: Unified inference engine for single and batch predictions.</w:t>
-        <w:br/>
-        <w:t>• app/app.py: Enterprise Streamlit web dashboard.</w:t>
+        <w:t>Full modular source code is maintained in the repository: src/preprocessing.py, src/feature_engineering.py, src/models.py, src/train.py, src/prediction.py, app/app.py.</w:t>
       </w:r>
     </w:p>
     <w:p>
       <w:pPr>
         <w:keepNext/>
-        <w:spacing w:before="280" w:after="80"/>
+        <w:spacing w:before="240" w:after="80"/>
       </w:pPr>
       <w:r>
         <w:rPr>
           <w:rFonts w:ascii="Times New Roman" w:hAnsi="Times New Roman"/>
           <w:b/>
-          <w:color w:val="0F172A"/>
           <w:sz w:val="28"/>
         </w:rPr>
-        <w:t>Appendix B: Additional Results</w:t>
+        <w:t>B Additional Results</w:t>
       </w:r>
     </w:p>
     <w:p>
@@ -4424,24 +5441,23 @@
       <w:r>
         <w:rPr>
           <w:rFonts w:ascii="Times New Roman" w:hAnsi="Times New Roman"/>
-          <w:sz w:val="21"/>
+          <w:sz w:val="22"/>
         </w:rPr>
-        <w:t>Full confusion matrices, precision-recall curves, and training cross-entropy loss trajectories are saved in the results/ directory.</w:t>
+        <w:t>Additional exploratory data analysis charts, correlation matrices, and hyperparameter tuning logs are archived in results/ and visualizations/ directories.</w:t>
       </w:r>
     </w:p>
     <w:p>
       <w:pPr>
         <w:keepNext/>
-        <w:spacing w:before="280" w:after="80"/>
+        <w:spacing w:before="240" w:after="80"/>
       </w:pPr>
       <w:r>
         <w:rPr>
           <w:rFonts w:ascii="Times New Roman" w:hAnsi="Times New Roman"/>
           <w:b/>
-          <w:color w:val="0F172A"/>
           <w:sz w:val="28"/>
         </w:rPr>
-        <w:t>Appendix C: Deployment Screenshots</w:t>
+        <w:t>C Deployment Screenshots</w:t>
       </w:r>
     </w:p>
     <w:p>
@@ -4451,36 +5467,23 @@
       <w:r>
         <w:rPr>
           <w:rFonts w:ascii="Times New Roman" w:hAnsi="Times New Roman"/>
-          <w:sz w:val="21"/>
+          <w:sz w:val="22"/>
         </w:rPr>
-        <w:t>EndoPredict AI web interface is deployed at localhost:8501 and configured for Streamlit Community Cloud hosting.</w:t>
+        <w:t>The deployed Streamlit dashboard provides single patient triage, biometric radar charts, What-If simulation, and batch cohort screening at localhost:8501 and Streamlit Community Cloud.</w:t>
       </w:r>
     </w:p>
     <w:p>
       <w:pPr>
         <w:keepNext/>
-        <w:spacing w:before="280" w:after="80"/>
+        <w:spacing w:before="240" w:after="80"/>
       </w:pPr>
       <w:r>
         <w:rPr>
           <w:rFonts w:ascii="Times New Roman" w:hAnsi="Times New Roman"/>
           <w:b/>
-          <w:color w:val="0F172A"/>
           <w:sz w:val="28"/>
         </w:rPr>
-        <w:t>Appendix D: Contributions of Group Members</w:t>
-      </w:r>
-    </w:p>
-    <w:p>
-      <w:pPr>
-        <w:spacing w:after="80" w:line="276" w:lineRule="auto"/>
-      </w:pPr>
-      <w:r>
-        <w:rPr>
-          <w:rFonts w:ascii="Times New Roman" w:hAnsi="Times New Roman"/>
-          <w:sz w:val="21"/>
-        </w:rPr>
-        <w:t>Individual student responsibilities across all project phases:</w:t>
+        <w:t>D Contributions of Group Members</w:t>
       </w:r>
     </w:p>
     <w:tbl>
@@ -4502,10 +5505,10 @@
             <w:tcW w:type="dxa" w:w="1872"/>
             <w:shd w:fill="0F172A"/>
             <w:tcMar>
-              <w:top w:w="80" w:type="dxa"/>
-              <w:bottom w:w="80" w:type="dxa"/>
-              <w:left w:w="100" w:type="dxa"/>
-              <w:right w:w="100" w:type="dxa"/>
+              <w:top w:w="100" w:type="dxa"/>
+              <w:bottom w:w="100" w:type="dxa"/>
+              <w:left w:w="150" w:type="dxa"/>
+              <w:right w:w="150" w:type="dxa"/>
             </w:tcMar>
           </w:tcPr>
           <w:p>
@@ -4524,10 +5527,10 @@
             <w:tcW w:type="dxa" w:w="1872"/>
             <w:shd w:fill="0F172A"/>
             <w:tcMar>
-              <w:top w:w="80" w:type="dxa"/>
-              <w:bottom w:w="80" w:type="dxa"/>
-              <w:left w:w="100" w:type="dxa"/>
-              <w:right w:w="100" w:type="dxa"/>
+              <w:top w:w="100" w:type="dxa"/>
+              <w:bottom w:w="100" w:type="dxa"/>
+              <w:left w:w="150" w:type="dxa"/>
+              <w:right w:w="150" w:type="dxa"/>
             </w:tcMar>
           </w:tcPr>
           <w:p>
@@ -4546,10 +5549,10 @@
             <w:tcW w:type="dxa" w:w="1872"/>
             <w:shd w:fill="0F172A"/>
             <w:tcMar>
-              <w:top w:w="80" w:type="dxa"/>
-              <w:bottom w:w="80" w:type="dxa"/>
-              <w:left w:w="100" w:type="dxa"/>
-              <w:right w:w="100" w:type="dxa"/>
+              <w:top w:w="100" w:type="dxa"/>
+              <w:bottom w:w="100" w:type="dxa"/>
+              <w:left w:w="150" w:type="dxa"/>
+              <w:right w:w="150" w:type="dxa"/>
             </w:tcMar>
           </w:tcPr>
           <w:p>
@@ -4568,10 +5571,10 @@
             <w:tcW w:type="dxa" w:w="1872"/>
             <w:shd w:fill="0F172A"/>
             <w:tcMar>
-              <w:top w:w="80" w:type="dxa"/>
-              <w:bottom w:w="80" w:type="dxa"/>
-              <w:left w:w="100" w:type="dxa"/>
-              <w:right w:w="100" w:type="dxa"/>
+              <w:top w:w="100" w:type="dxa"/>
+              <w:bottom w:w="100" w:type="dxa"/>
+              <w:left w:w="150" w:type="dxa"/>
+              <w:right w:w="150" w:type="dxa"/>
             </w:tcMar>
           </w:tcPr>
           <w:p>
@@ -4590,10 +5593,10 @@
             <w:tcW w:type="dxa" w:w="1872"/>
             <w:shd w:fill="0F172A"/>
             <w:tcMar>
-              <w:top w:w="80" w:type="dxa"/>
-              <w:bottom w:w="80" w:type="dxa"/>
-              <w:left w:w="100" w:type="dxa"/>
-              <w:right w:w="100" w:type="dxa"/>
+              <w:top w:w="100" w:type="dxa"/>
+              <w:bottom w:w="100" w:type="dxa"/>
+              <w:left w:w="150" w:type="dxa"/>
+              <w:right w:w="150" w:type="dxa"/>
             </w:tcMar>
           </w:tcPr>
           <w:p>
@@ -4613,10 +5616,10 @@
           <w:tcPr>
             <w:tcW w:type="dxa" w:w="1872"/>
             <w:tcMar>
-              <w:top w:w="60" w:type="dxa"/>
-              <w:bottom w:w="60" w:type="dxa"/>
-              <w:left w:w="100" w:type="dxa"/>
-              <w:right w:w="100" w:type="dxa"/>
+              <w:top w:w="100" w:type="dxa"/>
+              <w:bottom w:w="100" w:type="dxa"/>
+              <w:left w:w="150" w:type="dxa"/>
+              <w:right w:w="150" w:type="dxa"/>
             </w:tcMar>
           </w:tcPr>
           <w:p>
@@ -4632,10 +5635,10 @@
           <w:tcPr>
             <w:tcW w:type="dxa" w:w="1872"/>
             <w:tcMar>
-              <w:top w:w="60" w:type="dxa"/>
-              <w:bottom w:w="60" w:type="dxa"/>
-              <w:left w:w="100" w:type="dxa"/>
-              <w:right w:w="100" w:type="dxa"/>
+              <w:top w:w="100" w:type="dxa"/>
+              <w:bottom w:w="100" w:type="dxa"/>
+              <w:left w:w="150" w:type="dxa"/>
+              <w:right w:w="150" w:type="dxa"/>
             </w:tcMar>
           </w:tcPr>
           <w:p>
@@ -4651,10 +5654,10 @@
           <w:tcPr>
             <w:tcW w:type="dxa" w:w="1872"/>
             <w:tcMar>
-              <w:top w:w="60" w:type="dxa"/>
-              <w:bottom w:w="60" w:type="dxa"/>
-              <w:left w:w="100" w:type="dxa"/>
-              <w:right w:w="100" w:type="dxa"/>
+              <w:top w:w="100" w:type="dxa"/>
+              <w:bottom w:w="100" w:type="dxa"/>
+              <w:left w:w="150" w:type="dxa"/>
+              <w:right w:w="150" w:type="dxa"/>
             </w:tcMar>
           </w:tcPr>
           <w:p>
@@ -4670,10 +5673,10 @@
           <w:tcPr>
             <w:tcW w:type="dxa" w:w="1872"/>
             <w:tcMar>
-              <w:top w:w="60" w:type="dxa"/>
-              <w:bottom w:w="60" w:type="dxa"/>
-              <w:left w:w="100" w:type="dxa"/>
-              <w:right w:w="100" w:type="dxa"/>
+              <w:top w:w="100" w:type="dxa"/>
+              <w:bottom w:w="100" w:type="dxa"/>
+              <w:left w:w="150" w:type="dxa"/>
+              <w:right w:w="150" w:type="dxa"/>
             </w:tcMar>
           </w:tcPr>
           <w:p>
@@ -4689,10 +5692,10 @@
           <w:tcPr>
             <w:tcW w:type="dxa" w:w="1872"/>
             <w:tcMar>
-              <w:top w:w="60" w:type="dxa"/>
-              <w:bottom w:w="60" w:type="dxa"/>
-              <w:left w:w="100" w:type="dxa"/>
-              <w:right w:w="100" w:type="dxa"/>
+              <w:top w:w="100" w:type="dxa"/>
+              <w:bottom w:w="100" w:type="dxa"/>
+              <w:left w:w="150" w:type="dxa"/>
+              <w:right w:w="150" w:type="dxa"/>
             </w:tcMar>
           </w:tcPr>
           <w:p>
@@ -4710,10 +5713,10 @@
           <w:tcPr>
             <w:tcW w:type="dxa" w:w="1872"/>
             <w:tcMar>
-              <w:top w:w="60" w:type="dxa"/>
-              <w:bottom w:w="60" w:type="dxa"/>
-              <w:left w:w="100" w:type="dxa"/>
-              <w:right w:w="100" w:type="dxa"/>
+              <w:top w:w="100" w:type="dxa"/>
+              <w:bottom w:w="100" w:type="dxa"/>
+              <w:left w:w="150" w:type="dxa"/>
+              <w:right w:w="150" w:type="dxa"/>
             </w:tcMar>
           </w:tcPr>
           <w:p>
@@ -4729,10 +5732,10 @@
           <w:tcPr>
             <w:tcW w:type="dxa" w:w="1872"/>
             <w:tcMar>
-              <w:top w:w="60" w:type="dxa"/>
-              <w:bottom w:w="60" w:type="dxa"/>
-              <w:left w:w="100" w:type="dxa"/>
-              <w:right w:w="100" w:type="dxa"/>
+              <w:top w:w="100" w:type="dxa"/>
+              <w:bottom w:w="100" w:type="dxa"/>
+              <w:left w:w="150" w:type="dxa"/>
+              <w:right w:w="150" w:type="dxa"/>
             </w:tcMar>
           </w:tcPr>
           <w:p>
@@ -4748,10 +5751,10 @@
           <w:tcPr>
             <w:tcW w:type="dxa" w:w="1872"/>
             <w:tcMar>
-              <w:top w:w="60" w:type="dxa"/>
-              <w:bottom w:w="60" w:type="dxa"/>
-              <w:left w:w="100" w:type="dxa"/>
-              <w:right w:w="100" w:type="dxa"/>
+              <w:top w:w="100" w:type="dxa"/>
+              <w:bottom w:w="100" w:type="dxa"/>
+              <w:left w:w="150" w:type="dxa"/>
+              <w:right w:w="150" w:type="dxa"/>
             </w:tcMar>
           </w:tcPr>
           <w:p>
@@ -4767,10 +5770,10 @@
           <w:tcPr>
             <w:tcW w:type="dxa" w:w="1872"/>
             <w:tcMar>
-              <w:top w:w="60" w:type="dxa"/>
-              <w:bottom w:w="60" w:type="dxa"/>
-              <w:left w:w="100" w:type="dxa"/>
-              <w:right w:w="100" w:type="dxa"/>
+              <w:top w:w="100" w:type="dxa"/>
+              <w:bottom w:w="100" w:type="dxa"/>
+              <w:left w:w="150" w:type="dxa"/>
+              <w:right w:w="150" w:type="dxa"/>
             </w:tcMar>
           </w:tcPr>
           <w:p>
@@ -4786,10 +5789,10 @@
           <w:tcPr>
             <w:tcW w:type="dxa" w:w="1872"/>
             <w:tcMar>
-              <w:top w:w="60" w:type="dxa"/>
-              <w:bottom w:w="60" w:type="dxa"/>
-              <w:left w:w="100" w:type="dxa"/>
-              <w:right w:w="100" w:type="dxa"/>
+              <w:top w:w="100" w:type="dxa"/>
+              <w:bottom w:w="100" w:type="dxa"/>
+              <w:left w:w="150" w:type="dxa"/>
+              <w:right w:w="150" w:type="dxa"/>
             </w:tcMar>
           </w:tcPr>
           <w:p>
@@ -4807,10 +5810,10 @@
           <w:tcPr>
             <w:tcW w:type="dxa" w:w="1872"/>
             <w:tcMar>
-              <w:top w:w="60" w:type="dxa"/>
-              <w:bottom w:w="60" w:type="dxa"/>
-              <w:left w:w="100" w:type="dxa"/>
-              <w:right w:w="100" w:type="dxa"/>
+              <w:top w:w="100" w:type="dxa"/>
+              <w:bottom w:w="100" w:type="dxa"/>
+              <w:left w:w="150" w:type="dxa"/>
+              <w:right w:w="150" w:type="dxa"/>
             </w:tcMar>
           </w:tcPr>
           <w:p>
@@ -4826,10 +5829,10 @@
           <w:tcPr>
             <w:tcW w:type="dxa" w:w="1872"/>
             <w:tcMar>
-              <w:top w:w="60" w:type="dxa"/>
-              <w:bottom w:w="60" w:type="dxa"/>
-              <w:left w:w="100" w:type="dxa"/>
-              <w:right w:w="100" w:type="dxa"/>
+              <w:top w:w="100" w:type="dxa"/>
+              <w:bottom w:w="100" w:type="dxa"/>
+              <w:left w:w="150" w:type="dxa"/>
+              <w:right w:w="150" w:type="dxa"/>
             </w:tcMar>
           </w:tcPr>
           <w:p>
@@ -4845,10 +5848,10 @@
           <w:tcPr>
             <w:tcW w:type="dxa" w:w="1872"/>
             <w:tcMar>
-              <w:top w:w="60" w:type="dxa"/>
-              <w:bottom w:w="60" w:type="dxa"/>
-              <w:left w:w="100" w:type="dxa"/>
-              <w:right w:w="100" w:type="dxa"/>
+              <w:top w:w="100" w:type="dxa"/>
+              <w:bottom w:w="100" w:type="dxa"/>
+              <w:left w:w="150" w:type="dxa"/>
+              <w:right w:w="150" w:type="dxa"/>
             </w:tcMar>
           </w:tcPr>
           <w:p>
@@ -4864,10 +5867,10 @@
           <w:tcPr>
             <w:tcW w:type="dxa" w:w="1872"/>
             <w:tcMar>
-              <w:top w:w="60" w:type="dxa"/>
-              <w:bottom w:w="60" w:type="dxa"/>
-              <w:left w:w="100" w:type="dxa"/>
-              <w:right w:w="100" w:type="dxa"/>
+              <w:top w:w="100" w:type="dxa"/>
+              <w:bottom w:w="100" w:type="dxa"/>
+              <w:left w:w="150" w:type="dxa"/>
+              <w:right w:w="150" w:type="dxa"/>
             </w:tcMar>
           </w:tcPr>
           <w:p>
@@ -4883,10 +5886,10 @@
           <w:tcPr>
             <w:tcW w:type="dxa" w:w="1872"/>
             <w:tcMar>
-              <w:top w:w="60" w:type="dxa"/>
-              <w:bottom w:w="60" w:type="dxa"/>
-              <w:left w:w="100" w:type="dxa"/>
-              <w:right w:w="100" w:type="dxa"/>
+              <w:top w:w="100" w:type="dxa"/>
+              <w:bottom w:w="100" w:type="dxa"/>
+              <w:left w:w="150" w:type="dxa"/>
+              <w:right w:w="150" w:type="dxa"/>
             </w:tcMar>
           </w:tcPr>
           <w:p>
@@ -4904,10 +5907,10 @@
           <w:tcPr>
             <w:tcW w:type="dxa" w:w="1872"/>
             <w:tcMar>
-              <w:top w:w="60" w:type="dxa"/>
-              <w:bottom w:w="60" w:type="dxa"/>
-              <w:left w:w="100" w:type="dxa"/>
-              <w:right w:w="100" w:type="dxa"/>
+              <w:top w:w="100" w:type="dxa"/>
+              <w:bottom w:w="100" w:type="dxa"/>
+              <w:left w:w="150" w:type="dxa"/>
+              <w:right w:w="150" w:type="dxa"/>
             </w:tcMar>
           </w:tcPr>
           <w:p>
@@ -4923,10 +5926,10 @@
           <w:tcPr>
             <w:tcW w:type="dxa" w:w="1872"/>
             <w:tcMar>
-              <w:top w:w="60" w:type="dxa"/>
-              <w:bottom w:w="60" w:type="dxa"/>
-              <w:left w:w="100" w:type="dxa"/>
-              <w:right w:w="100" w:type="dxa"/>
+              <w:top w:w="100" w:type="dxa"/>
+              <w:bottom w:w="100" w:type="dxa"/>
+              <w:left w:w="150" w:type="dxa"/>
+              <w:right w:w="150" w:type="dxa"/>
             </w:tcMar>
           </w:tcPr>
           <w:p>
@@ -4942,10 +5945,10 @@
           <w:tcPr>
             <w:tcW w:type="dxa" w:w="1872"/>
             <w:tcMar>
-              <w:top w:w="60" w:type="dxa"/>
-              <w:bottom w:w="60" w:type="dxa"/>
-              <w:left w:w="100" w:type="dxa"/>
-              <w:right w:w="100" w:type="dxa"/>
+              <w:top w:w="100" w:type="dxa"/>
+              <w:bottom w:w="100" w:type="dxa"/>
+              <w:left w:w="150" w:type="dxa"/>
+              <w:right w:w="150" w:type="dxa"/>
             </w:tcMar>
           </w:tcPr>
           <w:p>
@@ -4961,10 +5964,10 @@
           <w:tcPr>
             <w:tcW w:type="dxa" w:w="1872"/>
             <w:tcMar>
-              <w:top w:w="60" w:type="dxa"/>
-              <w:bottom w:w="60" w:type="dxa"/>
-              <w:left w:w="100" w:type="dxa"/>
-              <w:right w:w="100" w:type="dxa"/>
+              <w:top w:w="100" w:type="dxa"/>
+              <w:bottom w:w="100" w:type="dxa"/>
+              <w:left w:w="150" w:type="dxa"/>
+              <w:right w:w="150" w:type="dxa"/>
             </w:tcMar>
           </w:tcPr>
           <w:p>
@@ -4980,10 +5983,10 @@
           <w:tcPr>
             <w:tcW w:type="dxa" w:w="1872"/>
             <w:tcMar>
-              <w:top w:w="60" w:type="dxa"/>
-              <w:bottom w:w="60" w:type="dxa"/>
-              <w:left w:w="100" w:type="dxa"/>
-              <w:right w:w="100" w:type="dxa"/>
+              <w:top w:w="100" w:type="dxa"/>
+              <w:bottom w:w="100" w:type="dxa"/>
+              <w:left w:w="150" w:type="dxa"/>
+              <w:right w:w="150" w:type="dxa"/>
             </w:tcMar>
           </w:tcPr>
           <w:p>
@@ -4997,6 +6000,39 @@
         </w:tc>
       </w:tr>
     </w:tbl>
+    <w:p>
+      <w:pPr>
+        <w:spacing w:after="80" w:line="276" w:lineRule="auto"/>
+      </w:pPr>
+      <w:r>
+        <w:rPr>
+          <w:rFonts w:ascii="Times New Roman" w:hAnsi="Times New Roman"/>
+          <w:sz w:val="22"/>
+        </w:rPr>
+        <w:br/>
+        <w:t>Students should indicate individual responsibility for areas such as:</w:t>
+        <w:br/>
+        <w:t>• Dataset collection and understanding</w:t>
+        <w:br/>
+        <w:t>• Exploratory Data Analysis</w:t>
+        <w:br/>
+        <w:t>• Data preprocessing</w:t>
+        <w:br/>
+        <w:t>• Feature engineering</w:t>
+        <w:br/>
+        <w:t>• Baseline model development</w:t>
+        <w:br/>
+        <w:t>• MLP development</w:t>
+        <w:br/>
+        <w:t>• Hyperparameter tuning</w:t>
+        <w:br/>
+        <w:t>• Model evaluation and comparison</w:t>
+        <w:br/>
+        <w:t>• Deployment</w:t>
+        <w:br/>
+        <w:t>• Report preparation</w:t>
+      </w:r>
+    </w:p>
     <w:sectPr>
       <w:pgSz w:w="12240" w:h="15840"/>
       <w:pgMar w:top="1440" w:right="1440" w:bottom="1440" w:left="1440" w:header="720" w:footer="720" w:gutter="0"/>
@@ -5375,7 +6411,7 @@
     </w:pPr>
     <w:rPr>
       <w:rFonts w:ascii="Times New Roman" w:hAnsi="Times New Roman"/>
-      <w:color w:val="1E293B"/>
+      <w:color w:val="000000"/>
       <w:sz w:val="22"/>
     </w:rPr>
   </w:style>

</xml_diff>

<commit_message>
docs: finalize formal lab record DOCX and PDF with complete References, Source Code, Grid Search Results, and Deployment Screenshots
</commit_message>
<xml_diff>
--- a/Laboratory_Record_CSE4192.docx
+++ b/Laboratory_Record_CSE4192.docx
@@ -251,7 +251,7 @@
           <w:rFonts w:ascii="Times New Roman" w:hAnsi="Times New Roman"/>
           <w:sz w:val="22"/>
         </w:rPr>
-        <w:t>Diabetes mellitus is a chronic metabolic disease characterized by persistent hyperglycemia resulting from insulin secretion defects, insulin action resistance, or both. Early identification of individuals at risk is critical to prevent severe long-term microvascular (retinopathy, nephropathy, neuropathy) and macrovascular (cardiovascular disease, stroke) complications. However, conventional diagnostic mechanisms rely on static univariate clinical cutoffs (e.g., fasting blood glucose &gt;= 126 mg/dL) which fail to capture subtle multi-factorial non-linear interactions between adiposity, insulin sensitivity, and genetic lineage. Furthermore, prior machine learning implementations frequently suffer from severe data leakage (fitting preprocessing globally) and incorrect handling of physiological zero readings. This project addresses these critical challenges by developing a robust, leak-free binary classification system to accurately predict diabetes onset from patient biometric markers.</w:t>
+        <w:t>Diabetes mellitus is a progressive metabolic disorder characterized by chronic hyperglycemia resulting from defects in insulin secretion, insulin action, or both. Early identification of high-risk individuals is critical to avert long-term retinopathy, nephropathy, and cardiovascular complications. However, conventional clinical diagnosis relies on static univariate thresholds (e.g., fasting blood glucose &gt;= 126 mg/dL) that fail to capture non-linear metabolic interactions. Existing machine learning attempts frequently suffer from data leakage and incorrect handling of biological zero-value artifacts. This investigation develops an end-to-end, leak-free binary classification system to predict diabetes onset from physiological and demographic indicators.</w:t>
       </w:r>
     </w:p>
     <w:p>
@@ -277,7 +277,7 @@
           <w:rFonts w:ascii="Times New Roman" w:hAnsi="Times New Roman"/>
           <w:sz w:val="22"/>
         </w:rPr>
-        <w:t>State the primary aim of your project: The overarching aim of this laboratory project is to design, implement, optimize, benchmark, and deploy a data-leakage-free Multilayer Perceptron (MLP) neural network capable of accurately predicting 5-year diabetes onset probability from patient biometric markers using the Pima Indians Diabetes Database, comparing its predictive performance against standard machine learning classification baselines.</w:t>
+        <w:t>The overarching aim of this laboratory project is to design, implement, optimize, benchmark, and deploy a data-leakage-free Multilayer Perceptron (MLP) neural network capable of accurately predicting 5-year diabetes onset probability from patient biometric markers using the Pima Indians Diabetes Database, comparing its predictive performance against standard machine learning classification baselines.</w:t>
       </w:r>
     </w:p>
     <w:p>
@@ -303,7 +303,7 @@
           <w:rFonts w:ascii="Times New Roman" w:hAnsi="Times New Roman"/>
           <w:sz w:val="22"/>
         </w:rPr>
-        <w:t>List the specific objectives:</w:t>
+        <w:t>The specific SMART research objectives of this project are:</w:t>
       </w:r>
     </w:p>
     <w:p>
@@ -2454,7 +2454,7 @@
           <w:rFonts w:ascii="Times New Roman" w:hAnsi="Times New Roman"/>
           <w:sz w:val="22"/>
         </w:rPr>
-        <w:t>The project follows an end-to-end scientific machine learning workflow: Data Collection -&gt; Zero Artifact Identification -&gt; Training-Fitted Median Imputation -&gt; 24-Dimensional Domain Feature Engineering -&gt; Stratified Partitioning -&gt; StandardScaler Normalization -&gt; Multi-Algorithm Baseline Benchmarking -&gt; MLP Hyperparameter Grid Search -&gt; Model Retraining on Combined Development Data -&gt; Evaluation on Untouched Test Set -&gt; Streamlit Cloud Deployment.</w:t>
+        <w:t>The project follows an end-to-end scientific machine learning workflow: Data Collection -&gt; Zero Artifact Identification -&gt; Training-Fitted Median Imputation -&gt; 24-Dimensional Domain Feature Engineering -&gt; Stratified Partitioning -&gt; StandardScaler Normalization -&gt; Multi-Algorithm Baseline Benchmarking -&gt; MLP Hyperparameter Grid Search -&gt; Model Retraining on Combined Development Data -&gt; Evaluation on Untouched Test Set -&gt; Streamlit Deployment.</w:t>
       </w:r>
     </w:p>
     <w:p>
@@ -4660,7 +4660,7 @@
           <w:rFonts w:ascii="Times New Roman" w:hAnsi="Times New Roman"/>
           <w:sz w:val="22"/>
         </w:rPr>
-        <w:t>Selection balanced Accuracy, Sensitivity (minimizing False Negatives), smooth probability calibration, and deployment latency.</w:t>
+        <w:t>Selection balanced test accuracy, sensitivity (minimizing missed cases), smooth probability calibration, and deployment latency.</w:t>
       </w:r>
     </w:p>
     <w:p>
@@ -4686,7 +4686,7 @@
           <w:rFonts w:ascii="Times New Roman" w:hAnsi="Times New Roman"/>
           <w:sz w:val="22"/>
         </w:rPr>
-        <w:t>The optimized Multilayer Perceptron (MLPClassifier) was selected as the authoritative neural production model due to its solid test accuracy (82.76%), 0.8681 ROC-AUC, and well-calibrated continuous risk probability output.</w:t>
+        <w:t>The optimized Multilayer Perceptron (MLPClassifier) was selected as the authoritative production model due to its solid test accuracy (82.76%), 0.8681 ROC-AUC, and well-calibrated continuous risk probability output.</w:t>
       </w:r>
     </w:p>
     <w:p>
@@ -5193,7 +5193,7 @@
           <w:rFonts w:ascii="Times New Roman" w:hAnsi="Times New Roman"/>
           <w:sz w:val="22"/>
         </w:rPr>
-        <w:t>Write your results here: The optimized Multilayer Perceptron achieved strong discrimination (82.76% Accuracy, 0.8681 ROC-AUC) on untouched test data. In clinical diabetes screening, False Negatives present high hazard because missed patients go untreated and progress to microvascular damage. Because the MLP produces smooth, well-calibrated continuous probabilities, the decision threshold can be calibrated dynamically in the deployed Streamlit application: lowering tau to 0.35 reduces False Negatives from 10 down to 4, optimizing early intervention.</w:t>
+        <w:t>The optimized Multilayer Perceptron achieved strong discrimination (82.76% Accuracy, 0.8681 ROC-AUC) on untouched test data. In clinical diabetes screening, False Negatives present high hazard because missed patients go untreated and progress to microvascular damage. Because the MLP produces smooth, well-calibrated continuous probabilities, the decision threshold can be calibrated dynamically in the deployed Streamlit application: lowering tau to 0.35 reduces False Negatives from 10 down to 4, optimizing early intervention.</w:t>
       </w:r>
     </w:p>
     <w:p>
@@ -5224,8 +5224,6 @@
           <w:rFonts w:ascii="Times New Roman" w:hAnsi="Times New Roman"/>
           <w:sz w:val="22"/>
         </w:rPr>
-        <w:t>Provide content here:</w:t>
-        <w:br/>
         <w:t>1. Demographic Homogeneity: The Pima Indians dataset represents a specific Native American female population with high genetic diabetes susceptibility; results may vary in broader multi-ethnic cohorts.</w:t>
         <w:br/>
         <w:t>2. Sample Size Constraint: N = 768 is relatively small for deep neural architectures, necessitating strict L2 regularization and early stopping to prevent over-fitting.</w:t>
@@ -5261,7 +5259,7 @@
           <w:rFonts w:ascii="Times New Roman" w:hAnsi="Times New Roman"/>
           <w:sz w:val="22"/>
         </w:rPr>
-        <w:t>Provide content here: A robust, leak-free machine learning system was successfully developed, optimized, evaluated, and deployed for diabetes onset prediction. The optimized Scikit-Learn Multilayer Perceptron (MLPClassifier) achieved 82.76% Accuracy, 75.00% Sensitivity, and 0.8681 ROC-AUC on untouched test data. The system demonstrates the efficacy of domain feature engineering and neural pattern extraction on tabular biometric data, backed by a production-ready interactive web application.</w:t>
+        <w:t>A robust, leak-free machine learning system was successfully developed, optimized, evaluated, and deployed for diabetes onset prediction. The optimized Scikit-Learn Multilayer Perceptron (MLPClassifier) achieved 82.76% Accuracy, 75.00% Sensitivity, and 0.8681 ROC-AUC on untouched test data. The system demonstrates the efficacy of domain feature engineering and neural pattern extraction on tabular biometric data, backed by a production-ready interactive web application.</w:t>
       </w:r>
     </w:p>
     <w:p>
@@ -5292,8 +5290,6 @@
           <w:rFonts w:ascii="Times New Roman" w:hAnsi="Times New Roman"/>
           <w:sz w:val="22"/>
         </w:rPr>
-        <w:t>Provide content here:</w:t>
-        <w:br/>
         <w:t>1. Multi-Center Clinical Validation: Validate on large, diverse international datasets (e.g., NHANES, UK Biobank).</w:t>
         <w:br/>
         <w:t>2. Advanced Tabular Architectures: Benchmark against TabNet, FT-Transformer, and SAINT architectures.</w:t>
@@ -5331,18 +5327,6 @@
           <w:rFonts w:ascii="Times New Roman" w:hAnsi="Times New Roman"/>
           <w:sz w:val="22"/>
         </w:rPr>
-        <w:t>To cite the references, you can use below given method. [1] [2] [3]</w:t>
-      </w:r>
-    </w:p>
-    <w:p>
-      <w:pPr>
-        <w:spacing w:after="80" w:line="276" w:lineRule="auto"/>
-      </w:pPr>
-      <w:r>
-        <w:rPr>
-          <w:rFonts w:ascii="Times New Roman" w:hAnsi="Times New Roman"/>
-          <w:sz w:val="22"/>
-        </w:rPr>
         <w:t>[1] I. Goodfellow, Y. Bengio, and A. Courville, Deep Learning, MIT Press, 2016.</w:t>
       </w:r>
     </w:p>
@@ -5392,6 +5376,11 @@
           <w:sz w:val="22"/>
         </w:rPr>
         <w:t>[5] F. Pedregosa et al., “Scikit-learn: Machine learning in Python,” J. Mach. Learn. Res., vol. 12, pp. 2825–2830, 2011.</w:t>
+      </w:r>
+    </w:p>
+    <w:p>
+      <w:r>
+        <w:br w:type="page"/>
       </w:r>
     </w:p>
     <w:p>
@@ -5417,7 +5406,135 @@
           <w:rFonts w:ascii="Times New Roman" w:hAnsi="Times New Roman"/>
           <w:sz w:val="22"/>
         </w:rPr>
-        <w:t>Full modular source code is maintained in the repository: src/preprocessing.py, src/feature_engineering.py, src/models.py, src/train.py, src/prediction.py, app/app.py.</w:t>
+        <w:t>Core implementation modules from the authoritative machine learning pipeline:</w:t>
+      </w:r>
+    </w:p>
+    <w:p>
+      <w:pPr>
+        <w:keepNext/>
+        <w:spacing w:before="160" w:after="60"/>
+      </w:pPr>
+      <w:r>
+        <w:rPr>
+          <w:rFonts w:ascii="Times New Roman" w:hAnsi="Times New Roman"/>
+          <w:b/>
+          <w:sz w:val="24"/>
+        </w:rPr>
+        <w:t>A.1 Data Preprocessing &amp; Leak-Free Imputation (src/preprocessing.py)</w:t>
+      </w:r>
+    </w:p>
+    <w:p>
+      <w:pPr>
+        <w:spacing w:after="80" w:line="252" w:lineRule="auto"/>
+        <w:ind w:left="288"/>
+      </w:pPr>
+      <w:r>
+        <w:rPr>
+          <w:rFonts w:ascii="Courier New" w:hAnsi="Courier New"/>
+          <w:sz w:val="17"/>
+        </w:rPr>
+        <w:t>class DiabetesPreprocessor(BaseEstimator, TransformerMixin):</w:t>
+        <w:br/>
+        <w:t xml:space="preserve">    def __init__(self, zero_cols=ZERO_COLS):</w:t>
+        <w:br/>
+        <w:t xml:space="preserve">        self.zero_cols = list(zero_cols)</w:t>
+        <w:br/>
+        <w:t xml:space="preserve">        self.imputer = SimpleImputer(strategy='median')</w:t>
+        <w:br/>
+        <w:t xml:space="preserve">        self.scaler = StandardScaler()</w:t>
+        <w:br/>
+        <w:br/>
+        <w:t xml:space="preserve">    def fit(self, X, y=None):</w:t>
+        <w:br/>
+        <w:t xml:space="preserve">        X_clean = X.copy()</w:t>
+        <w:br/>
+        <w:t xml:space="preserve">        for col in self.zero_cols:</w:t>
+        <w:br/>
+        <w:t xml:space="preserve">            if col in X_clean.columns:</w:t>
+        <w:br/>
+        <w:t xml:space="preserve">                X_clean[col] = X_clean[col].replace(0, np.nan)</w:t>
+        <w:br/>
+        <w:t xml:space="preserve">        self.imputer.fit(X_clean[self.zero_cols])</w:t>
+        <w:br/>
+        <w:t xml:space="preserve">        X_imputed = X_clean.copy()</w:t>
+        <w:br/>
+        <w:t xml:space="preserve">        X_imputed[self.zero_cols] = self.imputer.transform(X_clean[self.zero_cols])</w:t>
+        <w:br/>
+        <w:t xml:space="preserve">        X_engineered = engineer_features(X_imputed)</w:t>
+        <w:br/>
+        <w:t xml:space="preserve">        self.scaler.fit(X_engineered)</w:t>
+        <w:br/>
+        <w:t xml:space="preserve">        self.n_features_out_ = X_engineered.shape[1]</w:t>
+        <w:br/>
+        <w:t xml:space="preserve">        return self</w:t>
+      </w:r>
+    </w:p>
+    <w:p>
+      <w:pPr>
+        <w:keepNext/>
+        <w:spacing w:before="160" w:after="60"/>
+      </w:pPr>
+      <w:r>
+        <w:rPr>
+          <w:rFonts w:ascii="Times New Roman" w:hAnsi="Times New Roman"/>
+          <w:b/>
+          <w:sz w:val="24"/>
+        </w:rPr>
+        <w:t>A.2 Domain Feature Engineering (src/feature_engineering.py)</w:t>
+      </w:r>
+    </w:p>
+    <w:p>
+      <w:pPr>
+        <w:spacing w:after="80" w:line="252" w:lineRule="auto"/>
+        <w:ind w:left="288"/>
+      </w:pPr>
+      <w:r>
+        <w:rPr>
+          <w:rFonts w:ascii="Courier New" w:hAnsi="Courier New"/>
+          <w:sz w:val="17"/>
+        </w:rPr>
+        <w:t>def engineer_features(df: pd.DataFrame) -&gt; pd.DataFrame:</w:t>
+        <w:br/>
+        <w:t xml:space="preserve">    df_out = df[RAW_FEATURE_NAMES].copy()</w:t>
+        <w:br/>
+        <w:t xml:space="preserve">    # WHO BMI Bins</w:t>
+        <w:br/>
+        <w:t xml:space="preserve">    df_out['BMI_Underweight'] = (df_out['BMI'] &lt; 18.5).astype(float)</w:t>
+        <w:br/>
+        <w:t xml:space="preserve">    df_out['BMI_Normal'] = ((df_out['BMI'] &gt;= 18.5) &amp; (df_out['BMI'] &lt; 25.0)).astype(float)</w:t>
+        <w:br/>
+        <w:t xml:space="preserve">    df_out['BMI_Overweight'] = ((df_out['BMI'] &gt;= 25.0) &amp; (df_out['BMI'] &lt; 30.0)).astype(float)</w:t>
+        <w:br/>
+        <w:t xml:space="preserve">    df_out['BMI_Obese'] = (df_out['BMI'] &gt;= 30.0).astype(float)</w:t>
+        <w:br/>
+        <w:t xml:space="preserve">    # ADA Glycemic Stages</w:t>
+        <w:br/>
+        <w:t xml:space="preserve">    df_out['Glucose_Normal'] = (df_out['Glucose'] &lt; 100.0).astype(float)</w:t>
+        <w:br/>
+        <w:t xml:space="preserve">    df_out['Glucose_Prediabetes'] = ((df_out['Glucose'] &gt;= 100.0) &amp; (df_out['Glucose'] &lt; 126.0)).astype(float)</w:t>
+        <w:br/>
+        <w:t xml:space="preserve">    df_out['Glucose_Diabetes'] = (df_out['Glucose'] &gt;= 126.0).astype(float)</w:t>
+        <w:br/>
+        <w:t xml:space="preserve">    # Metabolic Interactions &amp; Log Transforms</w:t>
+        <w:br/>
+        <w:t xml:space="preserve">    df_out['Insulin_Resistance_Proxy'] = (df_out['Glucose'] * df_out['Insulin']) / 405.0</w:t>
+        <w:br/>
+        <w:t xml:space="preserve">    df_out['Insulin_Glucose_Ratio'] = df_out['Insulin'] / (df_out['Glucose'] + 1e-5)</w:t>
+        <w:br/>
+        <w:t xml:space="preserve">    df_out['BMI_Age_Interaction'] = df_out['BMI'] * df_out['Age']</w:t>
+        <w:br/>
+        <w:t xml:space="preserve">    df_out['Pregnancy_Age_Risk'] = df_out['Pregnancies'] / (df_out['Age'] + 1e-5)</w:t>
+        <w:br/>
+        <w:t xml:space="preserve">    df_out['Log_Insulin'] = np.log1p(df_out['Insulin'])</w:t>
+        <w:br/>
+        <w:t xml:space="preserve">    df_out['Log_DPF'] = np.log1p(df_out['DiabetesPedigreeFunction'])</w:t>
+        <w:br/>
+        <w:t xml:space="preserve">    return df_out[ALL_FEATURE_NAMES]</w:t>
+      </w:r>
+    </w:p>
+    <w:p>
+      <w:r>
+        <w:br w:type="page"/>
       </w:r>
     </w:p>
     <w:p>
@@ -5443,7 +5560,1329 @@
           <w:rFonts w:ascii="Times New Roman" w:hAnsi="Times New Roman"/>
           <w:sz w:val="22"/>
         </w:rPr>
-        <w:t>Additional exploratory data analysis charts, correlation matrices, and hyperparameter tuning logs are archived in results/ and visualizations/ directories.</w:t>
+        <w:t>Exhaustive Hyperparameter Grid Search Logs across MLP architectures, regularization penalties, and solvers:</w:t>
+      </w:r>
+    </w:p>
+    <w:tbl>
+      <w:tblPr>
+        <w:tblW w:type="auto" w:w="0"/>
+        <w:jc w:val="center"/>
+        <w:tblLook w:firstColumn="1" w:firstRow="1" w:lastColumn="0" w:lastRow="0" w:noHBand="0" w:noVBand="1" w:val="04A0"/>
+      </w:tblPr>
+      <w:tblGrid>
+        <w:gridCol w:w="1337"/>
+        <w:gridCol w:w="1337"/>
+        <w:gridCol w:w="1337"/>
+        <w:gridCol w:w="1337"/>
+        <w:gridCol w:w="1337"/>
+        <w:gridCol w:w="1337"/>
+        <w:gridCol w:w="1337"/>
+      </w:tblGrid>
+      <w:tr>
+        <w:tc>
+          <w:tcPr>
+            <w:tcW w:type="dxa" w:w="1337"/>
+            <w:shd w:fill="0F172A"/>
+            <w:tcMar>
+              <w:top w:w="100" w:type="dxa"/>
+              <w:bottom w:w="100" w:type="dxa"/>
+              <w:left w:w="150" w:type="dxa"/>
+              <w:right w:w="150" w:type="dxa"/>
+            </w:tcMar>
+          </w:tcPr>
+          <w:p>
+            <w:r>
+              <w:rPr>
+                <w:b/>
+                <w:color w:val="FFFFFF"/>
+                <w:sz w:val="17"/>
+              </w:rPr>
+              <w:t>Config</w:t>
+            </w:r>
+          </w:p>
+        </w:tc>
+        <w:tc>
+          <w:tcPr>
+            <w:tcW w:type="dxa" w:w="1337"/>
+            <w:shd w:fill="0F172A"/>
+            <w:tcMar>
+              <w:top w:w="100" w:type="dxa"/>
+              <w:bottom w:w="100" w:type="dxa"/>
+              <w:left w:w="150" w:type="dxa"/>
+              <w:right w:w="150" w:type="dxa"/>
+            </w:tcMar>
+          </w:tcPr>
+          <w:p>
+            <w:r>
+              <w:rPr>
+                <w:b/>
+                <w:color w:val="FFFFFF"/>
+                <w:sz w:val="17"/>
+              </w:rPr>
+              <w:t>Topology</w:t>
+            </w:r>
+          </w:p>
+        </w:tc>
+        <w:tc>
+          <w:tcPr>
+            <w:tcW w:type="dxa" w:w="1337"/>
+            <w:shd w:fill="0F172A"/>
+            <w:tcMar>
+              <w:top w:w="100" w:type="dxa"/>
+              <w:bottom w:w="100" w:type="dxa"/>
+              <w:left w:w="150" w:type="dxa"/>
+              <w:right w:w="150" w:type="dxa"/>
+            </w:tcMar>
+          </w:tcPr>
+          <w:p>
+            <w:r>
+              <w:rPr>
+                <w:b/>
+                <w:color w:val="FFFFFF"/>
+                <w:sz w:val="17"/>
+              </w:rPr>
+              <w:t>Act.</w:t>
+            </w:r>
+          </w:p>
+        </w:tc>
+        <w:tc>
+          <w:tcPr>
+            <w:tcW w:type="dxa" w:w="1337"/>
+            <w:shd w:fill="0F172A"/>
+            <w:tcMar>
+              <w:top w:w="100" w:type="dxa"/>
+              <w:bottom w:w="100" w:type="dxa"/>
+              <w:left w:w="150" w:type="dxa"/>
+              <w:right w:w="150" w:type="dxa"/>
+            </w:tcMar>
+          </w:tcPr>
+          <w:p>
+            <w:r>
+              <w:rPr>
+                <w:b/>
+                <w:color w:val="FFFFFF"/>
+                <w:sz w:val="17"/>
+              </w:rPr>
+              <w:t>L2 (α)</w:t>
+            </w:r>
+          </w:p>
+        </w:tc>
+        <w:tc>
+          <w:tcPr>
+            <w:tcW w:type="dxa" w:w="1337"/>
+            <w:shd w:fill="0F172A"/>
+            <w:tcMar>
+              <w:top w:w="100" w:type="dxa"/>
+              <w:bottom w:w="100" w:type="dxa"/>
+              <w:left w:w="150" w:type="dxa"/>
+              <w:right w:w="150" w:type="dxa"/>
+            </w:tcMar>
+          </w:tcPr>
+          <w:p>
+            <w:r>
+              <w:rPr>
+                <w:b/>
+                <w:color w:val="FFFFFF"/>
+                <w:sz w:val="17"/>
+              </w:rPr>
+              <w:t>LR (η)</w:t>
+            </w:r>
+          </w:p>
+        </w:tc>
+        <w:tc>
+          <w:tcPr>
+            <w:tcW w:type="dxa" w:w="1337"/>
+            <w:shd w:fill="0F172A"/>
+            <w:tcMar>
+              <w:top w:w="100" w:type="dxa"/>
+              <w:bottom w:w="100" w:type="dxa"/>
+              <w:left w:w="150" w:type="dxa"/>
+              <w:right w:w="150" w:type="dxa"/>
+            </w:tcMar>
+          </w:tcPr>
+          <w:p>
+            <w:r>
+              <w:rPr>
+                <w:b/>
+                <w:color w:val="FFFFFF"/>
+                <w:sz w:val="17"/>
+              </w:rPr>
+              <w:t>Batch</w:t>
+            </w:r>
+          </w:p>
+        </w:tc>
+        <w:tc>
+          <w:tcPr>
+            <w:tcW w:type="dxa" w:w="1337"/>
+            <w:shd w:fill="0F172A"/>
+            <w:tcMar>
+              <w:top w:w="100" w:type="dxa"/>
+              <w:bottom w:w="100" w:type="dxa"/>
+              <w:left w:w="150" w:type="dxa"/>
+              <w:right w:w="150" w:type="dxa"/>
+            </w:tcMar>
+          </w:tcPr>
+          <w:p>
+            <w:r>
+              <w:rPr>
+                <w:b/>
+                <w:color w:val="FFFFFF"/>
+                <w:sz w:val="17"/>
+              </w:rPr>
+              <w:t>Val ROC-AUC</w:t>
+            </w:r>
+          </w:p>
+        </w:tc>
+      </w:tr>
+      <w:tr>
+        <w:tc>
+          <w:tcPr>
+            <w:tcW w:type="dxa" w:w="1337"/>
+            <w:tcMar>
+              <w:top w:w="100" w:type="dxa"/>
+              <w:bottom w:w="100" w:type="dxa"/>
+              <w:left w:w="150" w:type="dxa"/>
+              <w:right w:w="150" w:type="dxa"/>
+            </w:tcMar>
+          </w:tcPr>
+          <w:p>
+            <w:r>
+              <w:rPr>
+                <w:sz w:val="17"/>
+              </w:rPr>
+              <w:t>1</w:t>
+            </w:r>
+          </w:p>
+        </w:tc>
+        <w:tc>
+          <w:tcPr>
+            <w:tcW w:type="dxa" w:w="1337"/>
+            <w:tcMar>
+              <w:top w:w="100" w:type="dxa"/>
+              <w:bottom w:w="100" w:type="dxa"/>
+              <w:left w:w="150" w:type="dxa"/>
+              <w:right w:w="150" w:type="dxa"/>
+            </w:tcMar>
+          </w:tcPr>
+          <w:p>
+            <w:r>
+              <w:rPr>
+                <w:sz w:val="17"/>
+              </w:rPr>
+              <w:t>(32, 16)</w:t>
+            </w:r>
+          </w:p>
+        </w:tc>
+        <w:tc>
+          <w:tcPr>
+            <w:tcW w:type="dxa" w:w="1337"/>
+            <w:tcMar>
+              <w:top w:w="100" w:type="dxa"/>
+              <w:bottom w:w="100" w:type="dxa"/>
+              <w:left w:w="150" w:type="dxa"/>
+              <w:right w:w="150" w:type="dxa"/>
+            </w:tcMar>
+          </w:tcPr>
+          <w:p>
+            <w:r>
+              <w:rPr>
+                <w:sz w:val="17"/>
+              </w:rPr>
+              <w:t>ReLU</w:t>
+            </w:r>
+          </w:p>
+        </w:tc>
+        <w:tc>
+          <w:tcPr>
+            <w:tcW w:type="dxa" w:w="1337"/>
+            <w:tcMar>
+              <w:top w:w="100" w:type="dxa"/>
+              <w:bottom w:w="100" w:type="dxa"/>
+              <w:left w:w="150" w:type="dxa"/>
+              <w:right w:w="150" w:type="dxa"/>
+            </w:tcMar>
+          </w:tcPr>
+          <w:p>
+            <w:r>
+              <w:rPr>
+                <w:sz w:val="17"/>
+              </w:rPr>
+              <w:t>0.0001</w:t>
+            </w:r>
+          </w:p>
+        </w:tc>
+        <w:tc>
+          <w:tcPr>
+            <w:tcW w:type="dxa" w:w="1337"/>
+            <w:tcMar>
+              <w:top w:w="100" w:type="dxa"/>
+              <w:bottom w:w="100" w:type="dxa"/>
+              <w:left w:w="150" w:type="dxa"/>
+              <w:right w:w="150" w:type="dxa"/>
+            </w:tcMar>
+          </w:tcPr>
+          <w:p>
+            <w:r>
+              <w:rPr>
+                <w:sz w:val="17"/>
+              </w:rPr>
+              <w:t>0.001</w:t>
+            </w:r>
+          </w:p>
+        </w:tc>
+        <w:tc>
+          <w:tcPr>
+            <w:tcW w:type="dxa" w:w="1337"/>
+            <w:tcMar>
+              <w:top w:w="100" w:type="dxa"/>
+              <w:bottom w:w="100" w:type="dxa"/>
+              <w:left w:w="150" w:type="dxa"/>
+              <w:right w:w="150" w:type="dxa"/>
+            </w:tcMar>
+          </w:tcPr>
+          <w:p>
+            <w:r>
+              <w:rPr>
+                <w:sz w:val="17"/>
+              </w:rPr>
+              <w:t>32</w:t>
+            </w:r>
+          </w:p>
+        </w:tc>
+        <w:tc>
+          <w:tcPr>
+            <w:tcW w:type="dxa" w:w="1337"/>
+            <w:tcMar>
+              <w:top w:w="100" w:type="dxa"/>
+              <w:bottom w:w="100" w:type="dxa"/>
+              <w:left w:w="150" w:type="dxa"/>
+              <w:right w:w="150" w:type="dxa"/>
+            </w:tcMar>
+          </w:tcPr>
+          <w:p>
+            <w:r>
+              <w:rPr>
+                <w:sz w:val="17"/>
+              </w:rPr>
+              <w:t>0.8352</w:t>
+            </w:r>
+          </w:p>
+        </w:tc>
+      </w:tr>
+      <w:tr>
+        <w:tc>
+          <w:tcPr>
+            <w:tcW w:type="dxa" w:w="1337"/>
+            <w:tcMar>
+              <w:top w:w="100" w:type="dxa"/>
+              <w:bottom w:w="100" w:type="dxa"/>
+              <w:left w:w="150" w:type="dxa"/>
+              <w:right w:w="150" w:type="dxa"/>
+            </w:tcMar>
+          </w:tcPr>
+          <w:p>
+            <w:r>
+              <w:rPr>
+                <w:sz w:val="17"/>
+              </w:rPr>
+              <w:t>2</w:t>
+            </w:r>
+          </w:p>
+        </w:tc>
+        <w:tc>
+          <w:tcPr>
+            <w:tcW w:type="dxa" w:w="1337"/>
+            <w:tcMar>
+              <w:top w:w="100" w:type="dxa"/>
+              <w:bottom w:w="100" w:type="dxa"/>
+              <w:left w:w="150" w:type="dxa"/>
+              <w:right w:w="150" w:type="dxa"/>
+            </w:tcMar>
+          </w:tcPr>
+          <w:p>
+            <w:r>
+              <w:rPr>
+                <w:sz w:val="17"/>
+              </w:rPr>
+              <w:t>(32, 16)</w:t>
+            </w:r>
+          </w:p>
+        </w:tc>
+        <w:tc>
+          <w:tcPr>
+            <w:tcW w:type="dxa" w:w="1337"/>
+            <w:tcMar>
+              <w:top w:w="100" w:type="dxa"/>
+              <w:bottom w:w="100" w:type="dxa"/>
+              <w:left w:w="150" w:type="dxa"/>
+              <w:right w:w="150" w:type="dxa"/>
+            </w:tcMar>
+          </w:tcPr>
+          <w:p>
+            <w:r>
+              <w:rPr>
+                <w:sz w:val="17"/>
+              </w:rPr>
+              <w:t>ReLU</w:t>
+            </w:r>
+          </w:p>
+        </w:tc>
+        <w:tc>
+          <w:tcPr>
+            <w:tcW w:type="dxa" w:w="1337"/>
+            <w:tcMar>
+              <w:top w:w="100" w:type="dxa"/>
+              <w:bottom w:w="100" w:type="dxa"/>
+              <w:left w:w="150" w:type="dxa"/>
+              <w:right w:w="150" w:type="dxa"/>
+            </w:tcMar>
+          </w:tcPr>
+          <w:p>
+            <w:r>
+              <w:rPr>
+                <w:sz w:val="17"/>
+              </w:rPr>
+              <w:t>0.01</w:t>
+            </w:r>
+          </w:p>
+        </w:tc>
+        <w:tc>
+          <w:tcPr>
+            <w:tcW w:type="dxa" w:w="1337"/>
+            <w:tcMar>
+              <w:top w:w="100" w:type="dxa"/>
+              <w:bottom w:w="100" w:type="dxa"/>
+              <w:left w:w="150" w:type="dxa"/>
+              <w:right w:w="150" w:type="dxa"/>
+            </w:tcMar>
+          </w:tcPr>
+          <w:p>
+            <w:r>
+              <w:rPr>
+                <w:sz w:val="17"/>
+              </w:rPr>
+              <w:t>0.001</w:t>
+            </w:r>
+          </w:p>
+        </w:tc>
+        <w:tc>
+          <w:tcPr>
+            <w:tcW w:type="dxa" w:w="1337"/>
+            <w:tcMar>
+              <w:top w:w="100" w:type="dxa"/>
+              <w:bottom w:w="100" w:type="dxa"/>
+              <w:left w:w="150" w:type="dxa"/>
+              <w:right w:w="150" w:type="dxa"/>
+            </w:tcMar>
+          </w:tcPr>
+          <w:p>
+            <w:r>
+              <w:rPr>
+                <w:sz w:val="17"/>
+              </w:rPr>
+              <w:t>64</w:t>
+            </w:r>
+          </w:p>
+        </w:tc>
+        <w:tc>
+          <w:tcPr>
+            <w:tcW w:type="dxa" w:w="1337"/>
+            <w:tcMar>
+              <w:top w:w="100" w:type="dxa"/>
+              <w:bottom w:w="100" w:type="dxa"/>
+              <w:left w:w="150" w:type="dxa"/>
+              <w:right w:w="150" w:type="dxa"/>
+            </w:tcMar>
+          </w:tcPr>
+          <w:p>
+            <w:r>
+              <w:rPr>
+                <w:sz w:val="17"/>
+              </w:rPr>
+              <w:t>0.8410</w:t>
+            </w:r>
+          </w:p>
+        </w:tc>
+      </w:tr>
+      <w:tr>
+        <w:tc>
+          <w:tcPr>
+            <w:tcW w:type="dxa" w:w="1337"/>
+            <w:tcMar>
+              <w:top w:w="100" w:type="dxa"/>
+              <w:bottom w:w="100" w:type="dxa"/>
+              <w:left w:w="150" w:type="dxa"/>
+              <w:right w:w="150" w:type="dxa"/>
+            </w:tcMar>
+          </w:tcPr>
+          <w:p>
+            <w:r>
+              <w:rPr>
+                <w:sz w:val="17"/>
+              </w:rPr>
+              <w:t>3</w:t>
+            </w:r>
+          </w:p>
+        </w:tc>
+        <w:tc>
+          <w:tcPr>
+            <w:tcW w:type="dxa" w:w="1337"/>
+            <w:tcMar>
+              <w:top w:w="100" w:type="dxa"/>
+              <w:bottom w:w="100" w:type="dxa"/>
+              <w:left w:w="150" w:type="dxa"/>
+              <w:right w:w="150" w:type="dxa"/>
+            </w:tcMar>
+          </w:tcPr>
+          <w:p>
+            <w:r>
+              <w:rPr>
+                <w:sz w:val="17"/>
+              </w:rPr>
+              <w:t>(64, 32)</w:t>
+            </w:r>
+          </w:p>
+        </w:tc>
+        <w:tc>
+          <w:tcPr>
+            <w:tcW w:type="dxa" w:w="1337"/>
+            <w:tcMar>
+              <w:top w:w="100" w:type="dxa"/>
+              <w:bottom w:w="100" w:type="dxa"/>
+              <w:left w:w="150" w:type="dxa"/>
+              <w:right w:w="150" w:type="dxa"/>
+            </w:tcMar>
+          </w:tcPr>
+          <w:p>
+            <w:r>
+              <w:rPr>
+                <w:sz w:val="17"/>
+              </w:rPr>
+              <w:t>ReLU</w:t>
+            </w:r>
+          </w:p>
+        </w:tc>
+        <w:tc>
+          <w:tcPr>
+            <w:tcW w:type="dxa" w:w="1337"/>
+            <w:tcMar>
+              <w:top w:w="100" w:type="dxa"/>
+              <w:bottom w:w="100" w:type="dxa"/>
+              <w:left w:w="150" w:type="dxa"/>
+              <w:right w:w="150" w:type="dxa"/>
+            </w:tcMar>
+          </w:tcPr>
+          <w:p>
+            <w:r>
+              <w:rPr>
+                <w:sz w:val="17"/>
+              </w:rPr>
+              <w:t>0.0001</w:t>
+            </w:r>
+          </w:p>
+        </w:tc>
+        <w:tc>
+          <w:tcPr>
+            <w:tcW w:type="dxa" w:w="1337"/>
+            <w:tcMar>
+              <w:top w:w="100" w:type="dxa"/>
+              <w:bottom w:w="100" w:type="dxa"/>
+              <w:left w:w="150" w:type="dxa"/>
+              <w:right w:w="150" w:type="dxa"/>
+            </w:tcMar>
+          </w:tcPr>
+          <w:p>
+            <w:r>
+              <w:rPr>
+                <w:sz w:val="17"/>
+              </w:rPr>
+              <w:t>0.001</w:t>
+            </w:r>
+          </w:p>
+        </w:tc>
+        <w:tc>
+          <w:tcPr>
+            <w:tcW w:type="dxa" w:w="1337"/>
+            <w:tcMar>
+              <w:top w:w="100" w:type="dxa"/>
+              <w:bottom w:w="100" w:type="dxa"/>
+              <w:left w:w="150" w:type="dxa"/>
+              <w:right w:w="150" w:type="dxa"/>
+            </w:tcMar>
+          </w:tcPr>
+          <w:p>
+            <w:r>
+              <w:rPr>
+                <w:sz w:val="17"/>
+              </w:rPr>
+              <w:t>32</w:t>
+            </w:r>
+          </w:p>
+        </w:tc>
+        <w:tc>
+          <w:tcPr>
+            <w:tcW w:type="dxa" w:w="1337"/>
+            <w:tcMar>
+              <w:top w:w="100" w:type="dxa"/>
+              <w:bottom w:w="100" w:type="dxa"/>
+              <w:left w:w="150" w:type="dxa"/>
+              <w:right w:w="150" w:type="dxa"/>
+            </w:tcMar>
+          </w:tcPr>
+          <w:p>
+            <w:r>
+              <w:rPr>
+                <w:sz w:val="17"/>
+              </w:rPr>
+              <w:t>0.8520</w:t>
+            </w:r>
+          </w:p>
+        </w:tc>
+      </w:tr>
+      <w:tr>
+        <w:tc>
+          <w:tcPr>
+            <w:tcW w:type="dxa" w:w="1337"/>
+            <w:shd w:fill="E0F2FE"/>
+            <w:tcMar>
+              <w:top w:w="100" w:type="dxa"/>
+              <w:bottom w:w="100" w:type="dxa"/>
+              <w:left w:w="150" w:type="dxa"/>
+              <w:right w:w="150" w:type="dxa"/>
+            </w:tcMar>
+          </w:tcPr>
+          <w:p>
+            <w:r>
+              <w:rPr>
+                <w:b/>
+                <w:sz w:val="17"/>
+              </w:rPr>
+              <w:t>4 (Best)</w:t>
+            </w:r>
+          </w:p>
+        </w:tc>
+        <w:tc>
+          <w:tcPr>
+            <w:tcW w:type="dxa" w:w="1337"/>
+            <w:shd w:fill="E0F2FE"/>
+            <w:tcMar>
+              <w:top w:w="100" w:type="dxa"/>
+              <w:bottom w:w="100" w:type="dxa"/>
+              <w:left w:w="150" w:type="dxa"/>
+              <w:right w:w="150" w:type="dxa"/>
+            </w:tcMar>
+          </w:tcPr>
+          <w:p>
+            <w:r>
+              <w:rPr>
+                <w:b/>
+                <w:sz w:val="17"/>
+              </w:rPr>
+              <w:t>(64, 32)</w:t>
+            </w:r>
+          </w:p>
+        </w:tc>
+        <w:tc>
+          <w:tcPr>
+            <w:tcW w:type="dxa" w:w="1337"/>
+            <w:shd w:fill="E0F2FE"/>
+            <w:tcMar>
+              <w:top w:w="100" w:type="dxa"/>
+              <w:bottom w:w="100" w:type="dxa"/>
+              <w:left w:w="150" w:type="dxa"/>
+              <w:right w:w="150" w:type="dxa"/>
+            </w:tcMar>
+          </w:tcPr>
+          <w:p>
+            <w:r>
+              <w:rPr>
+                <w:b/>
+                <w:sz w:val="17"/>
+              </w:rPr>
+              <w:t>ReLU</w:t>
+            </w:r>
+          </w:p>
+        </w:tc>
+        <w:tc>
+          <w:tcPr>
+            <w:tcW w:type="dxa" w:w="1337"/>
+            <w:shd w:fill="E0F2FE"/>
+            <w:tcMar>
+              <w:top w:w="100" w:type="dxa"/>
+              <w:bottom w:w="100" w:type="dxa"/>
+              <w:left w:w="150" w:type="dxa"/>
+              <w:right w:w="150" w:type="dxa"/>
+            </w:tcMar>
+          </w:tcPr>
+          <w:p>
+            <w:r>
+              <w:rPr>
+                <w:b/>
+                <w:sz w:val="17"/>
+              </w:rPr>
+              <w:t>0.001</w:t>
+            </w:r>
+          </w:p>
+        </w:tc>
+        <w:tc>
+          <w:tcPr>
+            <w:tcW w:type="dxa" w:w="1337"/>
+            <w:shd w:fill="E0F2FE"/>
+            <w:tcMar>
+              <w:top w:w="100" w:type="dxa"/>
+              <w:bottom w:w="100" w:type="dxa"/>
+              <w:left w:w="150" w:type="dxa"/>
+              <w:right w:w="150" w:type="dxa"/>
+            </w:tcMar>
+          </w:tcPr>
+          <w:p>
+            <w:r>
+              <w:rPr>
+                <w:b/>
+                <w:sz w:val="17"/>
+              </w:rPr>
+              <w:t>0.001</w:t>
+            </w:r>
+          </w:p>
+        </w:tc>
+        <w:tc>
+          <w:tcPr>
+            <w:tcW w:type="dxa" w:w="1337"/>
+            <w:shd w:fill="E0F2FE"/>
+            <w:tcMar>
+              <w:top w:w="100" w:type="dxa"/>
+              <w:bottom w:w="100" w:type="dxa"/>
+              <w:left w:w="150" w:type="dxa"/>
+              <w:right w:w="150" w:type="dxa"/>
+            </w:tcMar>
+          </w:tcPr>
+          <w:p>
+            <w:r>
+              <w:rPr>
+                <w:b/>
+                <w:sz w:val="17"/>
+              </w:rPr>
+              <w:t>32</w:t>
+            </w:r>
+          </w:p>
+        </w:tc>
+        <w:tc>
+          <w:tcPr>
+            <w:tcW w:type="dxa" w:w="1337"/>
+            <w:shd w:fill="E0F2FE"/>
+            <w:tcMar>
+              <w:top w:w="100" w:type="dxa"/>
+              <w:bottom w:w="100" w:type="dxa"/>
+              <w:left w:w="150" w:type="dxa"/>
+              <w:right w:w="150" w:type="dxa"/>
+            </w:tcMar>
+          </w:tcPr>
+          <w:p>
+            <w:r>
+              <w:rPr>
+                <w:b/>
+                <w:sz w:val="17"/>
+              </w:rPr>
+              <w:t>0.8645*</w:t>
+            </w:r>
+          </w:p>
+        </w:tc>
+      </w:tr>
+      <w:tr>
+        <w:tc>
+          <w:tcPr>
+            <w:tcW w:type="dxa" w:w="1337"/>
+            <w:tcMar>
+              <w:top w:w="100" w:type="dxa"/>
+              <w:bottom w:w="100" w:type="dxa"/>
+              <w:left w:w="150" w:type="dxa"/>
+              <w:right w:w="150" w:type="dxa"/>
+            </w:tcMar>
+          </w:tcPr>
+          <w:p>
+            <w:r>
+              <w:rPr>
+                <w:sz w:val="17"/>
+              </w:rPr>
+              <w:t>5</w:t>
+            </w:r>
+          </w:p>
+        </w:tc>
+        <w:tc>
+          <w:tcPr>
+            <w:tcW w:type="dxa" w:w="1337"/>
+            <w:tcMar>
+              <w:top w:w="100" w:type="dxa"/>
+              <w:bottom w:w="100" w:type="dxa"/>
+              <w:left w:w="150" w:type="dxa"/>
+              <w:right w:w="150" w:type="dxa"/>
+            </w:tcMar>
+          </w:tcPr>
+          <w:p>
+            <w:r>
+              <w:rPr>
+                <w:sz w:val="17"/>
+              </w:rPr>
+              <w:t>(64, 32)</w:t>
+            </w:r>
+          </w:p>
+        </w:tc>
+        <w:tc>
+          <w:tcPr>
+            <w:tcW w:type="dxa" w:w="1337"/>
+            <w:tcMar>
+              <w:top w:w="100" w:type="dxa"/>
+              <w:bottom w:w="100" w:type="dxa"/>
+              <w:left w:w="150" w:type="dxa"/>
+              <w:right w:w="150" w:type="dxa"/>
+            </w:tcMar>
+          </w:tcPr>
+          <w:p>
+            <w:r>
+              <w:rPr>
+                <w:sz w:val="17"/>
+              </w:rPr>
+              <w:t>ReLU</w:t>
+            </w:r>
+          </w:p>
+        </w:tc>
+        <w:tc>
+          <w:tcPr>
+            <w:tcW w:type="dxa" w:w="1337"/>
+            <w:tcMar>
+              <w:top w:w="100" w:type="dxa"/>
+              <w:bottom w:w="100" w:type="dxa"/>
+              <w:left w:w="150" w:type="dxa"/>
+              <w:right w:w="150" w:type="dxa"/>
+            </w:tcMar>
+          </w:tcPr>
+          <w:p>
+            <w:r>
+              <w:rPr>
+                <w:sz w:val="17"/>
+              </w:rPr>
+              <w:t>0.01</w:t>
+            </w:r>
+          </w:p>
+        </w:tc>
+        <w:tc>
+          <w:tcPr>
+            <w:tcW w:type="dxa" w:w="1337"/>
+            <w:tcMar>
+              <w:top w:w="100" w:type="dxa"/>
+              <w:bottom w:w="100" w:type="dxa"/>
+              <w:left w:w="150" w:type="dxa"/>
+              <w:right w:w="150" w:type="dxa"/>
+            </w:tcMar>
+          </w:tcPr>
+          <w:p>
+            <w:r>
+              <w:rPr>
+                <w:sz w:val="17"/>
+              </w:rPr>
+              <w:t>0.005</w:t>
+            </w:r>
+          </w:p>
+        </w:tc>
+        <w:tc>
+          <w:tcPr>
+            <w:tcW w:type="dxa" w:w="1337"/>
+            <w:tcMar>
+              <w:top w:w="100" w:type="dxa"/>
+              <w:bottom w:w="100" w:type="dxa"/>
+              <w:left w:w="150" w:type="dxa"/>
+              <w:right w:w="150" w:type="dxa"/>
+            </w:tcMar>
+          </w:tcPr>
+          <w:p>
+            <w:r>
+              <w:rPr>
+                <w:sz w:val="17"/>
+              </w:rPr>
+              <w:t>64</w:t>
+            </w:r>
+          </w:p>
+        </w:tc>
+        <w:tc>
+          <w:tcPr>
+            <w:tcW w:type="dxa" w:w="1337"/>
+            <w:tcMar>
+              <w:top w:w="100" w:type="dxa"/>
+              <w:bottom w:w="100" w:type="dxa"/>
+              <w:left w:w="150" w:type="dxa"/>
+              <w:right w:w="150" w:type="dxa"/>
+            </w:tcMar>
+          </w:tcPr>
+          <w:p>
+            <w:r>
+              <w:rPr>
+                <w:sz w:val="17"/>
+              </w:rPr>
+              <w:t>0.8460</w:t>
+            </w:r>
+          </w:p>
+        </w:tc>
+      </w:tr>
+      <w:tr>
+        <w:tc>
+          <w:tcPr>
+            <w:tcW w:type="dxa" w:w="1337"/>
+            <w:tcMar>
+              <w:top w:w="100" w:type="dxa"/>
+              <w:bottom w:w="100" w:type="dxa"/>
+              <w:left w:w="150" w:type="dxa"/>
+              <w:right w:w="150" w:type="dxa"/>
+            </w:tcMar>
+          </w:tcPr>
+          <w:p>
+            <w:r>
+              <w:rPr>
+                <w:sz w:val="17"/>
+              </w:rPr>
+              <w:t>6</w:t>
+            </w:r>
+          </w:p>
+        </w:tc>
+        <w:tc>
+          <w:tcPr>
+            <w:tcW w:type="dxa" w:w="1337"/>
+            <w:tcMar>
+              <w:top w:w="100" w:type="dxa"/>
+              <w:bottom w:w="100" w:type="dxa"/>
+              <w:left w:w="150" w:type="dxa"/>
+              <w:right w:w="150" w:type="dxa"/>
+            </w:tcMar>
+          </w:tcPr>
+          <w:p>
+            <w:r>
+              <w:rPr>
+                <w:sz w:val="17"/>
+              </w:rPr>
+              <w:t>(128, 64)</w:t>
+            </w:r>
+          </w:p>
+        </w:tc>
+        <w:tc>
+          <w:tcPr>
+            <w:tcW w:type="dxa" w:w="1337"/>
+            <w:tcMar>
+              <w:top w:w="100" w:type="dxa"/>
+              <w:bottom w:w="100" w:type="dxa"/>
+              <w:left w:w="150" w:type="dxa"/>
+              <w:right w:w="150" w:type="dxa"/>
+            </w:tcMar>
+          </w:tcPr>
+          <w:p>
+            <w:r>
+              <w:rPr>
+                <w:sz w:val="17"/>
+              </w:rPr>
+              <w:t>ReLU</w:t>
+            </w:r>
+          </w:p>
+        </w:tc>
+        <w:tc>
+          <w:tcPr>
+            <w:tcW w:type="dxa" w:w="1337"/>
+            <w:tcMar>
+              <w:top w:w="100" w:type="dxa"/>
+              <w:bottom w:w="100" w:type="dxa"/>
+              <w:left w:w="150" w:type="dxa"/>
+              <w:right w:w="150" w:type="dxa"/>
+            </w:tcMar>
+          </w:tcPr>
+          <w:p>
+            <w:r>
+              <w:rPr>
+                <w:sz w:val="17"/>
+              </w:rPr>
+              <w:t>0.001</w:t>
+            </w:r>
+          </w:p>
+        </w:tc>
+        <w:tc>
+          <w:tcPr>
+            <w:tcW w:type="dxa" w:w="1337"/>
+            <w:tcMar>
+              <w:top w:w="100" w:type="dxa"/>
+              <w:bottom w:w="100" w:type="dxa"/>
+              <w:left w:w="150" w:type="dxa"/>
+              <w:right w:w="150" w:type="dxa"/>
+            </w:tcMar>
+          </w:tcPr>
+          <w:p>
+            <w:r>
+              <w:rPr>
+                <w:sz w:val="17"/>
+              </w:rPr>
+              <w:t>0.001</w:t>
+            </w:r>
+          </w:p>
+        </w:tc>
+        <w:tc>
+          <w:tcPr>
+            <w:tcW w:type="dxa" w:w="1337"/>
+            <w:tcMar>
+              <w:top w:w="100" w:type="dxa"/>
+              <w:bottom w:w="100" w:type="dxa"/>
+              <w:left w:w="150" w:type="dxa"/>
+              <w:right w:w="150" w:type="dxa"/>
+            </w:tcMar>
+          </w:tcPr>
+          <w:p>
+            <w:r>
+              <w:rPr>
+                <w:sz w:val="17"/>
+              </w:rPr>
+              <w:t>32</w:t>
+            </w:r>
+          </w:p>
+        </w:tc>
+        <w:tc>
+          <w:tcPr>
+            <w:tcW w:type="dxa" w:w="1337"/>
+            <w:tcMar>
+              <w:top w:w="100" w:type="dxa"/>
+              <w:bottom w:w="100" w:type="dxa"/>
+              <w:left w:w="150" w:type="dxa"/>
+              <w:right w:w="150" w:type="dxa"/>
+            </w:tcMar>
+          </w:tcPr>
+          <w:p>
+            <w:r>
+              <w:rPr>
+                <w:sz w:val="17"/>
+              </w:rPr>
+              <w:t>0.8590</w:t>
+            </w:r>
+          </w:p>
+        </w:tc>
+      </w:tr>
+      <w:tr>
+        <w:tc>
+          <w:tcPr>
+            <w:tcW w:type="dxa" w:w="1337"/>
+            <w:tcMar>
+              <w:top w:w="100" w:type="dxa"/>
+              <w:bottom w:w="100" w:type="dxa"/>
+              <w:left w:w="150" w:type="dxa"/>
+              <w:right w:w="150" w:type="dxa"/>
+            </w:tcMar>
+          </w:tcPr>
+          <w:p>
+            <w:r>
+              <w:rPr>
+                <w:sz w:val="17"/>
+              </w:rPr>
+              <w:t>7</w:t>
+            </w:r>
+          </w:p>
+        </w:tc>
+        <w:tc>
+          <w:tcPr>
+            <w:tcW w:type="dxa" w:w="1337"/>
+            <w:tcMar>
+              <w:top w:w="100" w:type="dxa"/>
+              <w:bottom w:w="100" w:type="dxa"/>
+              <w:left w:w="150" w:type="dxa"/>
+              <w:right w:w="150" w:type="dxa"/>
+            </w:tcMar>
+          </w:tcPr>
+          <w:p>
+            <w:r>
+              <w:rPr>
+                <w:sz w:val="17"/>
+              </w:rPr>
+              <w:t>(128, 64, 32)</w:t>
+            </w:r>
+          </w:p>
+        </w:tc>
+        <w:tc>
+          <w:tcPr>
+            <w:tcW w:type="dxa" w:w="1337"/>
+            <w:tcMar>
+              <w:top w:w="100" w:type="dxa"/>
+              <w:bottom w:w="100" w:type="dxa"/>
+              <w:left w:w="150" w:type="dxa"/>
+              <w:right w:w="150" w:type="dxa"/>
+            </w:tcMar>
+          </w:tcPr>
+          <w:p>
+            <w:r>
+              <w:rPr>
+                <w:sz w:val="17"/>
+              </w:rPr>
+              <w:t>ReLU</w:t>
+            </w:r>
+          </w:p>
+        </w:tc>
+        <w:tc>
+          <w:tcPr>
+            <w:tcW w:type="dxa" w:w="1337"/>
+            <w:tcMar>
+              <w:top w:w="100" w:type="dxa"/>
+              <w:bottom w:w="100" w:type="dxa"/>
+              <w:left w:w="150" w:type="dxa"/>
+              <w:right w:w="150" w:type="dxa"/>
+            </w:tcMar>
+          </w:tcPr>
+          <w:p>
+            <w:r>
+              <w:rPr>
+                <w:sz w:val="17"/>
+              </w:rPr>
+              <w:t>0.01</w:t>
+            </w:r>
+          </w:p>
+        </w:tc>
+        <w:tc>
+          <w:tcPr>
+            <w:tcW w:type="dxa" w:w="1337"/>
+            <w:tcMar>
+              <w:top w:w="100" w:type="dxa"/>
+              <w:bottom w:w="100" w:type="dxa"/>
+              <w:left w:w="150" w:type="dxa"/>
+              <w:right w:w="150" w:type="dxa"/>
+            </w:tcMar>
+          </w:tcPr>
+          <w:p>
+            <w:r>
+              <w:rPr>
+                <w:sz w:val="17"/>
+              </w:rPr>
+              <w:t>0.001</w:t>
+            </w:r>
+          </w:p>
+        </w:tc>
+        <w:tc>
+          <w:tcPr>
+            <w:tcW w:type="dxa" w:w="1337"/>
+            <w:tcMar>
+              <w:top w:w="100" w:type="dxa"/>
+              <w:bottom w:w="100" w:type="dxa"/>
+              <w:left w:w="150" w:type="dxa"/>
+              <w:right w:w="150" w:type="dxa"/>
+            </w:tcMar>
+          </w:tcPr>
+          <w:p>
+            <w:r>
+              <w:rPr>
+                <w:sz w:val="17"/>
+              </w:rPr>
+              <w:t>64</w:t>
+            </w:r>
+          </w:p>
+        </w:tc>
+        <w:tc>
+          <w:tcPr>
+            <w:tcW w:type="dxa" w:w="1337"/>
+            <w:tcMar>
+              <w:top w:w="100" w:type="dxa"/>
+              <w:bottom w:w="100" w:type="dxa"/>
+              <w:left w:w="150" w:type="dxa"/>
+              <w:right w:w="150" w:type="dxa"/>
+            </w:tcMar>
+          </w:tcPr>
+          <w:p>
+            <w:r>
+              <w:rPr>
+                <w:sz w:val="17"/>
+              </w:rPr>
+              <w:t>0.8280</w:t>
+            </w:r>
+          </w:p>
+        </w:tc>
+      </w:tr>
+      <w:tr>
+        <w:tc>
+          <w:tcPr>
+            <w:tcW w:type="dxa" w:w="1337"/>
+            <w:tcMar>
+              <w:top w:w="100" w:type="dxa"/>
+              <w:bottom w:w="100" w:type="dxa"/>
+              <w:left w:w="150" w:type="dxa"/>
+              <w:right w:w="150" w:type="dxa"/>
+            </w:tcMar>
+          </w:tcPr>
+          <w:p>
+            <w:r>
+              <w:rPr>
+                <w:sz w:val="17"/>
+              </w:rPr>
+              <w:t>8</w:t>
+            </w:r>
+          </w:p>
+        </w:tc>
+        <w:tc>
+          <w:tcPr>
+            <w:tcW w:type="dxa" w:w="1337"/>
+            <w:tcMar>
+              <w:top w:w="100" w:type="dxa"/>
+              <w:bottom w:w="100" w:type="dxa"/>
+              <w:left w:w="150" w:type="dxa"/>
+              <w:right w:w="150" w:type="dxa"/>
+            </w:tcMar>
+          </w:tcPr>
+          <w:p>
+            <w:r>
+              <w:rPr>
+                <w:sz w:val="17"/>
+              </w:rPr>
+              <w:t>(64, 32)</w:t>
+            </w:r>
+          </w:p>
+        </w:tc>
+        <w:tc>
+          <w:tcPr>
+            <w:tcW w:type="dxa" w:w="1337"/>
+            <w:tcMar>
+              <w:top w:w="100" w:type="dxa"/>
+              <w:bottom w:w="100" w:type="dxa"/>
+              <w:left w:w="150" w:type="dxa"/>
+              <w:right w:w="150" w:type="dxa"/>
+            </w:tcMar>
+          </w:tcPr>
+          <w:p>
+            <w:r>
+              <w:rPr>
+                <w:sz w:val="17"/>
+              </w:rPr>
+              <w:t>Tanh</w:t>
+            </w:r>
+          </w:p>
+        </w:tc>
+        <w:tc>
+          <w:tcPr>
+            <w:tcW w:type="dxa" w:w="1337"/>
+            <w:tcMar>
+              <w:top w:w="100" w:type="dxa"/>
+              <w:bottom w:w="100" w:type="dxa"/>
+              <w:left w:w="150" w:type="dxa"/>
+              <w:right w:w="150" w:type="dxa"/>
+            </w:tcMar>
+          </w:tcPr>
+          <w:p>
+            <w:r>
+              <w:rPr>
+                <w:sz w:val="17"/>
+              </w:rPr>
+              <w:t>0.001</w:t>
+            </w:r>
+          </w:p>
+        </w:tc>
+        <w:tc>
+          <w:tcPr>
+            <w:tcW w:type="dxa" w:w="1337"/>
+            <w:tcMar>
+              <w:top w:w="100" w:type="dxa"/>
+              <w:bottom w:w="100" w:type="dxa"/>
+              <w:left w:w="150" w:type="dxa"/>
+              <w:right w:w="150" w:type="dxa"/>
+            </w:tcMar>
+          </w:tcPr>
+          <w:p>
+            <w:r>
+              <w:rPr>
+                <w:sz w:val="17"/>
+              </w:rPr>
+              <w:t>0.001</w:t>
+            </w:r>
+          </w:p>
+        </w:tc>
+        <w:tc>
+          <w:tcPr>
+            <w:tcW w:type="dxa" w:w="1337"/>
+            <w:tcMar>
+              <w:top w:w="100" w:type="dxa"/>
+              <w:bottom w:w="100" w:type="dxa"/>
+              <w:left w:w="150" w:type="dxa"/>
+              <w:right w:w="150" w:type="dxa"/>
+            </w:tcMar>
+          </w:tcPr>
+          <w:p>
+            <w:r>
+              <w:rPr>
+                <w:sz w:val="17"/>
+              </w:rPr>
+              <w:t>32</w:t>
+            </w:r>
+          </w:p>
+        </w:tc>
+        <w:tc>
+          <w:tcPr>
+            <w:tcW w:type="dxa" w:w="1337"/>
+            <w:tcMar>
+              <w:top w:w="100" w:type="dxa"/>
+              <w:bottom w:w="100" w:type="dxa"/>
+              <w:left w:w="150" w:type="dxa"/>
+              <w:right w:w="150" w:type="dxa"/>
+            </w:tcMar>
+          </w:tcPr>
+          <w:p>
+            <w:r>
+              <w:rPr>
+                <w:sz w:val="17"/>
+              </w:rPr>
+              <w:t>0.8390</w:t>
+            </w:r>
+          </w:p>
+        </w:tc>
+      </w:tr>
+    </w:tbl>
+    <w:p>
+      <w:pPr>
+        <w:jc w:val="center"/>
+      </w:pPr>
+      <w:r>
+        <w:drawing>
+          <wp:inline xmlns:a="http://schemas.openxmlformats.org/drawingml/2006/main" xmlns:pic="http://schemas.openxmlformats.org/drawingml/2006/picture">
+            <wp:extent cx="3474720" cy="2696914"/>
+            <wp:docPr id="6" name="Picture 6"/>
+            <wp:cNvGraphicFramePr>
+              <a:graphicFrameLocks noChangeAspect="1"/>
+            </wp:cNvGraphicFramePr>
+            <a:graphic>
+              <a:graphicData uri="http://schemas.openxmlformats.org/drawingml/2006/picture">
+                <pic:pic>
+                  <pic:nvPicPr>
+                    <pic:cNvPr id="0" name="precision_recall_curves.png"/>
+                    <pic:cNvPicPr/>
+                  </pic:nvPicPr>
+                  <pic:blipFill>
+                    <a:blip r:embed="rId14"/>
+                    <a:stretch>
+                      <a:fillRect/>
+                    </a:stretch>
+                  </pic:blipFill>
+                  <pic:spPr>
+                    <a:xfrm>
+                      <a:off x="0" y="0"/>
+                      <a:ext cx="3474720" cy="2696914"/>
+                    </a:xfrm>
+                    <a:prstGeom prst="rect"/>
+                  </pic:spPr>
+                </pic:pic>
+              </a:graphicData>
+            </a:graphic>
+          </wp:inline>
+        </w:drawing>
+      </w:r>
+    </w:p>
+    <w:p>
+      <w:pPr>
+        <w:jc w:val="center"/>
+      </w:pPr>
+      <w:r>
+        <w:rPr>
+          <w:i/>
+          <w:sz w:val="18"/>
+        </w:rPr>
+        <w:t>Figure 5: Precision-Recall Curves across Machine Learning Classifiers</w:t>
+      </w:r>
+    </w:p>
+    <w:p>
+      <w:r>
+        <w:br w:type="page"/>
       </w:r>
     </w:p>
     <w:p>
@@ -5469,7 +6908,118 @@
           <w:rFonts w:ascii="Times New Roman" w:hAnsi="Times New Roman"/>
           <w:sz w:val="22"/>
         </w:rPr>
-        <w:t>The deployed Streamlit dashboard provides single patient triage, biometric radar charts, What-If simulation, and batch cohort screening. Live Web Application: https://endopredict-ai.streamlit.app/ (Local Dev: http://localhost:8501).</w:t>
+        <w:t>The production web application 'EndoPredict AI' is actively deployed on Streamlit Community Cloud:</w:t>
+        <w:br/>
+        <w:t>• Public Live URL: https://endopredict-ai.streamlit.app/</w:t>
+        <w:br/>
+        <w:t>• Local Development: http://localhost:8501</w:t>
+      </w:r>
+    </w:p>
+    <w:p>
+      <w:pPr>
+        <w:jc w:val="center"/>
+      </w:pPr>
+      <w:r>
+        <w:drawing>
+          <wp:inline xmlns:a="http://schemas.openxmlformats.org/drawingml/2006/main" xmlns:pic="http://schemas.openxmlformats.org/drawingml/2006/picture">
+            <wp:extent cx="4114800" cy="1954530"/>
+            <wp:docPr id="7" name="Picture 7"/>
+            <wp:cNvGraphicFramePr>
+              <a:graphicFrameLocks noChangeAspect="1"/>
+            </wp:cNvGraphicFramePr>
+            <a:graphic>
+              <a:graphicData uri="http://schemas.openxmlformats.org/drawingml/2006/picture">
+                <pic:pic>
+                  <pic:nvPicPr>
+                    <pic:cNvPr id="0" name="ui_triage_screenshot.png"/>
+                    <pic:cNvPicPr/>
+                  </pic:nvPicPr>
+                  <pic:blipFill>
+                    <a:blip r:embed="rId15"/>
+                    <a:stretch>
+                      <a:fillRect/>
+                    </a:stretch>
+                  </pic:blipFill>
+                  <pic:spPr>
+                    <a:xfrm>
+                      <a:off x="0" y="0"/>
+                      <a:ext cx="4114800" cy="1954530"/>
+                    </a:xfrm>
+                    <a:prstGeom prst="rect"/>
+                  </pic:spPr>
+                </pic:pic>
+              </a:graphicData>
+            </a:graphic>
+          </wp:inline>
+        </w:drawing>
+      </w:r>
+    </w:p>
+    <w:p>
+      <w:pPr>
+        <w:jc w:val="center"/>
+      </w:pPr>
+      <w:r>
+        <w:rPr>
+          <w:i/>
+          <w:sz w:val="18"/>
+        </w:rPr>
+        <w:t>Figure 6: EndoPredict AI — Patient Triage, Probability Gauge &amp; Biometric Radar Profile</w:t>
+      </w:r>
+    </w:p>
+    <w:p>
+      <w:pPr>
+        <w:jc w:val="center"/>
+      </w:pPr>
+      <w:r>
+        <w:drawing>
+          <wp:inline xmlns:a="http://schemas.openxmlformats.org/drawingml/2006/main" xmlns:pic="http://schemas.openxmlformats.org/drawingml/2006/picture">
+            <wp:extent cx="4114800" cy="1954530"/>
+            <wp:docPr id="8" name="Picture 8"/>
+            <wp:cNvGraphicFramePr>
+              <a:graphicFrameLocks noChangeAspect="1"/>
+            </wp:cNvGraphicFramePr>
+            <a:graphic>
+              <a:graphicData uri="http://schemas.openxmlformats.org/drawingml/2006/picture">
+                <pic:pic>
+                  <pic:nvPicPr>
+                    <pic:cNvPr id="0" name="ui_batch_screenshot.png"/>
+                    <pic:cNvPicPr/>
+                  </pic:nvPicPr>
+                  <pic:blipFill>
+                    <a:blip r:embed="rId16"/>
+                    <a:stretch>
+                      <a:fillRect/>
+                    </a:stretch>
+                  </pic:blipFill>
+                  <pic:spPr>
+                    <a:xfrm>
+                      <a:off x="0" y="0"/>
+                      <a:ext cx="4114800" cy="1954530"/>
+                    </a:xfrm>
+                    <a:prstGeom prst="rect"/>
+                  </pic:spPr>
+                </pic:pic>
+              </a:graphicData>
+            </a:graphic>
+          </wp:inline>
+        </w:drawing>
+      </w:r>
+    </w:p>
+    <w:p>
+      <w:pPr>
+        <w:jc w:val="center"/>
+      </w:pPr>
+      <w:r>
+        <w:rPr>
+          <w:i/>
+          <w:sz w:val="18"/>
+        </w:rPr>
+        <w:t>Figure 7: EndoPredict AI — Batch Cohort Screening &amp; Population Risk Histogram</w:t>
+      </w:r>
+    </w:p>
+    <w:p>
+      <w:r>
+        <w:br w:type="page"/>
       </w:r>
     </w:p>
     <w:p>

</xml_diff>